<commit_message>
Name the scanners in the handout's flow chart, and show how to read their results
Steps 6-8 now say what gitleaks, Checkov and the triage script each read,
run and decide, with commands that pull the real result lines from the
pull request's run log and the Security tab. The flow chart names the
tools and the plan-time policy gate instead of generic boxes.

Co-Authored-By: Claude Fable 5.1 <noreply@anthropic.com>
</commit_message>
<xml_diff>
--- a/docs/word/2-FOR-THE-PANEL.docx
+++ b/docs/word/2-FOR-THE-PANEL.docx
@@ -311,7 +311,7 @@
         <w:rPr>
           <w:rStyle w:val="VerbatimChar"/>
         </w:rPr>
-        <w:t xml:space="preserve"> secrets      terraform     write a</w:t>
+        <w:t xml:space="preserve"> gitleaks     Checkov      ai_triage.py</w:t>
       </w:r>
       <w:r>
         <w:br/>
@@ -320,7 +320,7 @@
         <w:rPr>
           <w:rStyle w:val="VerbatimChar"/>
         </w:rPr>
-        <w:t xml:space="preserve">  check        checks       comment</w:t>
+        <w:t xml:space="preserve"> secrets,     terraform,   sorts, decides,</w:t>
       </w:r>
       <w:r>
         <w:br/>
@@ -329,6 +329,24 @@
         <w:rPr>
           <w:rStyle w:val="VerbatimChar"/>
         </w:rPr>
+        <w:t xml:space="preserve"> whole        once per     writes the</w:t>
+      </w:r>
+      <w:r>
+        <w:br/>
+      </w:r>
+      <w:r>
+        <w:rPr>
+          <w:rStyle w:val="VerbatimChar"/>
+        </w:rPr>
+        <w:t xml:space="preserve"> history      environment  comment</w:t>
+      </w:r>
+      <w:r>
+        <w:br/>
+      </w:r>
+      <w:r>
+        <w:rPr>
+          <w:rStyle w:val="VerbatimChar"/>
+        </w:rPr>
         <w:t xml:space="preserve">   |             |             |</w:t>
       </w:r>
       <w:r>
@@ -492,6 +510,33 @@
           <w:rStyle w:val="VerbatimChar"/>
         </w:rPr>
         <w:t xml:space="preserve">   +-------------+-------------+</w:t>
+      </w:r>
+      <w:r>
+        <w:br/>
+      </w:r>
+      <w:r>
+        <w:rPr>
+          <w:rStyle w:val="VerbatimChar"/>
+        </w:rPr>
+        <w:t xml:space="preserve">                 |</w:t>
+      </w:r>
+      <w:r>
+        <w:br/>
+      </w:r>
+      <w:r>
+        <w:rPr>
+          <w:rStyle w:val="VerbatimChar"/>
+        </w:rPr>
+        <w:t xml:space="preserve">        policy_check.py checks the plan</w:t>
+      </w:r>
+      <w:r>
+        <w:br/>
+      </w:r>
+      <w:r>
+        <w:rPr>
+          <w:rStyle w:val="VerbatimChar"/>
+        </w:rPr>
+        <w:t xml:space="preserve">        (unprivileged, boot, delete protection)</w:t>
       </w:r>
       <w:r>
         <w:br/>
@@ -855,73 +900,41 @@
         <w:pStyle w:val="FirstParagraph"/>
       </w:pPr>
       <w:r>
-        <w:t xml:space="preserve">It reads</w:t>
-      </w:r>
-      <w:r>
-        <w:t xml:space="preserve"> </w:t>
-      </w:r>
-      <w:r>
         <w:rPr>
           <w:b/>
           <w:bCs/>
         </w:rPr>
-        <w:t xml:space="preserve">every commit ever made</w:t>
-      </w:r>
-      <w:r>
-        <w:t xml:space="preserve">, not just mine.</w:t>
+        <w:t xml:space="preserve">The tool:</w:t>
+      </w:r>
+      <w:r>
+        <w:t xml:space="preserve"> </w:t>
+      </w:r>
+      <w:r>
+        <w:t xml:space="preserve">gitleaks 8.30.1. Open source. Pinned to that version on the runner.</w:t>
       </w:r>
     </w:p>
     <w:p>
       <w:pPr>
         <w:pStyle w:val="BodyText"/>
       </w:pPr>
-      <w:r>
-        <w:t xml:space="preserve">That matters. A password committed last year and deleted since would be invisible if it only looked</w:t>
-      </w:r>
-      <w:r>
-        <w:t xml:space="preserve"> </w:t>
-      </w:r>
-      <w:r>
-        <w:t xml:space="preserve">at today's files.</w:t>
-      </w:r>
-    </w:p>
-    <w:p>
-      <w:pPr>
-        <w:pStyle w:val="BodyText"/>
-      </w:pPr>
-      <w:r>
-        <w:t xml:space="preserve">If it finds one, the pull request stops here.</w:t>
-      </w:r>
-    </w:p>
-    <w:bookmarkEnd w:id="19"/>
-    <w:bookmarkStart w:id="20" w:name="X434040f7587c8915e8b2a378ffef8faf8ae425e"/>
-    <w:p>
-      <w:pPr>
-        <w:pStyle w:val="Heading2"/>
-      </w:pPr>
-      <w:r>
-        <w:t xml:space="preserve">7. The pipeline checks the infrastructure code</w:t>
-      </w:r>
-    </w:p>
-    <w:p>
-      <w:pPr>
-        <w:pStyle w:val="FirstParagraph"/>
-      </w:pPr>
-      <w:r>
-        <w:t xml:space="preserve">This is</w:t>
-      </w:r>
-      <w:r>
-        <w:t xml:space="preserve"> </w:t>
-      </w:r>
       <w:r>
         <w:rPr>
           <w:b/>
           <w:bCs/>
         </w:rPr>
-        <w:t xml:space="preserve">Checkov</w:t>
-      </w:r>
-      <w:r>
-        <w:t xml:space="preserve">. It reads Terraform and looks for unsafe settings.</w:t>
+        <w:t xml:space="preserve">Where it runs:</w:t>
+      </w:r>
+      <w:r>
+        <w:t xml:space="preserve"> </w:t>
+      </w:r>
+      <w:r>
+        <w:t xml:space="preserve">the development runner, container 201. It only reads source code, so it gets no</w:t>
+      </w:r>
+      <w:r>
+        <w:t xml:space="preserve"> </w:t>
+      </w:r>
+      <w:r>
+        <w:t xml:space="preserve">keys and no access to anything.</w:t>
       </w:r>
     </w:p>
     <w:p>
@@ -929,7 +942,73 @@
         <w:pStyle w:val="BodyText"/>
       </w:pPr>
       <w:r>
-        <w:t xml:space="preserve">Examples of what it stops:</w:t>
+        <w:rPr>
+          <w:b/>
+          <w:bCs/>
+        </w:rPr>
+        <w:t xml:space="preserve">What it reads:</w:t>
+      </w:r>
+      <w:r>
+        <w:t xml:space="preserve"> </w:t>
+      </w:r>
+      <w:r>
+        <w:rPr>
+          <w:b/>
+          <w:bCs/>
+        </w:rPr>
+        <w:t xml:space="preserve">every commit ever made</w:t>
+      </w:r>
+      <w:r>
+        <w:t xml:space="preserve">, not just mine. The checkout line says</w:t>
+      </w:r>
+      <w:r>
+        <w:t xml:space="preserve"> </w:t>
+      </w:r>
+      <w:r>
+        <w:rPr>
+          <w:rStyle w:val="VerbatimChar"/>
+        </w:rPr>
+        <w:t xml:space="preserve">fetch-depth: 0</w:t>
+      </w:r>
+      <w:r>
+        <w:t xml:space="preserve">. Without that line it would see one commit.</w:t>
+      </w:r>
+    </w:p>
+    <w:p>
+      <w:pPr>
+        <w:pStyle w:val="BodyText"/>
+      </w:pPr>
+      <w:r>
+        <w:t xml:space="preserve">That matters. A password committed last year and deleted since would be invisible if it only looked</w:t>
+      </w:r>
+      <w:r>
+        <w:t xml:space="preserve"> </w:t>
+      </w:r>
+      <w:r>
+        <w:t xml:space="preserve">at today's files.</w:t>
+      </w:r>
+    </w:p>
+    <w:p>
+      <w:pPr>
+        <w:pStyle w:val="BodyText"/>
+      </w:pPr>
+      <w:r>
+        <w:rPr>
+          <w:b/>
+          <w:bCs/>
+        </w:rPr>
+        <w:t xml:space="preserve">What it does:</w:t>
+      </w:r>
+    </w:p>
+    <w:p>
+      <w:pPr>
+        <w:pStyle w:val="SourceCode"/>
+      </w:pPr>
+      <w:r>
+        <w:rPr>
+          <w:rStyle w:val="VerbatimChar"/>
+        </w:rPr>
+        <w:t xml:space="preserve">gitleaks detect --source . --config .gitleaks.toml --redact --exit-code 1</w:t>
       </w:r>
     </w:p>
     <w:p>
@@ -941,7 +1020,22 @@
         </w:numPr>
       </w:pPr>
       <w:r>
-        <w:t xml:space="preserve">A storage bucket anyone on the internet can read</w:t>
+        <w:rPr>
+          <w:rStyle w:val="VerbatimChar"/>
+        </w:rPr>
+        <w:t xml:space="preserve">--config .gitleaks.toml</w:t>
+      </w:r>
+      <w:r>
+        <w:t xml:space="preserve"> </w:t>
+      </w:r>
+      <w:r>
+        <w:t xml:space="preserve">- the patterns that count as a secret, and one allow-listed fake key</w:t>
+      </w:r>
+      <w:r>
+        <w:t xml:space="preserve"> </w:t>
+      </w:r>
+      <w:r>
+        <w:t xml:space="preserve">the demo uses on purpose</w:t>
       </w:r>
     </w:p>
     <w:p>
@@ -953,7 +1047,16 @@
         </w:numPr>
       </w:pPr>
       <w:r>
-        <w:t xml:space="preserve">SSH open to the whole world</w:t>
+        <w:rPr>
+          <w:rStyle w:val="VerbatimChar"/>
+        </w:rPr>
+        <w:t xml:space="preserve">--redact</w:t>
+      </w:r>
+      <w:r>
+        <w:t xml:space="preserve"> </w:t>
+      </w:r>
+      <w:r>
+        <w:t xml:space="preserve">- a found secret is never printed in full in the log</w:t>
       </w:r>
     </w:p>
     <w:p>
@@ -965,7 +1068,16 @@
         </w:numPr>
       </w:pPr>
       <w:r>
-        <w:t xml:space="preserve">A database with no encryption</w:t>
+        <w:rPr>
+          <w:rStyle w:val="VerbatimChar"/>
+        </w:rPr>
+        <w:t xml:space="preserve">--exit-code 1</w:t>
+      </w:r>
+      <w:r>
+        <w:t xml:space="preserve"> </w:t>
+      </w:r>
+      <w:r>
+        <w:t xml:space="preserve">- a finding fails the job. That is what makes this a gate and not a report</w:t>
       </w:r>
     </w:p>
     <w:p>
@@ -973,7 +1085,884 @@
         <w:pStyle w:val="FirstParagraph"/>
       </w:pPr>
       <w:r>
-        <w:t xml:space="preserve">It runs three times. Once per environment.</w:t>
+        <w:rPr>
+          <w:b/>
+          <w:bCs/>
+        </w:rPr>
+        <w:t xml:space="preserve">What happens on a finding:</w:t>
+      </w:r>
+      <w:r>
+        <w:t xml:space="preserve"> </w:t>
+      </w:r>
+      <w:r>
+        <w:t xml:space="preserve">the job goes red, and nothing else in the pipeline starts. The</w:t>
+      </w:r>
+      <w:r>
+        <w:t xml:space="preserve"> </w:t>
+      </w:r>
+      <w:r>
+        <w:t xml:space="preserve">result is also uploaded to the repository's</w:t>
+      </w:r>
+      <w:r>
+        <w:t xml:space="preserve"> </w:t>
+      </w:r>
+      <w:r>
+        <w:rPr>
+          <w:b/>
+          <w:bCs/>
+        </w:rPr>
+        <w:t xml:space="preserve">Security</w:t>
+      </w:r>
+      <w:r>
+        <w:t xml:space="preserve"> </w:t>
+      </w:r>
+      <w:r>
+        <w:t xml:space="preserve">tab as a code-scanning alert.</w:t>
+      </w:r>
+    </w:p>
+    <w:p>
+      <w:pPr>
+        <w:pStyle w:val="BodyText"/>
+      </w:pPr>
+      <w:r>
+        <w:rPr>
+          <w:b/>
+          <w:bCs/>
+        </w:rPr>
+        <w:t xml:space="preserve">Check it yourself:</w:t>
+      </w:r>
+    </w:p>
+    <w:p>
+      <w:pPr>
+        <w:pStyle w:val="SourceCode"/>
+      </w:pPr>
+      <w:r>
+        <w:rPr>
+          <w:rStyle w:val="CommentTok"/>
+        </w:rPr>
+        <w:t xml:space="preserve"># on a laptop with the repository: the same scan, the same config, the whole history</w:t>
+      </w:r>
+      <w:r>
+        <w:br/>
+      </w:r>
+      <w:r>
+        <w:rPr>
+          <w:rStyle w:val="FunctionTok"/>
+        </w:rPr>
+        <w:t xml:space="preserve">make</w:t>
+      </w:r>
+      <w:r>
+        <w:rPr>
+          <w:rStyle w:val="NormalTok"/>
+        </w:rPr>
+        <w:t xml:space="preserve"> secrets</w:t>
+      </w:r>
+      <w:r>
+        <w:br/>
+      </w:r>
+      <w:r>
+        <w:br/>
+      </w:r>
+      <w:r>
+        <w:rPr>
+          <w:rStyle w:val="CommentTok"/>
+        </w:rPr>
+        <w:t xml:space="preserve"># on GitHub: the most recent pipeline run on this pull request, and its jobs</w:t>
+      </w:r>
+      <w:r>
+        <w:br/>
+      </w:r>
+      <w:r>
+        <w:rPr>
+          <w:rStyle w:val="VariableTok"/>
+        </w:rPr>
+        <w:t xml:space="preserve">RUN</w:t>
+      </w:r>
+      <w:r>
+        <w:rPr>
+          <w:rStyle w:val="OperatorTok"/>
+        </w:rPr>
+        <w:t xml:space="preserve">=</w:t>
+      </w:r>
+      <w:r>
+        <w:rPr>
+          <w:rStyle w:val="VariableTok"/>
+        </w:rPr>
+        <w:t xml:space="preserve">$(</w:t>
+      </w:r>
+      <w:r>
+        <w:rPr>
+          <w:rStyle w:val="ExtensionTok"/>
+        </w:rPr>
+        <w:t xml:space="preserve">gh</w:t>
+      </w:r>
+      <w:r>
+        <w:rPr>
+          <w:rStyle w:val="NormalTok"/>
+        </w:rPr>
+        <w:t xml:space="preserve"> run list </w:t>
+      </w:r>
+      <w:r>
+        <w:rPr>
+          <w:rStyle w:val="AttributeTok"/>
+        </w:rPr>
+        <w:t xml:space="preserve">--workflow</w:t>
+      </w:r>
+      <w:r>
+        <w:rPr>
+          <w:rStyle w:val="NormalTok"/>
+        </w:rPr>
+        <w:t xml:space="preserve"> </w:t>
+      </w:r>
+      <w:r>
+        <w:rPr>
+          <w:rStyle w:val="StringTok"/>
+        </w:rPr>
+        <w:t xml:space="preserve">"Security Pipeline"</w:t>
+      </w:r>
+      <w:r>
+        <w:rPr>
+          <w:rStyle w:val="NormalTok"/>
+        </w:rPr>
+        <w:t xml:space="preserve"> </w:t>
+      </w:r>
+      <w:r>
+        <w:rPr>
+          <w:rStyle w:val="AttributeTok"/>
+        </w:rPr>
+        <w:t xml:space="preserve">--event</w:t>
+      </w:r>
+      <w:r>
+        <w:rPr>
+          <w:rStyle w:val="NormalTok"/>
+        </w:rPr>
+        <w:t xml:space="preserve"> pull_request </w:t>
+      </w:r>
+      <w:r>
+        <w:rPr>
+          <w:rStyle w:val="AttributeTok"/>
+        </w:rPr>
+        <w:t xml:space="preserve">--limit</w:t>
+      </w:r>
+      <w:r>
+        <w:rPr>
+          <w:rStyle w:val="NormalTok"/>
+        </w:rPr>
+        <w:t xml:space="preserve"> 1 </w:t>
+      </w:r>
+      <w:r>
+        <w:rPr>
+          <w:rStyle w:val="DataTypeTok"/>
+        </w:rPr>
+        <w:t xml:space="preserve">\</w:t>
+      </w:r>
+      <w:r>
+        <w:br/>
+      </w:r>
+      <w:r>
+        <w:rPr>
+          <w:rStyle w:val="NormalTok"/>
+        </w:rPr>
+        <w:t xml:space="preserve">      </w:t>
+      </w:r>
+      <w:r>
+        <w:rPr>
+          <w:rStyle w:val="AttributeTok"/>
+        </w:rPr>
+        <w:t xml:space="preserve">--json</w:t>
+      </w:r>
+      <w:r>
+        <w:rPr>
+          <w:rStyle w:val="NormalTok"/>
+        </w:rPr>
+        <w:t xml:space="preserve"> databaseId </w:t>
+      </w:r>
+      <w:r>
+        <w:rPr>
+          <w:rStyle w:val="AttributeTok"/>
+        </w:rPr>
+        <w:t xml:space="preserve">--jq</w:t>
+      </w:r>
+      <w:r>
+        <w:rPr>
+          <w:rStyle w:val="NormalTok"/>
+        </w:rPr>
+        <w:t xml:space="preserve"> </w:t>
+      </w:r>
+      <w:r>
+        <w:rPr>
+          <w:rStyle w:val="StringTok"/>
+        </w:rPr>
+        <w:t xml:space="preserve">'.[0].databaseId'</w:t>
+      </w:r>
+      <w:r>
+        <w:rPr>
+          <w:rStyle w:val="VariableTok"/>
+        </w:rPr>
+        <w:t xml:space="preserve">)</w:t>
+      </w:r>
+      <w:r>
+        <w:br/>
+      </w:r>
+      <w:r>
+        <w:rPr>
+          <w:rStyle w:val="ExtensionTok"/>
+        </w:rPr>
+        <w:t xml:space="preserve">gh</w:t>
+      </w:r>
+      <w:r>
+        <w:rPr>
+          <w:rStyle w:val="NormalTok"/>
+        </w:rPr>
+        <w:t xml:space="preserve"> run view </w:t>
+      </w:r>
+      <w:r>
+        <w:rPr>
+          <w:rStyle w:val="VariableTok"/>
+        </w:rPr>
+        <w:t xml:space="preserve">$RUN</w:t>
+      </w:r>
+      <w:r>
+        <w:br/>
+      </w:r>
+      <w:r>
+        <w:br/>
+      </w:r>
+      <w:r>
+        <w:rPr>
+          <w:rStyle w:val="CommentTok"/>
+        </w:rPr>
+        <w:t xml:space="preserve"># the gitleaks result, straight from that run's log</w:t>
+      </w:r>
+      <w:r>
+        <w:br/>
+      </w:r>
+      <w:r>
+        <w:rPr>
+          <w:rStyle w:val="VariableTok"/>
+        </w:rPr>
+        <w:t xml:space="preserve">JOB</w:t>
+      </w:r>
+      <w:r>
+        <w:rPr>
+          <w:rStyle w:val="OperatorTok"/>
+        </w:rPr>
+        <w:t xml:space="preserve">=</w:t>
+      </w:r>
+      <w:r>
+        <w:rPr>
+          <w:rStyle w:val="VariableTok"/>
+        </w:rPr>
+        <w:t xml:space="preserve">$(</w:t>
+      </w:r>
+      <w:r>
+        <w:rPr>
+          <w:rStyle w:val="ExtensionTok"/>
+        </w:rPr>
+        <w:t xml:space="preserve">gh</w:t>
+      </w:r>
+      <w:r>
+        <w:rPr>
+          <w:rStyle w:val="NormalTok"/>
+        </w:rPr>
+        <w:t xml:space="preserve"> run view </w:t>
+      </w:r>
+      <w:r>
+        <w:rPr>
+          <w:rStyle w:val="VariableTok"/>
+        </w:rPr>
+        <w:t xml:space="preserve">$RUN</w:t>
+      </w:r>
+      <w:r>
+        <w:rPr>
+          <w:rStyle w:val="NormalTok"/>
+        </w:rPr>
+        <w:t xml:space="preserve"> </w:t>
+      </w:r>
+      <w:r>
+        <w:rPr>
+          <w:rStyle w:val="AttributeTok"/>
+        </w:rPr>
+        <w:t xml:space="preserve">--json</w:t>
+      </w:r>
+      <w:r>
+        <w:rPr>
+          <w:rStyle w:val="NormalTok"/>
+        </w:rPr>
+        <w:t xml:space="preserve"> jobs </w:t>
+      </w:r>
+      <w:r>
+        <w:rPr>
+          <w:rStyle w:val="AttributeTok"/>
+        </w:rPr>
+        <w:t xml:space="preserve">--jq</w:t>
+      </w:r>
+      <w:r>
+        <w:rPr>
+          <w:rStyle w:val="NormalTok"/>
+        </w:rPr>
+        <w:t xml:space="preserve"> </w:t>
+      </w:r>
+      <w:r>
+        <w:rPr>
+          <w:rStyle w:val="StringTok"/>
+        </w:rPr>
+        <w:t xml:space="preserve">'.jobs[] | select(.name=="Secrets") | .databaseId'</w:t>
+      </w:r>
+      <w:r>
+        <w:rPr>
+          <w:rStyle w:val="VariableTok"/>
+        </w:rPr>
+        <w:t xml:space="preserve">)</w:t>
+      </w:r>
+      <w:r>
+        <w:br/>
+      </w:r>
+      <w:r>
+        <w:rPr>
+          <w:rStyle w:val="ExtensionTok"/>
+        </w:rPr>
+        <w:t xml:space="preserve">gh</w:t>
+      </w:r>
+      <w:r>
+        <w:rPr>
+          <w:rStyle w:val="NormalTok"/>
+        </w:rPr>
+        <w:t xml:space="preserve"> run view </w:t>
+      </w:r>
+      <w:r>
+        <w:rPr>
+          <w:rStyle w:val="AttributeTok"/>
+        </w:rPr>
+        <w:t xml:space="preserve">--job</w:t>
+      </w:r>
+      <w:r>
+        <w:rPr>
+          <w:rStyle w:val="NormalTok"/>
+        </w:rPr>
+        <w:t xml:space="preserve"> </w:t>
+      </w:r>
+      <w:r>
+        <w:rPr>
+          <w:rStyle w:val="VariableTok"/>
+        </w:rPr>
+        <w:t xml:space="preserve">$JOB</w:t>
+      </w:r>
+      <w:r>
+        <w:rPr>
+          <w:rStyle w:val="NormalTok"/>
+        </w:rPr>
+        <w:t xml:space="preserve"> </w:t>
+      </w:r>
+      <w:r>
+        <w:rPr>
+          <w:rStyle w:val="AttributeTok"/>
+        </w:rPr>
+        <w:t xml:space="preserve">--log</w:t>
+      </w:r>
+      <w:r>
+        <w:rPr>
+          <w:rStyle w:val="NormalTok"/>
+        </w:rPr>
+        <w:t xml:space="preserve"> </w:t>
+      </w:r>
+      <w:r>
+        <w:rPr>
+          <w:rStyle w:val="KeywordTok"/>
+        </w:rPr>
+        <w:t xml:space="preserve">|</w:t>
+      </w:r>
+      <w:r>
+        <w:rPr>
+          <w:rStyle w:val="NormalTok"/>
+        </w:rPr>
+        <w:t xml:space="preserve"> </w:t>
+      </w:r>
+      <w:r>
+        <w:rPr>
+          <w:rStyle w:val="FunctionTok"/>
+        </w:rPr>
+        <w:t xml:space="preserve">grep</w:t>
+      </w:r>
+      <w:r>
+        <w:rPr>
+          <w:rStyle w:val="NormalTok"/>
+        </w:rPr>
+        <w:t xml:space="preserve"> </w:t>
+      </w:r>
+      <w:r>
+        <w:rPr>
+          <w:rStyle w:val="AttributeTok"/>
+        </w:rPr>
+        <w:t xml:space="preserve">-E</w:t>
+      </w:r>
+      <w:r>
+        <w:rPr>
+          <w:rStyle w:val="NormalTok"/>
+        </w:rPr>
+        <w:t xml:space="preserve"> </w:t>
+      </w:r>
+      <w:r>
+        <w:rPr>
+          <w:rStyle w:val="StringTok"/>
+        </w:rPr>
+        <w:t xml:space="preserve">"Runner name|commits scanned|leaks found"</w:t>
+      </w:r>
+      <w:r>
+        <w:br/>
+      </w:r>
+      <w:r>
+        <w:rPr>
+          <w:rStyle w:val="CommentTok"/>
+        </w:rPr>
+        <w:t xml:space="preserve">#   Runner name: 'ci-dev'</w:t>
+      </w:r>
+      <w:r>
+        <w:br/>
+      </w:r>
+      <w:r>
+        <w:rPr>
+          <w:rStyle w:val="CommentTok"/>
+        </w:rPr>
+        <w:t xml:space="preserve">#   54 commits scanned.</w:t>
+      </w:r>
+      <w:r>
+        <w:br/>
+      </w:r>
+      <w:r>
+        <w:rPr>
+          <w:rStyle w:val="CommentTok"/>
+        </w:rPr>
+        <w:t xml:space="preserve">#   no leaks found</w:t>
+      </w:r>
+      <w:r>
+        <w:br/>
+      </w:r>
+      <w:r>
+        <w:br/>
+      </w:r>
+      <w:r>
+        <w:rPr>
+          <w:rStyle w:val="CommentTok"/>
+        </w:rPr>
+        <w:t xml:space="preserve"># the Security tab, by API: every scan gitleaks uploaded, and how many findings each had</w:t>
+      </w:r>
+      <w:r>
+        <w:br/>
+      </w:r>
+      <w:r>
+        <w:rPr>
+          <w:rStyle w:val="ExtensionTok"/>
+        </w:rPr>
+        <w:t xml:space="preserve">gh</w:t>
+      </w:r>
+      <w:r>
+        <w:rPr>
+          <w:rStyle w:val="NormalTok"/>
+        </w:rPr>
+        <w:t xml:space="preserve"> api </w:t>
+      </w:r>
+      <w:r>
+        <w:rPr>
+          <w:rStyle w:val="StringTok"/>
+        </w:rPr>
+        <w:t xml:space="preserve">"repos/georgejpark/secure-iac-pipeline/code-scanning/analyses?tool_name=gitleaks"</w:t>
+      </w:r>
+      <w:r>
+        <w:rPr>
+          <w:rStyle w:val="NormalTok"/>
+        </w:rPr>
+        <w:t xml:space="preserve"> </w:t>
+      </w:r>
+      <w:r>
+        <w:rPr>
+          <w:rStyle w:val="DataTypeTok"/>
+        </w:rPr>
+        <w:t xml:space="preserve">\</w:t>
+      </w:r>
+      <w:r>
+        <w:br/>
+      </w:r>
+      <w:r>
+        <w:rPr>
+          <w:rStyle w:val="NormalTok"/>
+        </w:rPr>
+        <w:t xml:space="preserve">  </w:t>
+      </w:r>
+      <w:r>
+        <w:rPr>
+          <w:rStyle w:val="AttributeTok"/>
+        </w:rPr>
+        <w:t xml:space="preserve">--jq</w:t>
+      </w:r>
+      <w:r>
+        <w:rPr>
+          <w:rStyle w:val="NormalTok"/>
+        </w:rPr>
+        <w:t xml:space="preserve"> </w:t>
+      </w:r>
+      <w:r>
+        <w:rPr>
+          <w:rStyle w:val="StringTok"/>
+        </w:rPr>
+        <w:t xml:space="preserve">'.[] | "\(.created_at)  \(.ref)  findings=\(.results_count)  rules=\(.rules_count)"'</w:t>
+      </w:r>
+      <w:r>
+        <w:br/>
+      </w:r>
+      <w:r>
+        <w:rPr>
+          <w:rStyle w:val="CommentTok"/>
+        </w:rPr>
+        <w:t xml:space="preserve">#   ...  refs/pull/4/merge  findings=0  rules=225</w:t>
+      </w:r>
+      <w:r>
+        <w:br/>
+      </w:r>
+      <w:r>
+        <w:br/>
+      </w:r>
+      <w:r>
+        <w:rPr>
+          <w:rStyle w:val="CommentTok"/>
+        </w:rPr>
+        <w:t xml:space="preserve"># on the runner: the pinned version</w:t>
+      </w:r>
+      <w:r>
+        <w:br/>
+      </w:r>
+      <w:r>
+        <w:rPr>
+          <w:rStyle w:val="ExtensionTok"/>
+        </w:rPr>
+        <w:t xml:space="preserve">pct</w:t>
+      </w:r>
+      <w:r>
+        <w:rPr>
+          <w:rStyle w:val="NormalTok"/>
+        </w:rPr>
+        <w:t xml:space="preserve"> exec 201 </w:t>
+      </w:r>
+      <w:r>
+        <w:rPr>
+          <w:rStyle w:val="AttributeTok"/>
+        </w:rPr>
+        <w:t xml:space="preserve">--</w:t>
+      </w:r>
+      <w:r>
+        <w:rPr>
+          <w:rStyle w:val="NormalTok"/>
+        </w:rPr>
+        <w:t xml:space="preserve"> gitleaks version</w:t>
+      </w:r>
+    </w:p>
+    <w:p>
+      <w:pPr>
+        <w:pStyle w:val="FirstParagraph"/>
+      </w:pPr>
+      <w:r>
+        <w:t xml:space="preserve">In the browser: on the pull request, click</w:t>
+      </w:r>
+      <w:r>
+        <w:t xml:space="preserve"> </w:t>
+      </w:r>
+      <w:r>
+        <w:rPr>
+          <w:b/>
+          <w:bCs/>
+        </w:rPr>
+        <w:t xml:space="preserve">Secrets</w:t>
+      </w:r>
+      <w:r>
+        <w:t xml:space="preserve">, then expand</w:t>
+      </w:r>
+      <w:r>
+        <w:t xml:space="preserve"> </w:t>
+      </w:r>
+      <w:r>
+        <w:rPr>
+          <w:b/>
+          <w:bCs/>
+        </w:rPr>
+        <w:t xml:space="preserve">Scan the entire repository</w:t>
+      </w:r>
+      <w:r>
+        <w:rPr>
+          <w:b/>
+          <w:bCs/>
+        </w:rPr>
+        <w:t xml:space="preserve"> </w:t>
+      </w:r>
+      <w:r>
+        <w:rPr>
+          <w:b/>
+          <w:bCs/>
+        </w:rPr>
+        <w:t xml:space="preserve">history</w:t>
+      </w:r>
+      <w:r>
+        <w:t xml:space="preserve">. The log names the runner it landed on and ends with</w:t>
+      </w:r>
+      <w:r>
+        <w:t xml:space="preserve"> </w:t>
+      </w:r>
+      <w:r>
+        <w:rPr>
+          <w:rStyle w:val="VerbatimChar"/>
+        </w:rPr>
+        <w:t xml:space="preserve">no leaks found</w:t>
+      </w:r>
+      <w:r>
+        <w:t xml:space="preserve">. Or</w:t>
+      </w:r>
+      <w:r>
+        <w:t xml:space="preserve"> </w:t>
+      </w:r>
+      <w:r>
+        <w:rPr>
+          <w:b/>
+          <w:bCs/>
+        </w:rPr>
+        <w:t xml:space="preserve">Security →</w:t>
+      </w:r>
+      <w:r>
+        <w:rPr>
+          <w:b/>
+          <w:bCs/>
+        </w:rPr>
+        <w:t xml:space="preserve"> </w:t>
+      </w:r>
+      <w:r>
+        <w:rPr>
+          <w:b/>
+          <w:bCs/>
+        </w:rPr>
+        <w:t xml:space="preserve">Code scanning</w:t>
+      </w:r>
+      <w:r>
+        <w:t xml:space="preserve">, filter by tool</w:t>
+      </w:r>
+      <w:r>
+        <w:t xml:space="preserve"> </w:t>
+      </w:r>
+      <w:r>
+        <w:rPr>
+          <w:rStyle w:val="VerbatimChar"/>
+        </w:rPr>
+        <w:t xml:space="preserve">gitleaks</w:t>
+      </w:r>
+      <w:r>
+        <w:t xml:space="preserve">.</w:t>
+      </w:r>
+    </w:p>
+    <w:bookmarkEnd w:id="19"/>
+    <w:bookmarkStart w:id="20" w:name="X434040f7587c8915e8b2a378ffef8faf8ae425e"/>
+    <w:p>
+      <w:pPr>
+        <w:pStyle w:val="Heading2"/>
+      </w:pPr>
+      <w:r>
+        <w:t xml:space="preserve">7. The pipeline checks the infrastructure code</w:t>
+      </w:r>
+    </w:p>
+    <w:p>
+      <w:pPr>
+        <w:pStyle w:val="FirstParagraph"/>
+      </w:pPr>
+      <w:r>
+        <w:rPr>
+          <w:b/>
+          <w:bCs/>
+        </w:rPr>
+        <w:t xml:space="preserve">The tool:</w:t>
+      </w:r>
+      <w:r>
+        <w:t xml:space="preserve"> </w:t>
+      </w:r>
+      <w:r>
+        <w:t xml:space="preserve">Checkov. Open source. It reads Terraform and looks for unsafe settings.</w:t>
+      </w:r>
+    </w:p>
+    <w:p>
+      <w:pPr>
+        <w:pStyle w:val="BodyText"/>
+      </w:pPr>
+      <w:r>
+        <w:rPr>
+          <w:b/>
+          <w:bCs/>
+        </w:rPr>
+        <w:t xml:space="preserve">Where it runs:</w:t>
+      </w:r>
+      <w:r>
+        <w:t xml:space="preserve"> </w:t>
+      </w:r>
+      <w:r>
+        <w:t xml:space="preserve">three times, on three different machines. Development on 201, staging on 202,</w:t>
+      </w:r>
+      <w:r>
+        <w:t xml:space="preserve"> </w:t>
+      </w:r>
+      <w:r>
+        <w:t xml:space="preserve">production on 203. A job for one environment cannot land on another environment's runner; that is</w:t>
+      </w:r>
+      <w:r>
+        <w:t xml:space="preserve"> </w:t>
+      </w:r>
+      <w:r>
+        <w:t xml:space="preserve">decided by one line,</w:t>
+      </w:r>
+      <w:r>
+        <w:t xml:space="preserve"> </w:t>
+      </w:r>
+      <w:r>
+        <w:rPr>
+          <w:rStyle w:val="VerbatimChar"/>
+        </w:rPr>
+        <w:t xml:space="preserve">runs-on: [self-hosted, &lt;environment&gt;]</w:t>
+      </w:r>
+      <w:r>
+        <w:t xml:space="preserve">.</w:t>
+      </w:r>
+    </w:p>
+    <w:p>
+      <w:pPr>
+        <w:pStyle w:val="BodyText"/>
+      </w:pPr>
+      <w:r>
+        <w:rPr>
+          <w:b/>
+          <w:bCs/>
+        </w:rPr>
+        <w:t xml:space="preserve">What it reads:</w:t>
+      </w:r>
+      <w:r>
+        <w:t xml:space="preserve"> </w:t>
+      </w:r>
+      <w:r>
+        <w:rPr>
+          <w:rStyle w:val="VerbatimChar"/>
+        </w:rPr>
+        <w:t xml:space="preserve">terraform/envs/&lt;environment&gt;/</w:t>
+      </w:r>
+      <w:r>
+        <w:t xml:space="preserve">. Same code, three copies, and only the settings</w:t>
+      </w:r>
+      <w:r>
+        <w:t xml:space="preserve"> </w:t>
+      </w:r>
+      <w:r>
+        <w:t xml:space="preserve">that are allowed to differ between environments differ.</w:t>
+      </w:r>
+    </w:p>
+    <w:p>
+      <w:pPr>
+        <w:pStyle w:val="BodyText"/>
+      </w:pPr>
+      <w:r>
+        <w:rPr>
+          <w:b/>
+          <w:bCs/>
+        </w:rPr>
+        <w:t xml:space="preserve">What it does, in order, on each runner:</w:t>
+      </w:r>
+    </w:p>
+    <w:p>
+      <w:pPr>
+        <w:pStyle w:val="SourceCode"/>
+      </w:pPr>
+      <w:r>
+        <w:rPr>
+          <w:rStyle w:val="VerbatimChar"/>
+        </w:rPr>
+        <w:t xml:space="preserve">terraform fmt -check          formatting is a gate, not a suggestion</w:t>
+      </w:r>
+      <w:r>
+        <w:br/>
+      </w:r>
+      <w:r>
+        <w:rPr>
+          <w:rStyle w:val="VerbatimChar"/>
+        </w:rPr>
+        <w:t xml:space="preserve">sops --decrypt                the state database password, with a key only this runner has</w:t>
+      </w:r>
+      <w:r>
+        <w:br/>
+      </w:r>
+      <w:r>
+        <w:rPr>
+          <w:rStyle w:val="VerbatimChar"/>
+        </w:rPr>
+        <w:t xml:space="preserve">terraform init                connects to this environment's own state database</w:t>
+      </w:r>
+      <w:r>
+        <w:br/>
+      </w:r>
+      <w:r>
+        <w:rPr>
+          <w:rStyle w:val="VerbatimChar"/>
+        </w:rPr>
+        <w:t xml:space="preserve">terraform validate            the code is well formed</w:t>
+      </w:r>
+      <w:r>
+        <w:br/>
+      </w:r>
+      <w:r>
+        <w:rPr>
+          <w:rStyle w:val="VerbatimChar"/>
+        </w:rPr>
+        <w:t xml:space="preserve">checkov -d terraform/envs/&lt;environment&gt; --soft-fail</w:t>
+      </w:r>
+    </w:p>
+    <w:p>
+      <w:pPr>
+        <w:pStyle w:val="FirstParagraph"/>
+      </w:pPr>
+      <w:r>
+        <w:rPr>
+          <w:rStyle w:val="VerbatimChar"/>
+        </w:rPr>
+        <w:t xml:space="preserve">--soft-fail</w:t>
+      </w:r>
+      <w:r>
+        <w:t xml:space="preserve"> </w:t>
+      </w:r>
+      <w:r>
+        <w:t xml:space="preserve">means</w:t>
+      </w:r>
+      <w:r>
+        <w:t xml:space="preserve"> </w:t>
+      </w:r>
+      <w:r>
+        <w:rPr>
+          <w:b/>
+          <w:bCs/>
+        </w:rPr>
+        <w:t xml:space="preserve">Checkov itself never fails the job.</w:t>
+      </w:r>
+      <w:r>
+        <w:t xml:space="preserve"> </w:t>
+      </w:r>
+      <w:r>
+        <w:t xml:space="preserve">It reports. The decision is made in</w:t>
+      </w:r>
+      <w:r>
+        <w:t xml:space="preserve"> </w:t>
+      </w:r>
+      <w:r>
+        <w:t xml:space="preserve">step 8. That is deliberate: a scanner that fails the build on every finding gets switched off.</w:t>
+      </w:r>
+    </w:p>
+    <w:p>
+      <w:pPr>
+        <w:pStyle w:val="BodyText"/>
+      </w:pPr>
+      <w:r>
+        <w:rPr>
+          <w:b/>
+          <w:bCs/>
+        </w:rPr>
+        <w:t xml:space="preserve">Examples of what Checkov finds:</w:t>
       </w:r>
     </w:p>
     <w:p>
@@ -985,23 +1974,7 @@
         </w:numPr>
       </w:pPr>
       <w:r>
-        <w:t xml:space="preserve">Development blocks</w:t>
-      </w:r>
-      <w:r>
-        <w:t xml:space="preserve"> </w:t>
-      </w:r>
-      <w:r>
-        <w:rPr>
-          <w:b/>
-          <w:bCs/>
-        </w:rPr>
-        <w:t xml:space="preserve">10</w:t>
-      </w:r>
-      <w:r>
-        <w:t xml:space="preserve"> </w:t>
-      </w:r>
-      <w:r>
-        <w:t xml:space="preserve">things</w:t>
+        <w:t xml:space="preserve">A storage bucket anyone on the internet can read</w:t>
       </w:r>
     </w:p>
     <w:p>
@@ -1013,17 +1986,7 @@
         </w:numPr>
       </w:pPr>
       <w:r>
-        <w:t xml:space="preserve">Staging blocks</w:t>
-      </w:r>
-      <w:r>
-        <w:t xml:space="preserve"> </w:t>
-      </w:r>
-      <w:r>
-        <w:rPr>
-          <w:b/>
-          <w:bCs/>
-        </w:rPr>
-        <w:t xml:space="preserve">14</w:t>
+        <w:t xml:space="preserve">SSH open to the whole world</w:t>
       </w:r>
     </w:p>
     <w:p>
@@ -1035,59 +1998,49 @@
         </w:numPr>
       </w:pPr>
       <w:r>
-        <w:t xml:space="preserve">Production blocks</w:t>
-      </w:r>
-      <w:r>
-        <w:t xml:space="preserve"> </w:t>
-      </w:r>
+        <w:t xml:space="preserve">A database with no encryption</w:t>
+      </w:r>
+    </w:p>
+    <w:p>
+      <w:pPr>
+        <w:pStyle w:val="Compact"/>
+        <w:numPr>
+          <w:ilvl w:val="0"/>
+          <w:numId w:val="1002"/>
+        </w:numPr>
+      </w:pPr>
+      <w:r>
+        <w:t xml:space="preserve">A database anyone on the internet can connect to</w:t>
+      </w:r>
+    </w:p>
+    <w:p>
+      <w:pPr>
+        <w:pStyle w:val="FirstParagraph"/>
+      </w:pPr>
       <w:r>
         <w:rPr>
           <w:b/>
           <w:bCs/>
         </w:rPr>
-        <w:t xml:space="preserve">14</w:t>
-      </w:r>
-    </w:p>
-    <w:p>
-      <w:pPr>
-        <w:pStyle w:val="FirstParagraph"/>
-      </w:pPr>
-      <w:r>
-        <w:t xml:space="preserve">The extra four are things development is allowed to skip.</w:t>
-      </w:r>
-    </w:p>
-    <w:bookmarkEnd w:id="20"/>
-    <w:bookmarkStart w:id="21" w:name="X246aa44bdd108e968a2db65af2bd4bc28f121de"/>
-    <w:p>
-      <w:pPr>
-        <w:pStyle w:val="Heading2"/>
-      </w:pPr>
-      <w:r>
-        <w:t xml:space="preserve">8. The pipeline writes a comment</w:t>
-      </w:r>
-    </w:p>
-    <w:p>
-      <w:pPr>
-        <w:pStyle w:val="FirstParagraph"/>
-      </w:pPr>
-      <w:r>
-        <w:t xml:space="preserve">It finds 24 problems in 110 lines of code.</w:t>
-      </w:r>
-    </w:p>
-    <w:p>
-      <w:pPr>
-        <w:pStyle w:val="BodyText"/>
-      </w:pPr>
-      <w:r>
-        <w:t xml:space="preserve">Nobody reads 24 findings. They turn the tool off instead.</w:t>
-      </w:r>
-    </w:p>
-    <w:p>
-      <w:pPr>
-        <w:pStyle w:val="BodyText"/>
-      </w:pPr>
-      <w:r>
-        <w:t xml:space="preserve">So a script sorts them:</w:t>
+        <w:t xml:space="preserve">What the numbers mean.</w:t>
+      </w:r>
+      <w:r>
+        <w:t xml:space="preserve"> </w:t>
+      </w:r>
+      <w:r>
+        <w:t xml:space="preserve">Against the deliberately broken copy of the code in</w:t>
+      </w:r>
+      <w:r>
+        <w:t xml:space="preserve"> </w:t>
+      </w:r>
+      <w:r>
+        <w:rPr>
+          <w:rStyle w:val="VerbatimChar"/>
+        </w:rPr>
+        <w:t xml:space="preserve">terraform/insecure/</w:t>
+      </w:r>
+      <w:r>
+        <w:t xml:space="preserve">, the pipeline blocks:</w:t>
       </w:r>
     </w:p>
     <w:p>
@@ -1099,6 +2052,12 @@
         </w:numPr>
       </w:pPr>
       <w:r>
+        <w:t xml:space="preserve">Development:</w:t>
+      </w:r>
+      <w:r>
+        <w:t xml:space="preserve"> </w:t>
+      </w:r>
+      <w:r>
         <w:rPr>
           <w:b/>
           <w:bCs/>
@@ -1109,7 +2068,7 @@
         <w:t xml:space="preserve"> </w:t>
       </w:r>
       <w:r>
-        <w:t xml:space="preserve">stop the merge</w:t>
+        <w:t xml:space="preserve">things</w:t>
       </w:r>
     </w:p>
     <w:p>
@@ -1121,17 +2080,17 @@
         </w:numPr>
       </w:pPr>
       <w:r>
+        <w:t xml:space="preserve">Staging:</w:t>
+      </w:r>
+      <w:r>
+        <w:t xml:space="preserve"> </w:t>
+      </w:r>
+      <w:r>
         <w:rPr>
           <w:b/>
           <w:bCs/>
         </w:rPr>
-        <w:t xml:space="preserve">5</w:t>
-      </w:r>
-      <w:r>
-        <w:t xml:space="preserve"> </w:t>
-      </w:r>
-      <w:r>
-        <w:t xml:space="preserve">are advice</w:t>
+        <w:t xml:space="preserve">14</w:t>
       </w:r>
     </w:p>
     <w:p>
@@ -1143,10 +2102,1072 @@
         </w:numPr>
       </w:pPr>
       <w:r>
+        <w:t xml:space="preserve">Production:</w:t>
+      </w:r>
+      <w:r>
+        <w:t xml:space="preserve"> </w:t>
+      </w:r>
+      <w:r>
         <w:rPr>
           <w:b/>
           <w:bCs/>
         </w:rPr>
+        <w:t xml:space="preserve">14</w:t>
+      </w:r>
+    </w:p>
+    <w:p>
+      <w:pPr>
+        <w:pStyle w:val="FirstParagraph"/>
+      </w:pPr>
+      <w:r>
+        <w:t xml:space="preserve">The extra four are things development is allowed to skip: deletion protection, multi-AZ, log</w:t>
+      </w:r>
+      <w:r>
+        <w:t xml:space="preserve"> </w:t>
+      </w:r>
+      <w:r>
+        <w:t xml:space="preserve">export, enhanced monitoring. Losing a development box costs an afternoon.</w:t>
+      </w:r>
+    </w:p>
+    <w:p>
+      <w:pPr>
+        <w:pStyle w:val="BodyText"/>
+      </w:pPr>
+      <w:r>
+        <w:t xml:space="preserve">Against the real code in this pull request, Checkov still reports findings - 9 in production, 11 in</w:t>
+      </w:r>
+      <w:r>
+        <w:t xml:space="preserve"> </w:t>
+      </w:r>
+      <w:r>
+        <w:t xml:space="preserve">development - but</w:t>
+      </w:r>
+      <w:r>
+        <w:t xml:space="preserve"> </w:t>
+      </w:r>
+      <w:r>
+        <w:rPr>
+          <w:b/>
+          <w:bCs/>
+        </w:rPr>
+        <w:t xml:space="preserve">none is on the blocking list</w:t>
+      </w:r>
+      <w:r>
+        <w:t xml:space="preserve">. That is why the checks are green, and why step 8</w:t>
+      </w:r>
+      <w:r>
+        <w:t xml:space="preserve"> </w:t>
+      </w:r>
+      <w:r>
+        <w:t xml:space="preserve">exists.</w:t>
+      </w:r>
+    </w:p>
+    <w:p>
+      <w:pPr>
+        <w:pStyle w:val="BodyText"/>
+      </w:pPr>
+      <w:r>
+        <w:rPr>
+          <w:b/>
+          <w:bCs/>
+        </w:rPr>
+        <w:t xml:space="preserve">Check it yourself:</w:t>
+      </w:r>
+    </w:p>
+    <w:p>
+      <w:pPr>
+        <w:pStyle w:val="SourceCode"/>
+      </w:pPr>
+      <w:r>
+        <w:rPr>
+          <w:rStyle w:val="CommentTok"/>
+        </w:rPr>
+        <w:t xml:space="preserve"># on a laptop: the broken code, all three environments. Non-zero exit is the correct result</w:t>
+      </w:r>
+      <w:r>
+        <w:br/>
+      </w:r>
+      <w:r>
+        <w:rPr>
+          <w:rStyle w:val="FunctionTok"/>
+        </w:rPr>
+        <w:t xml:space="preserve">make</w:t>
+      </w:r>
+      <w:r>
+        <w:rPr>
+          <w:rStyle w:val="NormalTok"/>
+        </w:rPr>
+        <w:t xml:space="preserve"> scan-insecure</w:t>
+      </w:r>
+      <w:r>
+        <w:br/>
+      </w:r>
+      <w:r>
+        <w:rPr>
+          <w:rStyle w:val="CommentTok"/>
+        </w:rPr>
+        <w:t xml:space="preserve">#   dev    exit=1  blocking=10</w:t>
+      </w:r>
+      <w:r>
+        <w:br/>
+      </w:r>
+      <w:r>
+        <w:rPr>
+          <w:rStyle w:val="CommentTok"/>
+        </w:rPr>
+        <w:t xml:space="preserve">#   stage  exit=1  blocking=14</w:t>
+      </w:r>
+      <w:r>
+        <w:br/>
+      </w:r>
+      <w:r>
+        <w:rPr>
+          <w:rStyle w:val="CommentTok"/>
+        </w:rPr>
+        <w:t xml:space="preserve">#   prod   exit=1  blocking=14</w:t>
+      </w:r>
+      <w:r>
+        <w:br/>
+      </w:r>
+      <w:r>
+        <w:br/>
+      </w:r>
+      <w:r>
+        <w:rPr>
+          <w:rStyle w:val="CommentTok"/>
+        </w:rPr>
+        <w:t xml:space="preserve"># on a laptop: the real code. Expect "No blocking findings" three times</w:t>
+      </w:r>
+      <w:r>
+        <w:br/>
+      </w:r>
+      <w:r>
+        <w:rPr>
+          <w:rStyle w:val="FunctionTok"/>
+        </w:rPr>
+        <w:t xml:space="preserve">make</w:t>
+      </w:r>
+      <w:r>
+        <w:rPr>
+          <w:rStyle w:val="NormalTok"/>
+        </w:rPr>
+        <w:t xml:space="preserve"> scan</w:t>
+      </w:r>
+      <w:r>
+        <w:br/>
+      </w:r>
+      <w:r>
+        <w:br/>
+      </w:r>
+      <w:r>
+        <w:rPr>
+          <w:rStyle w:val="CommentTok"/>
+        </w:rPr>
+        <w:t xml:space="preserve"># on GitHub: the Checkov result and the triage verdict, from the production job's log</w:t>
+      </w:r>
+      <w:r>
+        <w:br/>
+      </w:r>
+      <w:r>
+        <w:rPr>
+          <w:rStyle w:val="VariableTok"/>
+        </w:rPr>
+        <w:t xml:space="preserve">RUN</w:t>
+      </w:r>
+      <w:r>
+        <w:rPr>
+          <w:rStyle w:val="OperatorTok"/>
+        </w:rPr>
+        <w:t xml:space="preserve">=</w:t>
+      </w:r>
+      <w:r>
+        <w:rPr>
+          <w:rStyle w:val="VariableTok"/>
+        </w:rPr>
+        <w:t xml:space="preserve">$(</w:t>
+      </w:r>
+      <w:r>
+        <w:rPr>
+          <w:rStyle w:val="ExtensionTok"/>
+        </w:rPr>
+        <w:t xml:space="preserve">gh</w:t>
+      </w:r>
+      <w:r>
+        <w:rPr>
+          <w:rStyle w:val="NormalTok"/>
+        </w:rPr>
+        <w:t xml:space="preserve"> run list </w:t>
+      </w:r>
+      <w:r>
+        <w:rPr>
+          <w:rStyle w:val="AttributeTok"/>
+        </w:rPr>
+        <w:t xml:space="preserve">--workflow</w:t>
+      </w:r>
+      <w:r>
+        <w:rPr>
+          <w:rStyle w:val="NormalTok"/>
+        </w:rPr>
+        <w:t xml:space="preserve"> </w:t>
+      </w:r>
+      <w:r>
+        <w:rPr>
+          <w:rStyle w:val="StringTok"/>
+        </w:rPr>
+        <w:t xml:space="preserve">"Security Pipeline"</w:t>
+      </w:r>
+      <w:r>
+        <w:rPr>
+          <w:rStyle w:val="NormalTok"/>
+        </w:rPr>
+        <w:t xml:space="preserve"> </w:t>
+      </w:r>
+      <w:r>
+        <w:rPr>
+          <w:rStyle w:val="AttributeTok"/>
+        </w:rPr>
+        <w:t xml:space="preserve">--event</w:t>
+      </w:r>
+      <w:r>
+        <w:rPr>
+          <w:rStyle w:val="NormalTok"/>
+        </w:rPr>
+        <w:t xml:space="preserve"> pull_request </w:t>
+      </w:r>
+      <w:r>
+        <w:rPr>
+          <w:rStyle w:val="AttributeTok"/>
+        </w:rPr>
+        <w:t xml:space="preserve">--limit</w:t>
+      </w:r>
+      <w:r>
+        <w:rPr>
+          <w:rStyle w:val="NormalTok"/>
+        </w:rPr>
+        <w:t xml:space="preserve"> 1 </w:t>
+      </w:r>
+      <w:r>
+        <w:rPr>
+          <w:rStyle w:val="DataTypeTok"/>
+        </w:rPr>
+        <w:t xml:space="preserve">\</w:t>
+      </w:r>
+      <w:r>
+        <w:br/>
+      </w:r>
+      <w:r>
+        <w:rPr>
+          <w:rStyle w:val="NormalTok"/>
+        </w:rPr>
+        <w:t xml:space="preserve">      </w:t>
+      </w:r>
+      <w:r>
+        <w:rPr>
+          <w:rStyle w:val="AttributeTok"/>
+        </w:rPr>
+        <w:t xml:space="preserve">--json</w:t>
+      </w:r>
+      <w:r>
+        <w:rPr>
+          <w:rStyle w:val="NormalTok"/>
+        </w:rPr>
+        <w:t xml:space="preserve"> databaseId </w:t>
+      </w:r>
+      <w:r>
+        <w:rPr>
+          <w:rStyle w:val="AttributeTok"/>
+        </w:rPr>
+        <w:t xml:space="preserve">--jq</w:t>
+      </w:r>
+      <w:r>
+        <w:rPr>
+          <w:rStyle w:val="NormalTok"/>
+        </w:rPr>
+        <w:t xml:space="preserve"> </w:t>
+      </w:r>
+      <w:r>
+        <w:rPr>
+          <w:rStyle w:val="StringTok"/>
+        </w:rPr>
+        <w:t xml:space="preserve">'.[0].databaseId'</w:t>
+      </w:r>
+      <w:r>
+        <w:rPr>
+          <w:rStyle w:val="VariableTok"/>
+        </w:rPr>
+        <w:t xml:space="preserve">)</w:t>
+      </w:r>
+      <w:r>
+        <w:br/>
+      </w:r>
+      <w:r>
+        <w:rPr>
+          <w:rStyle w:val="VariableTok"/>
+        </w:rPr>
+        <w:t xml:space="preserve">JOB</w:t>
+      </w:r>
+      <w:r>
+        <w:rPr>
+          <w:rStyle w:val="OperatorTok"/>
+        </w:rPr>
+        <w:t xml:space="preserve">=</w:t>
+      </w:r>
+      <w:r>
+        <w:rPr>
+          <w:rStyle w:val="VariableTok"/>
+        </w:rPr>
+        <w:t xml:space="preserve">$(</w:t>
+      </w:r>
+      <w:r>
+        <w:rPr>
+          <w:rStyle w:val="ExtensionTok"/>
+        </w:rPr>
+        <w:t xml:space="preserve">gh</w:t>
+      </w:r>
+      <w:r>
+        <w:rPr>
+          <w:rStyle w:val="NormalTok"/>
+        </w:rPr>
+        <w:t xml:space="preserve"> run view </w:t>
+      </w:r>
+      <w:r>
+        <w:rPr>
+          <w:rStyle w:val="VariableTok"/>
+        </w:rPr>
+        <w:t xml:space="preserve">$RUN</w:t>
+      </w:r>
+      <w:r>
+        <w:rPr>
+          <w:rStyle w:val="NormalTok"/>
+        </w:rPr>
+        <w:t xml:space="preserve"> </w:t>
+      </w:r>
+      <w:r>
+        <w:rPr>
+          <w:rStyle w:val="AttributeTok"/>
+        </w:rPr>
+        <w:t xml:space="preserve">--json</w:t>
+      </w:r>
+      <w:r>
+        <w:rPr>
+          <w:rStyle w:val="NormalTok"/>
+        </w:rPr>
+        <w:t xml:space="preserve"> jobs </w:t>
+      </w:r>
+      <w:r>
+        <w:rPr>
+          <w:rStyle w:val="AttributeTok"/>
+        </w:rPr>
+        <w:t xml:space="preserve">--jq</w:t>
+      </w:r>
+      <w:r>
+        <w:rPr>
+          <w:rStyle w:val="NormalTok"/>
+        </w:rPr>
+        <w:t xml:space="preserve"> </w:t>
+      </w:r>
+      <w:r>
+        <w:rPr>
+          <w:rStyle w:val="StringTok"/>
+        </w:rPr>
+        <w:t xml:space="preserve">'.jobs[] | select(.name=="IaC (prod)") | .databaseId'</w:t>
+      </w:r>
+      <w:r>
+        <w:rPr>
+          <w:rStyle w:val="VariableTok"/>
+        </w:rPr>
+        <w:t xml:space="preserve">)</w:t>
+      </w:r>
+      <w:r>
+        <w:br/>
+      </w:r>
+      <w:r>
+        <w:rPr>
+          <w:rStyle w:val="ExtensionTok"/>
+        </w:rPr>
+        <w:t xml:space="preserve">gh</w:t>
+      </w:r>
+      <w:r>
+        <w:rPr>
+          <w:rStyle w:val="NormalTok"/>
+        </w:rPr>
+        <w:t xml:space="preserve"> run view </w:t>
+      </w:r>
+      <w:r>
+        <w:rPr>
+          <w:rStyle w:val="AttributeTok"/>
+        </w:rPr>
+        <w:t xml:space="preserve">--job</w:t>
+      </w:r>
+      <w:r>
+        <w:rPr>
+          <w:rStyle w:val="NormalTok"/>
+        </w:rPr>
+        <w:t xml:space="preserve"> </w:t>
+      </w:r>
+      <w:r>
+        <w:rPr>
+          <w:rStyle w:val="VariableTok"/>
+        </w:rPr>
+        <w:t xml:space="preserve">$JOB</w:t>
+      </w:r>
+      <w:r>
+        <w:rPr>
+          <w:rStyle w:val="NormalTok"/>
+        </w:rPr>
+        <w:t xml:space="preserve"> </w:t>
+      </w:r>
+      <w:r>
+        <w:rPr>
+          <w:rStyle w:val="AttributeTok"/>
+        </w:rPr>
+        <w:t xml:space="preserve">--log</w:t>
+      </w:r>
+      <w:r>
+        <w:rPr>
+          <w:rStyle w:val="NormalTok"/>
+        </w:rPr>
+        <w:t xml:space="preserve"> </w:t>
+      </w:r>
+      <w:r>
+        <w:rPr>
+          <w:rStyle w:val="KeywordTok"/>
+        </w:rPr>
+        <w:t xml:space="preserve">|</w:t>
+      </w:r>
+      <w:r>
+        <w:rPr>
+          <w:rStyle w:val="NormalTok"/>
+        </w:rPr>
+        <w:t xml:space="preserve"> </w:t>
+      </w:r>
+      <w:r>
+        <w:rPr>
+          <w:rStyle w:val="FunctionTok"/>
+        </w:rPr>
+        <w:t xml:space="preserve">grep</w:t>
+      </w:r>
+      <w:r>
+        <w:rPr>
+          <w:rStyle w:val="NormalTok"/>
+        </w:rPr>
+        <w:t xml:space="preserve"> </w:t>
+      </w:r>
+      <w:r>
+        <w:rPr>
+          <w:rStyle w:val="AttributeTok"/>
+        </w:rPr>
+        <w:t xml:space="preserve">-E</w:t>
+      </w:r>
+      <w:r>
+        <w:rPr>
+          <w:rStyle w:val="NormalTok"/>
+        </w:rPr>
+        <w:t xml:space="preserve"> </w:t>
+      </w:r>
+      <w:r>
+        <w:rPr>
+          <w:rStyle w:val="StringTok"/>
+        </w:rPr>
+        <w:t xml:space="preserve">"Runner name|Passed checks|blocking="</w:t>
+      </w:r>
+      <w:r>
+        <w:br/>
+      </w:r>
+      <w:r>
+        <w:rPr>
+          <w:rStyle w:val="CommentTok"/>
+        </w:rPr>
+        <w:t xml:space="preserve">#   Runner name: 'ci-prod'</w:t>
+      </w:r>
+      <w:r>
+        <w:br/>
+      </w:r>
+      <w:r>
+        <w:rPr>
+          <w:rStyle w:val="CommentTok"/>
+        </w:rPr>
+        <w:t xml:space="preserve">#   Passed checks: 63, Failed checks: 9, Skipped checks: 0</w:t>
+      </w:r>
+      <w:r>
+        <w:br/>
+      </w:r>
+      <w:r>
+        <w:rPr>
+          <w:rStyle w:val="CommentTok"/>
+        </w:rPr>
+        <w:t xml:space="preserve">#   blocking=0 advisory=8 other=1</w:t>
+      </w:r>
+      <w:r>
+        <w:br/>
+      </w:r>
+      <w:r>
+        <w:br/>
+      </w:r>
+      <w:r>
+        <w:rPr>
+          <w:rStyle w:val="CommentTok"/>
+        </w:rPr>
+        <w:t xml:space="preserve"># the Security tab, by API: one Checkov upload per environment</w:t>
+      </w:r>
+      <w:r>
+        <w:br/>
+      </w:r>
+      <w:r>
+        <w:rPr>
+          <w:rStyle w:val="ExtensionTok"/>
+        </w:rPr>
+        <w:t xml:space="preserve">gh</w:t>
+      </w:r>
+      <w:r>
+        <w:rPr>
+          <w:rStyle w:val="NormalTok"/>
+        </w:rPr>
+        <w:t xml:space="preserve"> api </w:t>
+      </w:r>
+      <w:r>
+        <w:rPr>
+          <w:rStyle w:val="StringTok"/>
+        </w:rPr>
+        <w:t xml:space="preserve">"repos/georgejpark/secure-iac-pipeline/code-scanning/analyses?tool_name=Checkov&amp;per_page=3"</w:t>
+      </w:r>
+      <w:r>
+        <w:rPr>
+          <w:rStyle w:val="NormalTok"/>
+        </w:rPr>
+        <w:t xml:space="preserve"> </w:t>
+      </w:r>
+      <w:r>
+        <w:rPr>
+          <w:rStyle w:val="DataTypeTok"/>
+        </w:rPr>
+        <w:t xml:space="preserve">\</w:t>
+      </w:r>
+      <w:r>
+        <w:br/>
+      </w:r>
+      <w:r>
+        <w:rPr>
+          <w:rStyle w:val="NormalTok"/>
+        </w:rPr>
+        <w:t xml:space="preserve">  </w:t>
+      </w:r>
+      <w:r>
+        <w:rPr>
+          <w:rStyle w:val="AttributeTok"/>
+        </w:rPr>
+        <w:t xml:space="preserve">--jq</w:t>
+      </w:r>
+      <w:r>
+        <w:rPr>
+          <w:rStyle w:val="NormalTok"/>
+        </w:rPr>
+        <w:t xml:space="preserve"> </w:t>
+      </w:r>
+      <w:r>
+        <w:rPr>
+          <w:rStyle w:val="StringTok"/>
+        </w:rPr>
+        <w:t xml:space="preserve">'.[] | "\(.created_at)  \(.category)  findings=\(.results_count)"'</w:t>
+      </w:r>
+      <w:r>
+        <w:br/>
+      </w:r>
+      <w:r>
+        <w:rPr>
+          <w:rStyle w:val="CommentTok"/>
+        </w:rPr>
+        <w:t xml:space="preserve">#   checkov-prod   findings=9</w:t>
+      </w:r>
+      <w:r>
+        <w:br/>
+      </w:r>
+      <w:r>
+        <w:rPr>
+          <w:rStyle w:val="CommentTok"/>
+        </w:rPr>
+        <w:t xml:space="preserve">#   checkov-stage  findings=9</w:t>
+      </w:r>
+      <w:r>
+        <w:br/>
+      </w:r>
+      <w:r>
+        <w:rPr>
+          <w:rStyle w:val="CommentTok"/>
+        </w:rPr>
+        <w:t xml:space="preserve">#   checkov-dev    findings=11</w:t>
+      </w:r>
+      <w:r>
+        <w:br/>
+      </w:r>
+      <w:r>
+        <w:br/>
+      </w:r>
+      <w:r>
+        <w:rPr>
+          <w:rStyle w:val="CommentTok"/>
+        </w:rPr>
+        <w:t xml:space="preserve"># open alerts, by tool</w:t>
+      </w:r>
+      <w:r>
+        <w:br/>
+      </w:r>
+      <w:r>
+        <w:rPr>
+          <w:rStyle w:val="ExtensionTok"/>
+        </w:rPr>
+        <w:t xml:space="preserve">gh</w:t>
+      </w:r>
+      <w:r>
+        <w:rPr>
+          <w:rStyle w:val="NormalTok"/>
+        </w:rPr>
+        <w:t xml:space="preserve"> api </w:t>
+      </w:r>
+      <w:r>
+        <w:rPr>
+          <w:rStyle w:val="StringTok"/>
+        </w:rPr>
+        <w:t xml:space="preserve">"repos/georgejpark/secure-iac-pipeline/code-scanning/alerts?state=open&amp;per_page=100"</w:t>
+      </w:r>
+      <w:r>
+        <w:rPr>
+          <w:rStyle w:val="NormalTok"/>
+        </w:rPr>
+        <w:t xml:space="preserve"> </w:t>
+      </w:r>
+      <w:r>
+        <w:rPr>
+          <w:rStyle w:val="DataTypeTok"/>
+        </w:rPr>
+        <w:t xml:space="preserve">\</w:t>
+      </w:r>
+      <w:r>
+        <w:br/>
+      </w:r>
+      <w:r>
+        <w:rPr>
+          <w:rStyle w:val="NormalTok"/>
+        </w:rPr>
+        <w:t xml:space="preserve">  </w:t>
+      </w:r>
+      <w:r>
+        <w:rPr>
+          <w:rStyle w:val="AttributeTok"/>
+        </w:rPr>
+        <w:t xml:space="preserve">--jq</w:t>
+      </w:r>
+      <w:r>
+        <w:rPr>
+          <w:rStyle w:val="NormalTok"/>
+        </w:rPr>
+        <w:t xml:space="preserve"> </w:t>
+      </w:r>
+      <w:r>
+        <w:rPr>
+          <w:rStyle w:val="StringTok"/>
+        </w:rPr>
+        <w:t xml:space="preserve">'group_by(.tool.name)[] | "\(.[0].tool.name): \(length) open"'</w:t>
+      </w:r>
+    </w:p>
+    <w:p>
+      <w:pPr>
+        <w:pStyle w:val="FirstParagraph"/>
+      </w:pPr>
+      <w:r>
+        <w:t xml:space="preserve">In the browser: on the pull request, click</w:t>
+      </w:r>
+      <w:r>
+        <w:t xml:space="preserve"> </w:t>
+      </w:r>
+      <w:r>
+        <w:rPr>
+          <w:b/>
+          <w:bCs/>
+        </w:rPr>
+        <w:t xml:space="preserve">IaC (prod)</w:t>
+      </w:r>
+      <w:r>
+        <w:t xml:space="preserve">, expand</w:t>
+      </w:r>
+      <w:r>
+        <w:t xml:space="preserve"> </w:t>
+      </w:r>
+      <w:r>
+        <w:rPr>
+          <w:b/>
+          <w:bCs/>
+        </w:rPr>
+        <w:t xml:space="preserve">Checkov</w:t>
+      </w:r>
+      <w:r>
+        <w:t xml:space="preserve"> </w:t>
+      </w:r>
+      <w:r>
+        <w:t xml:space="preserve">and read the counts.</w:t>
+      </w:r>
+      <w:r>
+        <w:t xml:space="preserve"> </w:t>
+      </w:r>
+      <w:r>
+        <w:t xml:space="preserve">Then open</w:t>
+      </w:r>
+      <w:r>
+        <w:t xml:space="preserve"> </w:t>
+      </w:r>
+      <w:r>
+        <w:rPr>
+          <w:b/>
+          <w:bCs/>
+        </w:rPr>
+        <w:t xml:space="preserve">IaC (dev)</w:t>
+      </w:r>
+      <w:r>
+        <w:t xml:space="preserve"> </w:t>
+      </w:r>
+      <w:r>
+        <w:t xml:space="preserve">and compare the runner name in the log header. Different machine. Or</w:t>
+      </w:r>
+      <w:r>
+        <w:t xml:space="preserve"> </w:t>
+      </w:r>
+      <w:r>
+        <w:rPr>
+          <w:b/>
+          <w:bCs/>
+        </w:rPr>
+        <w:t xml:space="preserve">Security → Code scanning</w:t>
+      </w:r>
+      <w:r>
+        <w:t xml:space="preserve">, filter by tool</w:t>
+      </w:r>
+      <w:r>
+        <w:t xml:space="preserve"> </w:t>
+      </w:r>
+      <w:r>
+        <w:rPr>
+          <w:rStyle w:val="VerbatimChar"/>
+        </w:rPr>
+        <w:t xml:space="preserve">Checkov</w:t>
+      </w:r>
+      <w:r>
+        <w:t xml:space="preserve">, and note the three categories.</w:t>
+      </w:r>
+    </w:p>
+    <w:bookmarkEnd w:id="20"/>
+    <w:bookmarkStart w:id="21" w:name="X246aa44bdd108e968a2db65af2bd4bc28f121de"/>
+    <w:p>
+      <w:pPr>
+        <w:pStyle w:val="Heading2"/>
+      </w:pPr>
+      <w:r>
+        <w:t xml:space="preserve">8. The pipeline writes a comment</w:t>
+      </w:r>
+    </w:p>
+    <w:p>
+      <w:pPr>
+        <w:pStyle w:val="FirstParagraph"/>
+      </w:pPr>
+      <w:r>
+        <w:rPr>
+          <w:b/>
+          <w:bCs/>
+        </w:rPr>
+        <w:t xml:space="preserve">The tool:</w:t>
+      </w:r>
+      <w:r>
+        <w:t xml:space="preserve"> </w:t>
+      </w:r>
+      <w:r>
+        <w:rPr>
+          <w:rStyle w:val="VerbatimChar"/>
+        </w:rPr>
+        <w:t xml:space="preserve">scripts/ai_triage.py</w:t>
+      </w:r>
+      <w:r>
+        <w:t xml:space="preserve">. Ours. About 300 lines of Python.</w:t>
+      </w:r>
+    </w:p>
+    <w:p>
+      <w:pPr>
+        <w:pStyle w:val="BodyText"/>
+      </w:pPr>
+      <w:r>
+        <w:rPr>
+          <w:b/>
+          <w:bCs/>
+        </w:rPr>
+        <w:t xml:space="preserve">Why it exists:</w:t>
+      </w:r>
+      <w:r>
+        <w:t xml:space="preserve"> </w:t>
+      </w:r>
+      <w:r>
+        <w:t xml:space="preserve">Checkov finds 24 problems in 110 lines of code. Nobody reads 24 findings. They</w:t>
+      </w:r>
+      <w:r>
+        <w:t xml:space="preserve"> </w:t>
+      </w:r>
+      <w:r>
+        <w:t xml:space="preserve">turn the tool off instead.</w:t>
+      </w:r>
+    </w:p>
+    <w:p>
+      <w:pPr>
+        <w:pStyle w:val="BodyText"/>
+      </w:pPr>
+      <w:r>
+        <w:rPr>
+          <w:b/>
+          <w:bCs/>
+        </w:rPr>
+        <w:t xml:space="preserve">What it reads:</w:t>
+      </w:r>
+      <w:r>
+        <w:t xml:space="preserve"> </w:t>
+      </w:r>
+      <w:r>
+        <w:t xml:space="preserve">Checkov's JSON output from step 7.</w:t>
+      </w:r>
+    </w:p>
+    <w:p>
+      <w:pPr>
+        <w:pStyle w:val="BodyText"/>
+      </w:pPr>
+      <w:r>
+        <w:rPr>
+          <w:b/>
+          <w:bCs/>
+        </w:rPr>
+        <w:t xml:space="preserve">What it does:</w:t>
+      </w:r>
+    </w:p>
+    <w:p>
+      <w:pPr>
+        <w:pStyle w:val="Compact"/>
+        <w:numPr>
+          <w:ilvl w:val="0"/>
+          <w:numId w:val="1004"/>
+        </w:numPr>
+      </w:pPr>
+      <w:r>
+        <w:t xml:space="preserve">Compares every finding against three lists that live in the script and are version controlled:</w:t>
+      </w:r>
+    </w:p>
+    <w:p>
+      <w:pPr>
+        <w:pStyle w:val="Compact"/>
+        <w:numPr>
+          <w:ilvl w:val="1"/>
+          <w:numId w:val="1005"/>
+        </w:numPr>
+      </w:pPr>
+      <w:r>
+        <w:rPr>
+          <w:b/>
+          <w:bCs/>
+        </w:rPr>
+        <w:t xml:space="preserve">blocking</w:t>
+      </w:r>
+      <w:r>
+        <w:t xml:space="preserve"> </w:t>
+      </w:r>
+      <w:r>
+        <w:t xml:space="preserve">- 10 policy IDs. Any one of these fails the job</w:t>
+      </w:r>
+    </w:p>
+    <w:p>
+      <w:pPr>
+        <w:pStyle w:val="Compact"/>
+        <w:numPr>
+          <w:ilvl w:val="1"/>
+          <w:numId w:val="1005"/>
+        </w:numPr>
+      </w:pPr>
+      <w:r>
+        <w:rPr>
+          <w:b/>
+          <w:bCs/>
+        </w:rPr>
+        <w:t xml:space="preserve">promotion-gated</w:t>
+      </w:r>
+      <w:r>
+        <w:t xml:space="preserve"> </w:t>
+      </w:r>
+      <w:r>
+        <w:t xml:space="preserve">- 4 policy IDs. Advice in development, blocking in staging and production</w:t>
+      </w:r>
+    </w:p>
+    <w:p>
+      <w:pPr>
+        <w:pStyle w:val="Compact"/>
+        <w:numPr>
+          <w:ilvl w:val="1"/>
+          <w:numId w:val="1005"/>
+        </w:numPr>
+      </w:pPr>
+      <w:r>
+        <w:rPr>
+          <w:b/>
+          <w:bCs/>
+        </w:rPr>
+        <w:t xml:space="preserve">advisory</w:t>
+      </w:r>
+      <w:r>
+        <w:t xml:space="preserve"> </w:t>
+      </w:r>
+      <w:r>
+        <w:t xml:space="preserve">- the rest. Noted, never blocking</w:t>
+      </w:r>
+    </w:p>
+    <w:p>
+      <w:pPr>
+        <w:pStyle w:val="Compact"/>
+        <w:numPr>
+          <w:ilvl w:val="0"/>
+          <w:numId w:val="1004"/>
+        </w:numPr>
+      </w:pPr>
+      <w:r>
+        <w:t xml:space="preserve">Fails the job if anything on the blocking list is present. That is the gate.</w:t>
+      </w:r>
+    </w:p>
+    <w:p>
+      <w:pPr>
+        <w:pStyle w:val="Compact"/>
+        <w:numPr>
+          <w:ilvl w:val="0"/>
+          <w:numId w:val="1004"/>
+        </w:numPr>
+      </w:pPr>
+      <w:r>
+        <w:t xml:space="preserve">Writes a Markdown report, ordered by severity, in plain English.</w:t>
+      </w:r>
+    </w:p>
+    <w:p>
+      <w:pPr>
+        <w:pStyle w:val="Compact"/>
+        <w:numPr>
+          <w:ilvl w:val="0"/>
+          <w:numId w:val="1004"/>
+        </w:numPr>
+      </w:pPr>
+      <w:r>
+        <w:t xml:space="preserve">Posts it as a comment on the pull request. One comment per environment, updated on every push.</w:t>
+      </w:r>
+    </w:p>
+    <w:p>
+      <w:pPr>
+        <w:pStyle w:val="FirstParagraph"/>
+      </w:pPr>
+      <w:r>
+        <w:rPr>
+          <w:b/>
+          <w:bCs/>
+        </w:rPr>
+        <w:t xml:space="preserve">Where the AI comes in, and where it does not:</w:t>
+      </w:r>
+      <w:r>
+        <w:t xml:space="preserve"> </w:t>
+      </w:r>
+      <w:r>
+        <w:t xml:space="preserve">with an API key, a language model writes the</w:t>
+      </w:r>
+      <w:r>
+        <w:t xml:space="preserve"> </w:t>
+      </w:r>
+      <w:r>
+        <w:t xml:space="preserve">explanation and the ordering. Without one, the script produces the same report from local rules.</w:t>
+      </w:r>
+      <w:r>
+        <w:t xml:space="preserve"> </w:t>
+      </w:r>
+      <w:r>
+        <w:rPr>
+          <w:b/>
+          <w:bCs/>
+        </w:rPr>
+        <w:t xml:space="preserve">The model never decides pass or fail.</w:t>
+      </w:r>
+      <w:r>
+        <w:t xml:space="preserve"> </w:t>
+      </w:r>
+      <w:r>
+        <w:t xml:space="preserve">The lists do. If the model is unavailable the gate still</w:t>
+      </w:r>
+      <w:r>
+        <w:t xml:space="preserve"> </w:t>
+      </w:r>
+      <w:r>
+        <w:t xml:space="preserve">works.</w:t>
+      </w:r>
+    </w:p>
+    <w:p>
+      <w:pPr>
+        <w:pStyle w:val="BodyText"/>
+      </w:pPr>
+      <w:r>
+        <w:rPr>
+          <w:b/>
+          <w:bCs/>
+        </w:rPr>
+        <w:t xml:space="preserve">On the broken code</w:t>
+      </w:r>
+      <w:r>
+        <w:t xml:space="preserve">, the same 24 findings sort differently per environment:</w:t>
+      </w:r>
+    </w:p>
+    <w:p>
+      <w:pPr>
+        <w:pStyle w:val="Compact"/>
+        <w:numPr>
+          <w:ilvl w:val="0"/>
+          <w:numId w:val="1006"/>
+        </w:numPr>
+      </w:pPr>
+      <w:r>
+        <w:t xml:space="preserve">Development:</w:t>
+      </w:r>
+      <w:r>
+        <w:t xml:space="preserve"> </w:t>
+      </w:r>
+      <w:r>
+        <w:rPr>
+          <w:b/>
+          <w:bCs/>
+        </w:rPr>
+        <w:t xml:space="preserve">10</w:t>
+      </w:r>
+      <w:r>
+        <w:t xml:space="preserve"> </w:t>
+      </w:r>
+      <w:r>
+        <w:t xml:space="preserve">stop the merge,</w:t>
+      </w:r>
+      <w:r>
+        <w:t xml:space="preserve"> </w:t>
+      </w:r>
+      <w:r>
+        <w:rPr>
+          <w:b/>
+          <w:bCs/>
+        </w:rPr>
+        <w:t xml:space="preserve">5</w:t>
+      </w:r>
+      <w:r>
+        <w:t xml:space="preserve"> </w:t>
+      </w:r>
+      <w:r>
+        <w:t xml:space="preserve">are advice,</w:t>
+      </w:r>
+      <w:r>
+        <w:t xml:space="preserve"> </w:t>
+      </w:r>
+      <w:r>
+        <w:rPr>
+          <w:b/>
+          <w:bCs/>
+        </w:rPr>
         <w:t xml:space="preserve">9</w:t>
       </w:r>
       <w:r>
@@ -1158,10 +3179,382 @@
     </w:p>
     <w:p>
       <w:pPr>
+        <w:pStyle w:val="Compact"/>
+        <w:numPr>
+          <w:ilvl w:val="0"/>
+          <w:numId w:val="1006"/>
+        </w:numPr>
+      </w:pPr>
+      <w:r>
+        <w:t xml:space="preserve">Staging and production:</w:t>
+      </w:r>
+      <w:r>
+        <w:t xml:space="preserve"> </w:t>
+      </w:r>
+      <w:r>
+        <w:rPr>
+          <w:b/>
+          <w:bCs/>
+        </w:rPr>
+        <w:t xml:space="preserve">14</w:t>
+      </w:r>
+      <w:r>
+        <w:t xml:space="preserve"> </w:t>
+      </w:r>
+      <w:r>
+        <w:t xml:space="preserve">stop the merge,</w:t>
+      </w:r>
+      <w:r>
+        <w:t xml:space="preserve"> </w:t>
+      </w:r>
+      <w:r>
+        <w:rPr>
+          <w:b/>
+          <w:bCs/>
+        </w:rPr>
+        <w:t xml:space="preserve">5</w:t>
+      </w:r>
+      <w:r>
+        <w:t xml:space="preserve"> </w:t>
+      </w:r>
+      <w:r>
+        <w:t xml:space="preserve">are advice,</w:t>
+      </w:r>
+      <w:r>
+        <w:t xml:space="preserve"> </w:t>
+      </w:r>
+      <w:r>
+        <w:rPr>
+          <w:b/>
+          <w:bCs/>
+        </w:rPr>
+        <w:t xml:space="preserve">5</w:t>
+      </w:r>
+      <w:r>
+        <w:t xml:space="preserve"> </w:t>
+      </w:r>
+      <w:r>
+        <w:t xml:space="preserve">are noted</w:t>
+      </w:r>
+    </w:p>
+    <w:p>
+      <w:pPr>
         <w:pStyle w:val="FirstParagraph"/>
       </w:pPr>
       <w:r>
-        <w:t xml:space="preserve">Then it writes a comment in plain English.</w:t>
+        <w:t xml:space="preserve">The four that move from</w:t>
+      </w:r>
+      <w:r>
+        <w:t xml:space="preserve"> </w:t>
+      </w:r>
+      <w:r>
+        <w:rPr>
+          <w:i/>
+          <w:iCs/>
+        </w:rPr>
+        <w:t xml:space="preserve">noted</w:t>
+      </w:r>
+      <w:r>
+        <w:t xml:space="preserve"> </w:t>
+      </w:r>
+      <w:r>
+        <w:t xml:space="preserve">to</w:t>
+      </w:r>
+      <w:r>
+        <w:t xml:space="preserve"> </w:t>
+      </w:r>
+      <w:r>
+        <w:rPr>
+          <w:i/>
+          <w:iCs/>
+        </w:rPr>
+        <w:t xml:space="preserve">blocking</w:t>
+      </w:r>
+      <w:r>
+        <w:t xml:space="preserve"> </w:t>
+      </w:r>
+      <w:r>
+        <w:t xml:space="preserve">are the promotion-gated list.</w:t>
+      </w:r>
+    </w:p>
+    <w:p>
+      <w:pPr>
+        <w:pStyle w:val="BodyText"/>
+      </w:pPr>
+      <w:r>
+        <w:rPr>
+          <w:b/>
+          <w:bCs/>
+        </w:rPr>
+        <w:t xml:space="preserve">Check it yourself:</w:t>
+      </w:r>
+    </w:p>
+    <w:p>
+      <w:pPr>
+        <w:pStyle w:val="SourceCode"/>
+      </w:pPr>
+      <w:r>
+        <w:rPr>
+          <w:rStyle w:val="CommentTok"/>
+        </w:rPr>
+        <w:t xml:space="preserve"># on a laptop: run the triage by hand on the broken code, once for dev and once for prod</w:t>
+      </w:r>
+      <w:r>
+        <w:br/>
+      </w:r>
+      <w:r>
+        <w:rPr>
+          <w:rStyle w:val="ExtensionTok"/>
+        </w:rPr>
+        <w:t xml:space="preserve">.venv/bin/checkov</w:t>
+      </w:r>
+      <w:r>
+        <w:rPr>
+          <w:rStyle w:val="NormalTok"/>
+        </w:rPr>
+        <w:t xml:space="preserve"> </w:t>
+      </w:r>
+      <w:r>
+        <w:rPr>
+          <w:rStyle w:val="AttributeTok"/>
+        </w:rPr>
+        <w:t xml:space="preserve">-d</w:t>
+      </w:r>
+      <w:r>
+        <w:rPr>
+          <w:rStyle w:val="NormalTok"/>
+        </w:rPr>
+        <w:t xml:space="preserve"> terraform/insecure </w:t>
+      </w:r>
+      <w:r>
+        <w:rPr>
+          <w:rStyle w:val="AttributeTok"/>
+        </w:rPr>
+        <w:t xml:space="preserve">-o</w:t>
+      </w:r>
+      <w:r>
+        <w:rPr>
+          <w:rStyle w:val="NormalTok"/>
+        </w:rPr>
+        <w:t xml:space="preserve"> json </w:t>
+      </w:r>
+      <w:r>
+        <w:rPr>
+          <w:rStyle w:val="AttributeTok"/>
+        </w:rPr>
+        <w:t xml:space="preserve">--quiet</w:t>
+      </w:r>
+      <w:r>
+        <w:rPr>
+          <w:rStyle w:val="NormalTok"/>
+        </w:rPr>
+        <w:t xml:space="preserve"> </w:t>
+      </w:r>
+      <w:r>
+        <w:rPr>
+          <w:rStyle w:val="OperatorTok"/>
+        </w:rPr>
+        <w:t xml:space="preserve">&gt;</w:t>
+      </w:r>
+      <w:r>
+        <w:rPr>
+          <w:rStyle w:val="NormalTok"/>
+        </w:rPr>
+        <w:t xml:space="preserve"> .scan/insecure.json</w:t>
+      </w:r>
+      <w:r>
+        <w:br/>
+      </w:r>
+      <w:r>
+        <w:rPr>
+          <w:rStyle w:val="ExtensionTok"/>
+        </w:rPr>
+        <w:t xml:space="preserve">.venv/bin/python</w:t>
+      </w:r>
+      <w:r>
+        <w:rPr>
+          <w:rStyle w:val="NormalTok"/>
+        </w:rPr>
+        <w:t xml:space="preserve"> scripts/ai_triage.py </w:t>
+      </w:r>
+      <w:r>
+        <w:rPr>
+          <w:rStyle w:val="AttributeTok"/>
+        </w:rPr>
+        <w:t xml:space="preserve">--input</w:t>
+      </w:r>
+      <w:r>
+        <w:rPr>
+          <w:rStyle w:val="NormalTok"/>
+        </w:rPr>
+        <w:t xml:space="preserve"> .scan/insecure.json </w:t>
+      </w:r>
+      <w:r>
+        <w:rPr>
+          <w:rStyle w:val="AttributeTok"/>
+        </w:rPr>
+        <w:t xml:space="preserve">--environment</w:t>
+      </w:r>
+      <w:r>
+        <w:rPr>
+          <w:rStyle w:val="NormalTok"/>
+        </w:rPr>
+        <w:t xml:space="preserve"> dev</w:t>
+      </w:r>
+      <w:r>
+        <w:br/>
+      </w:r>
+      <w:r>
+        <w:rPr>
+          <w:rStyle w:val="CommentTok"/>
+        </w:rPr>
+        <w:t xml:space="preserve">#   blocking=10 advisory=5 other=9</w:t>
+      </w:r>
+      <w:r>
+        <w:br/>
+      </w:r>
+      <w:r>
+        <w:rPr>
+          <w:rStyle w:val="ExtensionTok"/>
+        </w:rPr>
+        <w:t xml:space="preserve">.venv/bin/python</w:t>
+      </w:r>
+      <w:r>
+        <w:rPr>
+          <w:rStyle w:val="NormalTok"/>
+        </w:rPr>
+        <w:t xml:space="preserve"> scripts/ai_triage.py </w:t>
+      </w:r>
+      <w:r>
+        <w:rPr>
+          <w:rStyle w:val="AttributeTok"/>
+        </w:rPr>
+        <w:t xml:space="preserve">--input</w:t>
+      </w:r>
+      <w:r>
+        <w:rPr>
+          <w:rStyle w:val="NormalTok"/>
+        </w:rPr>
+        <w:t xml:space="preserve"> .scan/insecure.json </w:t>
+      </w:r>
+      <w:r>
+        <w:rPr>
+          <w:rStyle w:val="AttributeTok"/>
+        </w:rPr>
+        <w:t xml:space="preserve">--environment</w:t>
+      </w:r>
+      <w:r>
+        <w:rPr>
+          <w:rStyle w:val="NormalTok"/>
+        </w:rPr>
+        <w:t xml:space="preserve"> prod</w:t>
+      </w:r>
+      <w:r>
+        <w:br/>
+      </w:r>
+      <w:r>
+        <w:rPr>
+          <w:rStyle w:val="CommentTok"/>
+        </w:rPr>
+        <w:t xml:space="preserve">#   blocking=14 advisory=5 other=5</w:t>
+      </w:r>
+      <w:r>
+        <w:br/>
+      </w:r>
+      <w:r>
+        <w:br/>
+      </w:r>
+      <w:r>
+        <w:rPr>
+          <w:rStyle w:val="CommentTok"/>
+        </w:rPr>
+        <w:t xml:space="preserve"># the three lists the decision comes from</w:t>
+      </w:r>
+      <w:r>
+        <w:br/>
+      </w:r>
+      <w:r>
+        <w:rPr>
+          <w:rStyle w:val="FunctionTok"/>
+        </w:rPr>
+        <w:t xml:space="preserve">grep</w:t>
+      </w:r>
+      <w:r>
+        <w:rPr>
+          <w:rStyle w:val="NormalTok"/>
+        </w:rPr>
+        <w:t xml:space="preserve"> </w:t>
+      </w:r>
+      <w:r>
+        <w:rPr>
+          <w:rStyle w:val="AttributeTok"/>
+        </w:rPr>
+        <w:t xml:space="preserve">-nE</w:t>
+      </w:r>
+      <w:r>
+        <w:rPr>
+          <w:rStyle w:val="NormalTok"/>
+        </w:rPr>
+        <w:t xml:space="preserve"> </w:t>
+      </w:r>
+      <w:r>
+        <w:rPr>
+          <w:rStyle w:val="StringTok"/>
+        </w:rPr>
+        <w:t xml:space="preserve">'^(BLOCKING|PROMOTION_GATED|ADVISORY)_POLICIES'</w:t>
+      </w:r>
+      <w:r>
+        <w:rPr>
+          <w:rStyle w:val="NormalTok"/>
+        </w:rPr>
+        <w:t xml:space="preserve"> scripts/ai_triage.py</w:t>
+      </w:r>
+      <w:r>
+        <w:br/>
+      </w:r>
+      <w:r>
+        <w:br/>
+      </w:r>
+      <w:r>
+        <w:rPr>
+          <w:rStyle w:val="CommentTok"/>
+        </w:rPr>
+        <w:t xml:space="preserve"># on GitHub: the comments the pipeline wrote on this pull request</w:t>
+      </w:r>
+      <w:r>
+        <w:br/>
+      </w:r>
+      <w:r>
+        <w:rPr>
+          <w:rStyle w:val="ExtensionTok"/>
+        </w:rPr>
+        <w:t xml:space="preserve">gh</w:t>
+      </w:r>
+      <w:r>
+        <w:rPr>
+          <w:rStyle w:val="NormalTok"/>
+        </w:rPr>
+        <w:t xml:space="preserve"> pr view 4 </w:t>
+      </w:r>
+      <w:r>
+        <w:rPr>
+          <w:rStyle w:val="AttributeTok"/>
+        </w:rPr>
+        <w:t xml:space="preserve">--comments</w:t>
+      </w:r>
+    </w:p>
+    <w:p>
+      <w:pPr>
+        <w:pStyle w:val="FirstParagraph"/>
+      </w:pPr>
+      <w:r>
+        <w:t xml:space="preserve">On the pull request page, scroll to the comments. Three, one per environment, each starting with</w:t>
+      </w:r>
+      <w:r>
+        <w:t xml:space="preserve"> </w:t>
+      </w:r>
+      <w:r>
+        <w:t xml:space="preserve">the environment name and the counts.</w:t>
       </w:r>
     </w:p>
     <w:bookmarkEnd w:id="21"/>
@@ -5782,7 +8175,7 @@
         <w:pStyle w:val="Compact"/>
         <w:numPr>
           <w:ilvl w:val="0"/>
-          <w:numId w:val="1004"/>
+          <w:numId w:val="1007"/>
         </w:numPr>
       </w:pPr>
       <w:r>
@@ -5810,7 +8203,7 @@
         <w:pStyle w:val="Compact"/>
         <w:numPr>
           <w:ilvl w:val="0"/>
-          <w:numId w:val="1004"/>
+          <w:numId w:val="1007"/>
         </w:numPr>
       </w:pPr>
       <w:r>
@@ -5838,7 +8231,7 @@
         <w:pStyle w:val="Compact"/>
         <w:numPr>
           <w:ilvl w:val="0"/>
-          <w:numId w:val="1004"/>
+          <w:numId w:val="1007"/>
         </w:numPr>
       </w:pPr>
       <w:r>
@@ -5866,7 +8259,7 @@
         <w:pStyle w:val="Compact"/>
         <w:numPr>
           <w:ilvl w:val="0"/>
-          <w:numId w:val="1004"/>
+          <w:numId w:val="1007"/>
         </w:numPr>
       </w:pPr>
       <w:r>
@@ -5888,7 +8281,7 @@
         <w:pStyle w:val="Compact"/>
         <w:numPr>
           <w:ilvl w:val="0"/>
-          <w:numId w:val="1004"/>
+          <w:numId w:val="1007"/>
         </w:numPr>
       </w:pPr>
       <w:r>
@@ -7931,7 +10324,7 @@
         <w:pStyle w:val="Compact"/>
         <w:numPr>
           <w:ilvl w:val="0"/>
-          <w:numId w:val="1005"/>
+          <w:numId w:val="1008"/>
         </w:numPr>
       </w:pPr>
       <w:r>
@@ -7959,7 +10352,7 @@
         <w:pStyle w:val="Compact"/>
         <w:numPr>
           <w:ilvl w:val="0"/>
-          <w:numId w:val="1005"/>
+          <w:numId w:val="1008"/>
         </w:numPr>
       </w:pPr>
       <w:r>
@@ -7999,7 +10392,7 @@
         <w:pStyle w:val="Compact"/>
         <w:numPr>
           <w:ilvl w:val="0"/>
-          <w:numId w:val="1005"/>
+          <w:numId w:val="1008"/>
         </w:numPr>
       </w:pPr>
       <w:r>
@@ -8036,7 +10429,7 @@
         <w:pStyle w:val="Compact"/>
         <w:numPr>
           <w:ilvl w:val="0"/>
-          <w:numId w:val="1005"/>
+          <w:numId w:val="1008"/>
         </w:numPr>
       </w:pPr>
       <w:r>
@@ -16351,6 +18744,42 @@
     </w:lvlOverride>
   </w:num>
   <w:num w:numId="1005">
+    <w:abstractNumId w:val="991"/>
+  </w:num>
+  <w:num w:numId="1006">
+    <w:abstractNumId w:val="991"/>
+  </w:num>
+  <w:num w:numId="1007">
+    <w:abstractNumId w:val="99411"/>
+    <w:lvlOverride w:ilvl="0">
+      <w:startOverride w:val="1"/>
+    </w:lvlOverride>
+    <w:lvlOverride w:ilvl="1">
+      <w:startOverride w:val="1"/>
+    </w:lvlOverride>
+    <w:lvlOverride w:ilvl="2">
+      <w:startOverride w:val="1"/>
+    </w:lvlOverride>
+    <w:lvlOverride w:ilvl="3">
+      <w:startOverride w:val="1"/>
+    </w:lvlOverride>
+    <w:lvlOverride w:ilvl="4">
+      <w:startOverride w:val="1"/>
+    </w:lvlOverride>
+    <w:lvlOverride w:ilvl="5">
+      <w:startOverride w:val="1"/>
+    </w:lvlOverride>
+    <w:lvlOverride w:ilvl="6">
+      <w:startOverride w:val="1"/>
+    </w:lvlOverride>
+    <w:lvlOverride w:ilvl="7">
+      <w:startOverride w:val="1"/>
+    </w:lvlOverride>
+    <w:lvlOverride w:ilvl="8">
+      <w:startOverride w:val="1"/>
+    </w:lvlOverride>
+  </w:num>
+  <w:num w:numId="1008">
     <w:abstractNumId w:val="99411"/>
     <w:lvlOverride w:ilvl="0">
       <w:startOverride w:val="1"/>

</xml_diff>

<commit_message>
Number every step in the handout's flow chart, and match the headings to it
Push and open-pull-request become separate steps, and the plan-time
policy check gets its own step, so the chart and the walkthrough both
run 1 to 19 with the same numbers.

Co-Authored-By: Claude Fable 5.1 <noreply@anthropic.com>
</commit_message>
<xml_diff>
--- a/docs/word/2-FOR-THE-PANEL.docx
+++ b/docs/word/2-FOR-THE-PANEL.docx
@@ -185,7 +185,7 @@
         <w:rPr>
           <w:rStyle w:val="VerbatimChar"/>
         </w:rPr>
-        <w:t xml:space="preserve">        I clone the repository</w:t>
+        <w:t xml:space="preserve">        1.  clone the repository</w:t>
       </w:r>
       <w:r>
         <w:br/>
@@ -203,7 +203,7 @@
         <w:rPr>
           <w:rStyle w:val="VerbatimChar"/>
         </w:rPr>
-        <w:t xml:space="preserve">        I make a branch</w:t>
+        <w:t xml:space="preserve">        2.  make a branch</w:t>
       </w:r>
       <w:r>
         <w:br/>
@@ -221,7 +221,7 @@
         <w:rPr>
           <w:rStyle w:val="VerbatimChar"/>
         </w:rPr>
-        <w:t xml:space="preserve">        I change one number</w:t>
+        <w:t xml:space="preserve">        3.  change one number</w:t>
       </w:r>
       <w:r>
         <w:br/>
@@ -239,7 +239,7 @@
         <w:rPr>
           <w:rStyle w:val="VerbatimChar"/>
         </w:rPr>
-        <w:t xml:space="preserve">        I commit  ------------&gt; a hook checks for passwords first</w:t>
+        <w:t xml:space="preserve">        4.  commit  ------------&gt; a hook checks for passwords first</w:t>
       </w:r>
       <w:r>
         <w:br/>
@@ -257,7 +257,7 @@
         <w:rPr>
           <w:rStyle w:val="VerbatimChar"/>
         </w:rPr>
-        <w:t xml:space="preserve">        I push</w:t>
+        <w:t xml:space="preserve">        5.  push</w:t>
       </w:r>
       <w:r>
         <w:br/>
@@ -275,7 +275,7 @@
         <w:rPr>
           <w:rStyle w:val="VerbatimChar"/>
         </w:rPr>
-        <w:t xml:space="preserve">        I open a pull request</w:t>
+        <w:t xml:space="preserve">        6.  open a pull request</w:t>
       </w:r>
       <w:r>
         <w:br/>
@@ -311,7 +311,7 @@
         <w:rPr>
           <w:rStyle w:val="VerbatimChar"/>
         </w:rPr>
-        <w:t xml:space="preserve"> gitleaks     Checkov      ai_triage.py</w:t>
+        <w:t xml:space="preserve"> 7. gitleaks  8. Checkov   9. ai_triage.py</w:t>
       </w:r>
       <w:r>
         <w:br/>
@@ -374,7 +374,7 @@
         <w:rPr>
           <w:rStyle w:val="VerbatimChar"/>
         </w:rPr>
-        <w:t xml:space="preserve">        anything blocking?  ---- yes ----&gt; STOPPED. fix it.</w:t>
+        <w:t xml:space="preserve">        10. anything blocking?  ---- yes ----&gt; STOPPED. fix it.</w:t>
       </w:r>
       <w:r>
         <w:br/>
@@ -410,7 +410,7 @@
         <w:rPr>
           <w:rStyle w:val="VerbatimChar"/>
         </w:rPr>
-        <w:t xml:space="preserve">        somebody approves it</w:t>
+        <w:t xml:space="preserve">        11. somebody approves it</w:t>
       </w:r>
       <w:r>
         <w:br/>
@@ -428,7 +428,7 @@
         <w:rPr>
           <w:rStyle w:val="VerbatimChar"/>
         </w:rPr>
-        <w:t xml:space="preserve">        I merge to main</w:t>
+        <w:t xml:space="preserve">        12. merge to main</w:t>
       </w:r>
       <w:r>
         <w:br/>
@@ -464,7 +464,7 @@
         <w:rPr>
           <w:rStyle w:val="VerbatimChar"/>
         </w:rPr>
-        <w:t xml:space="preserve">  DEV          STAGE         PROD</w:t>
+        <w:t xml:space="preserve"> 13. DEV      14. STAGE     15. PROD</w:t>
       </w:r>
       <w:r>
         <w:br/>
@@ -527,7 +527,7 @@
         <w:rPr>
           <w:rStyle w:val="VerbatimChar"/>
         </w:rPr>
-        <w:t xml:space="preserve">        policy_check.py checks the plan</w:t>
+        <w:t xml:space="preserve">        16. policy_check.py checks the plan</w:t>
       </w:r>
       <w:r>
         <w:br/>
@@ -536,7 +536,7 @@
         <w:rPr>
           <w:rStyle w:val="VerbatimChar"/>
         </w:rPr>
-        <w:t xml:space="preserve">        (unprivileged, boot, delete protection)</w:t>
+        <w:t xml:space="preserve">            (unprivileged, boot, delete protection)</w:t>
       </w:r>
       <w:r>
         <w:br/>
@@ -554,7 +554,7 @@
         <w:rPr>
           <w:rStyle w:val="VerbatimChar"/>
         </w:rPr>
-        <w:t xml:space="preserve">        terraform builds the server</w:t>
+        <w:t xml:space="preserve">        17. terraform builds the server</w:t>
       </w:r>
       <w:r>
         <w:br/>
@@ -572,7 +572,7 @@
         <w:rPr>
           <w:rStyle w:val="VerbatimChar"/>
         </w:rPr>
-        <w:t xml:space="preserve">        the deploy step installs</w:t>
+        <w:t xml:space="preserve">        18. the deploy step installs</w:t>
       </w:r>
       <w:r>
         <w:br/>
@@ -581,7 +581,7 @@
         <w:rPr>
           <w:rStyle w:val="VerbatimChar"/>
         </w:rPr>
-        <w:t xml:space="preserve">        the application on it</w:t>
+        <w:t xml:space="preserve">            the application on it</w:t>
       </w:r>
       <w:r>
         <w:br/>
@@ -599,7 +599,7 @@
         <w:rPr>
           <w:rStyle w:val="VerbatimChar"/>
         </w:rPr>
-        <w:t xml:space="preserve">        the new server answers</w:t>
+        <w:t xml:space="preserve">        19. the new server answers</w:t>
       </w:r>
     </w:p>
     <w:p>
@@ -610,7 +610,7 @@
       </w:r>
     </w:p>
     <w:bookmarkEnd w:id="13"/>
-    <w:bookmarkStart w:id="31" w:name="step-by-step"/>
+    <w:bookmarkStart w:id="33" w:name="step-by-step"/>
     <w:p>
       <w:pPr>
         <w:pStyle w:val="Heading1"/>
@@ -812,13 +812,13 @@
       </w:r>
     </w:p>
     <w:bookmarkEnd w:id="17"/>
-    <w:bookmarkStart w:id="18" w:name="Xb2239dd620267bd138a5d8bd184611edcb2dcbf"/>
+    <w:bookmarkStart w:id="18" w:name="X5083c27b1ea7a0b78fe8dbe99c102005e16b3e3"/>
     <w:p>
       <w:pPr>
         <w:pStyle w:val="Heading2"/>
       </w:pPr>
       <w:r>
-        <w:t xml:space="preserve">5. Push and open a pull request</w:t>
+        <w:t xml:space="preserve">5. Push</w:t>
       </w:r>
     </w:p>
     <w:p>
@@ -849,9 +849,29 @@
         </w:rPr>
         <w:t xml:space="preserve"> origin demo/TM-118-third-production-server</w:t>
       </w:r>
-      <w:r>
-        <w:br/>
-      </w:r>
+    </w:p>
+    <w:p>
+      <w:pPr>
+        <w:pStyle w:val="FirstParagraph"/>
+      </w:pPr>
+      <w:r>
+        <w:t xml:space="preserve">The branch now exists on GitHub. Nothing has run yet.</w:t>
+      </w:r>
+    </w:p>
+    <w:bookmarkEnd w:id="18"/>
+    <w:bookmarkStart w:id="19" w:name="X77f8570b148622fb94d7ddbc9bd19228383b675"/>
+    <w:p>
+      <w:pPr>
+        <w:pStyle w:val="Heading2"/>
+      </w:pPr>
+      <w:r>
+        <w:t xml:space="preserve">6. Open a pull request</w:t>
+      </w:r>
+    </w:p>
+    <w:p>
+      <w:pPr>
+        <w:pStyle w:val="SourceCode"/>
+      </w:pPr>
       <w:r>
         <w:rPr>
           <w:rStyle w:val="ExtensionTok"/>
@@ -885,14 +905,14 @@
         <w:t xml:space="preserve">This is what starts the pipeline.</w:t>
       </w:r>
     </w:p>
-    <w:bookmarkEnd w:id="18"/>
-    <w:bookmarkStart w:id="19" w:name="X3a1c53592068a8bca0b25861d1658b2c0524c14"/>
+    <w:bookmarkEnd w:id="19"/>
+    <w:bookmarkStart w:id="20" w:name="X0325ce6625a9f5984e5494c75d0113366fffcb3"/>
     <w:p>
       <w:pPr>
         <w:pStyle w:val="Heading2"/>
       </w:pPr>
       <w:r>
-        <w:t xml:space="preserve">6. The pipeline looks for passwords</w:t>
+        <w:t xml:space="preserve">7. The pipeline looks for passwords</w:t>
       </w:r>
     </w:p>
     <w:p>
@@ -1755,14 +1775,14 @@
         <w:t xml:space="preserve">.</w:t>
       </w:r>
     </w:p>
-    <w:bookmarkEnd w:id="19"/>
-    <w:bookmarkStart w:id="20" w:name="X434040f7587c8915e8b2a378ffef8faf8ae425e"/>
+    <w:bookmarkEnd w:id="20"/>
+    <w:bookmarkStart w:id="21" w:name="Xdada2d986679f6414e3faa04488df2400328f81"/>
     <w:p>
       <w:pPr>
         <w:pStyle w:val="Heading2"/>
       </w:pPr>
       <w:r>
-        <w:t xml:space="preserve">7. The pipeline checks the infrastructure code</w:t>
+        <w:t xml:space="preserve">8. The pipeline checks the infrastructure code</w:t>
       </w:r>
     </w:p>
     <w:p>
@@ -2854,14 +2874,14 @@
         <w:t xml:space="preserve">, and note the three categories.</w:t>
       </w:r>
     </w:p>
-    <w:bookmarkEnd w:id="20"/>
-    <w:bookmarkStart w:id="21" w:name="X246aa44bdd108e968a2db65af2bd4bc28f121de"/>
+    <w:bookmarkEnd w:id="21"/>
+    <w:bookmarkStart w:id="22" w:name="Xacf0b8ac54a6182a26fc1317c1a9dbb0b844d94"/>
     <w:p>
       <w:pPr>
         <w:pStyle w:val="Heading2"/>
       </w:pPr>
       <w:r>
-        <w:t xml:space="preserve">8. The pipeline writes a comment</w:t>
+        <w:t xml:space="preserve">9. The pipeline writes a comment</w:t>
       </w:r>
     </w:p>
     <w:p>
@@ -3557,14 +3577,14 @@
         <w:t xml:space="preserve">the environment name and the counts.</w:t>
       </w:r>
     </w:p>
-    <w:bookmarkEnd w:id="21"/>
-    <w:bookmarkStart w:id="22" w:name="X3720997c5b8ec3e4156ea428620a7a1831c3400"/>
+    <w:bookmarkEnd w:id="22"/>
+    <w:bookmarkStart w:id="23" w:name="Xa8023e9ab17e7369996fe7647413f1c892c9e34"/>
     <w:p>
       <w:pPr>
         <w:pStyle w:val="Heading2"/>
       </w:pPr>
       <w:r>
-        <w:t xml:space="preserve">9. The pull request is blocked</w:t>
+        <w:t xml:space="preserve">10. The pull request is blocked</w:t>
       </w:r>
     </w:p>
     <w:p>
@@ -3586,14 +3606,14 @@
         <w:t xml:space="preserve">BLOCKED - Review required</w:t>
       </w:r>
     </w:p>
-    <w:bookmarkEnd w:id="22"/>
-    <w:bookmarkStart w:id="23" w:name="X6895eeed2cfab68898ac5433a60c020075d2d73"/>
+    <w:bookmarkEnd w:id="23"/>
+    <w:bookmarkStart w:id="24" w:name="X35c389a0b18186b8c45f50d4f18a32e539eef46"/>
     <w:p>
       <w:pPr>
         <w:pStyle w:val="Heading2"/>
       </w:pPr>
       <w:r>
-        <w:t xml:space="preserve">10. Somebody approves it</w:t>
+        <w:t xml:space="preserve">11. Somebody approves it</w:t>
       </w:r>
     </w:p>
     <w:p>
@@ -3623,14 +3643,14 @@
         <w:t xml:space="preserve">Someone else has to look at it.</w:t>
       </w:r>
     </w:p>
-    <w:bookmarkEnd w:id="23"/>
-    <w:bookmarkStart w:id="24" w:name="X226b816a87dd0805d041af72f0f14b500bb1afe"/>
+    <w:bookmarkEnd w:id="24"/>
+    <w:bookmarkStart w:id="25" w:name="Xfa0b19af1e0e73087b1b787aba0b365b8ec2876"/>
     <w:p>
       <w:pPr>
         <w:pStyle w:val="Heading2"/>
       </w:pPr>
       <w:r>
-        <w:t xml:space="preserve">11. I merge</w:t>
+        <w:t xml:space="preserve">12. I merge</w:t>
       </w:r>
     </w:p>
     <w:p>
@@ -3641,14 +3661,14 @@
         <w:t xml:space="preserve">Merging is what allows a deployment. Nothing deploys before this.</w:t>
       </w:r>
     </w:p>
-    <w:bookmarkEnd w:id="24"/>
-    <w:bookmarkStart w:id="25" w:name="X98c1f673b1b1fdedeb130f4df412ffb19dc84de"/>
+    <w:bookmarkEnd w:id="25"/>
+    <w:bookmarkStart w:id="26" w:name="Xab5e7c038e0afeaa786954d1410ba65bf783007"/>
     <w:p>
       <w:pPr>
         <w:pStyle w:val="Heading2"/>
       </w:pPr>
       <w:r>
-        <w:t xml:space="preserve">12. Development deploys by itself</w:t>
+        <w:t xml:space="preserve">13. Development deploys by itself</w:t>
       </w:r>
     </w:p>
     <w:p>
@@ -3659,14 +3679,14 @@
         <w:t xml:space="preserve">No approval needed. It goes.</w:t>
       </w:r>
     </w:p>
-    <w:bookmarkEnd w:id="25"/>
-    <w:bookmarkStart w:id="26" w:name="Xd8b3bd1abf749d0d56e004598ae65d2ddb608e3"/>
+    <w:bookmarkEnd w:id="26"/>
+    <w:bookmarkStart w:id="27" w:name="Xbc13ac0d25d8f25c64205b3fbd1aab676c5ebe2"/>
     <w:p>
       <w:pPr>
         <w:pStyle w:val="Heading2"/>
       </w:pPr>
       <w:r>
-        <w:t xml:space="preserve">13. Staging waits</w:t>
+        <w:t xml:space="preserve">14. Staging waits</w:t>
       </w:r>
     </w:p>
     <w:p>
@@ -3690,14 +3710,14 @@
         <w:t xml:space="preserve">. Someone clicks approve.</w:t>
       </w:r>
     </w:p>
-    <w:bookmarkEnd w:id="26"/>
-    <w:bookmarkStart w:id="27" w:name="Xdafd0edb9bc90978a3cc8233c4853dcdced9018"/>
+    <w:bookmarkEnd w:id="27"/>
+    <w:bookmarkStart w:id="28" w:name="Xd61c7592e84a531008a5521af2a1b42da24897c"/>
     <w:p>
       <w:pPr>
         <w:pStyle w:val="Heading2"/>
       </w:pPr>
       <w:r>
-        <w:t xml:space="preserve">14. Production waits</w:t>
+        <w:t xml:space="preserve">15. Production waits</w:t>
       </w:r>
     </w:p>
     <w:p>
@@ -3708,14 +3728,14 @@
         <w:t xml:space="preserve">Same again. Someone clicks approve.</w:t>
       </w:r>
     </w:p>
-    <w:bookmarkEnd w:id="27"/>
-    <w:bookmarkStart w:id="28" w:name="X6a5cddc51b9f0fd214ecc1b2331acc2483af470"/>
+    <w:bookmarkEnd w:id="28"/>
+    <w:bookmarkStart w:id="29" w:name="X6fea68f5ccffa95f7dea3a1e4140334bbd6a2e7"/>
     <w:p>
       <w:pPr>
         <w:pStyle w:val="Heading2"/>
       </w:pPr>
       <w:r>
-        <w:t xml:space="preserve">15. Terraform builds a new server</w:t>
+        <w:t xml:space="preserve">16. The plan is checked before anything is built</w:t>
       </w:r>
     </w:p>
     <w:p>
@@ -3723,153 +3743,203 @@
         <w:pStyle w:val="FirstParagraph"/>
       </w:pPr>
       <w:r>
-        <w:t xml:space="preserve">The file said two production servers. It now says three. Terraform works out that one is missing and</w:t>
-      </w:r>
-      <w:r>
-        <w:t xml:space="preserve"> </w:t>
-      </w:r>
-      <w:r>
-        <w:t xml:space="preserve">creates it.</w:t>
-      </w:r>
-    </w:p>
-    <w:p>
-      <w:pPr>
-        <w:pStyle w:val="SourceCode"/>
-      </w:pPr>
+        <w:t xml:space="preserve">Checkov has no rules for Proxmox, so the deploy job runs its own check,</w:t>
+      </w:r>
+      <w:r>
+        <w:t xml:space="preserve"> </w:t>
+      </w:r>
       <w:r>
         <w:rPr>
           <w:rStyle w:val="VerbatimChar"/>
         </w:rPr>
-        <w:t xml:space="preserve">proxmox_virtual_environment_container.app[2]: Creation complete</w:t>
-      </w:r>
-    </w:p>
-    <w:p>
-      <w:pPr>
-        <w:pStyle w:val="FirstParagraph"/>
-      </w:pPr>
-      <w:r>
-        <w:t xml:space="preserve">That machine is empty. Terraform talks to the Proxmox API to build machines. It never logs into</w:t>
-      </w:r>
-      <w:r>
-        <w:t xml:space="preserve"> </w:t>
-      </w:r>
-      <w:r>
-        <w:t xml:space="preserve">them.</w:t>
-      </w:r>
-    </w:p>
-    <w:bookmarkEnd w:id="28"/>
-    <w:bookmarkStart w:id="29" w:name="X9595343c81c3eea2f3d4fbbadcee1afb7eb1797"/>
-    <w:p>
-      <w:pPr>
-        <w:pStyle w:val="Heading2"/>
-      </w:pPr>
-      <w:r>
-        <w:t xml:space="preserve">16. The deploy step installs the application</w:t>
-      </w:r>
-    </w:p>
-    <w:p>
-      <w:pPr>
-        <w:pStyle w:val="SourceCode"/>
-      </w:pPr>
-      <w:r>
-        <w:rPr>
-          <w:rStyle w:val="ExtensionTok"/>
-        </w:rPr>
-        <w:t xml:space="preserve">/root/install-app.sh</w:t>
-      </w:r>
-      <w:r>
-        <w:rPr>
-          <w:rStyle w:val="NormalTok"/>
-        </w:rPr>
-        <w:t xml:space="preserve"> prod</w:t>
-      </w:r>
-    </w:p>
-    <w:p>
-      <w:pPr>
-        <w:pStyle w:val="SourceCode"/>
-      </w:pPr>
-      <w:r>
-        <w:rPr>
-          <w:rStyle w:val="VerbatimChar"/>
-        </w:rPr>
-        <w:t xml:space="preserve">environment=prod  version=1.1.0  containers=3</w:t>
-      </w:r>
-      <w:r>
-        <w:br/>
-      </w:r>
-      <w:r>
-        <w:rPr>
-          <w:rStyle w:val="VerbatimChar"/>
-        </w:rPr>
-        <w:t xml:space="preserve">  app-prod-1 (321)  already serving 1.1.0  - skipped</w:t>
-      </w:r>
-      <w:r>
-        <w:br/>
-      </w:r>
-      <w:r>
-        <w:rPr>
-          <w:rStyle w:val="VerbatimChar"/>
-        </w:rPr>
-        <w:t xml:space="preserve">  app-prod-2 (322)  already serving 1.1.0  - skipped</w:t>
-      </w:r>
-      <w:r>
-        <w:br/>
-      </w:r>
-      <w:r>
-        <w:rPr>
-          <w:rStyle w:val="VerbatimChar"/>
-        </w:rPr>
-        <w:t xml:space="preserve">  app-prod-3 (323)  installing 1.1.0 ...</w:t>
-      </w:r>
-      <w:r>
-        <w:br/>
-      </w:r>
-      <w:r>
-        <w:rPr>
-          <w:rStyle w:val="VerbatimChar"/>
-        </w:rPr>
-        <w:t xml:space="preserve">    app-prod-3 serving {"version": "1.1.0"}</w:t>
-      </w:r>
-      <w:r>
-        <w:br/>
-      </w:r>
-      <w:r>
-        <w:rPr>
-          <w:rStyle w:val="VerbatimChar"/>
-        </w:rPr>
-        <w:t xml:space="preserve">done</w:t>
-      </w:r>
-    </w:p>
-    <w:p>
-      <w:pPr>
-        <w:pStyle w:val="FirstParagraph"/>
-      </w:pPr>
-      <w:r>
-        <w:t xml:space="preserve">Two things worth noticing.</w:t>
-      </w:r>
-    </w:p>
-    <w:p>
-      <w:pPr>
-        <w:pStyle w:val="BodyText"/>
-      </w:pPr>
+        <w:t xml:space="preserve">scripts/policy_check.py</w:t>
+      </w:r>
+      <w:r>
+        <w:t xml:space="preserve">,</w:t>
+      </w:r>
+      <w:r>
+        <w:t xml:space="preserve"> </w:t>
+      </w:r>
+      <w:r>
+        <w:t xml:space="preserve">against the Terraform</w:t>
+      </w:r>
+      <w:r>
+        <w:t xml:space="preserve"> </w:t>
+      </w:r>
       <w:r>
         <w:rPr>
           <w:b/>
           <w:bCs/>
         </w:rPr>
-        <w:t xml:space="preserve">It skipped the servers that were already working.</w:t>
-      </w:r>
-      <w:r>
-        <w:t xml:space="preserve"> </w:t>
-      </w:r>
-      <w:r>
-        <w:t xml:space="preserve">It asks each one what it is serving before it</w:t>
-      </w:r>
-      <w:r>
-        <w:t xml:space="preserve"> </w:t>
-      </w:r>
-      <w:r>
-        <w:t xml:space="preserve">touches anything, so running it twice changes nothing.</w:t>
+        <w:t xml:space="preserve">plan</w:t>
+      </w:r>
+      <w:r>
+        <w:t xml:space="preserve"> </w:t>
+      </w:r>
+      <w:r>
+        <w:t xml:space="preserve">- what will actually be created, with every variable resolved.</w:t>
+      </w:r>
+    </w:p>
+    <w:p>
+      <w:pPr>
+        <w:pStyle w:val="BodyText"/>
+      </w:pPr>
+      <w:r>
+        <w:t xml:space="preserve">Three rules. Unprivileged. Restarts after a reboot. Cannot be deleted by accident. Production must</w:t>
+      </w:r>
+      <w:r>
+        <w:t xml:space="preserve"> </w:t>
+      </w:r>
+      <w:r>
+        <w:t xml:space="preserve">pass all three; development is allowed to skip the last two.</w:t>
+      </w:r>
+    </w:p>
+    <w:p>
+      <w:pPr>
+        <w:pStyle w:val="BodyText"/>
+      </w:pPr>
+      <w:r>
+        <w:t xml:space="preserve">If it fails, nothing is built.</w:t>
+      </w:r>
+    </w:p>
+    <w:bookmarkEnd w:id="29"/>
+    <w:bookmarkStart w:id="30" w:name="Xadb658f8bd148e9f82f60d0a0dd225dc5fae0be"/>
+    <w:p>
+      <w:pPr>
+        <w:pStyle w:val="Heading2"/>
+      </w:pPr>
+      <w:r>
+        <w:t xml:space="preserve">17. Terraform builds a new server</w:t>
+      </w:r>
+    </w:p>
+    <w:p>
+      <w:pPr>
+        <w:pStyle w:val="FirstParagraph"/>
+      </w:pPr>
+      <w:r>
+        <w:t xml:space="preserve">The file said two production servers. It now says three. Terraform works out that one is missing and</w:t>
+      </w:r>
+      <w:r>
+        <w:t xml:space="preserve"> </w:t>
+      </w:r>
+      <w:r>
+        <w:t xml:space="preserve">creates it.</w:t>
+      </w:r>
+    </w:p>
+    <w:p>
+      <w:pPr>
+        <w:pStyle w:val="SourceCode"/>
+      </w:pPr>
+      <w:r>
+        <w:rPr>
+          <w:rStyle w:val="VerbatimChar"/>
+        </w:rPr>
+        <w:t xml:space="preserve">proxmox_virtual_environment_container.app[2]: Creation complete</w:t>
+      </w:r>
+    </w:p>
+    <w:p>
+      <w:pPr>
+        <w:pStyle w:val="FirstParagraph"/>
+      </w:pPr>
+      <w:r>
+        <w:t xml:space="preserve">That machine is empty. Terraform talks to the Proxmox API to build machines. It never logs into</w:t>
+      </w:r>
+      <w:r>
+        <w:t xml:space="preserve"> </w:t>
+      </w:r>
+      <w:r>
+        <w:t xml:space="preserve">them.</w:t>
+      </w:r>
+    </w:p>
+    <w:bookmarkEnd w:id="30"/>
+    <w:bookmarkStart w:id="31" w:name="Xa2df3e38868610a2b23b36cf92b8ec26ad42fc4"/>
+    <w:p>
+      <w:pPr>
+        <w:pStyle w:val="Heading2"/>
+      </w:pPr>
+      <w:r>
+        <w:t xml:space="preserve">18. The deploy step installs the application</w:t>
+      </w:r>
+    </w:p>
+    <w:p>
+      <w:pPr>
+        <w:pStyle w:val="SourceCode"/>
+      </w:pPr>
+      <w:r>
+        <w:rPr>
+          <w:rStyle w:val="ExtensionTok"/>
+        </w:rPr>
+        <w:t xml:space="preserve">/root/install-app.sh</w:t>
+      </w:r>
+      <w:r>
+        <w:rPr>
+          <w:rStyle w:val="NormalTok"/>
+        </w:rPr>
+        <w:t xml:space="preserve"> prod</w:t>
+      </w:r>
+    </w:p>
+    <w:p>
+      <w:pPr>
+        <w:pStyle w:val="SourceCode"/>
+      </w:pPr>
+      <w:r>
+        <w:rPr>
+          <w:rStyle w:val="VerbatimChar"/>
+        </w:rPr>
+        <w:t xml:space="preserve">environment=prod  version=1.1.0  containers=3</w:t>
+      </w:r>
+      <w:r>
+        <w:br/>
+      </w:r>
+      <w:r>
+        <w:rPr>
+          <w:rStyle w:val="VerbatimChar"/>
+        </w:rPr>
+        <w:t xml:space="preserve">  app-prod-1 (321)  already serving 1.1.0  - skipped</w:t>
+      </w:r>
+      <w:r>
+        <w:br/>
+      </w:r>
+      <w:r>
+        <w:rPr>
+          <w:rStyle w:val="VerbatimChar"/>
+        </w:rPr>
+        <w:t xml:space="preserve">  app-prod-2 (322)  already serving 1.1.0  - skipped</w:t>
+      </w:r>
+      <w:r>
+        <w:br/>
+      </w:r>
+      <w:r>
+        <w:rPr>
+          <w:rStyle w:val="VerbatimChar"/>
+        </w:rPr>
+        <w:t xml:space="preserve">  app-prod-3 (323)  installing 1.1.0 ...</w:t>
+      </w:r>
+      <w:r>
+        <w:br/>
+      </w:r>
+      <w:r>
+        <w:rPr>
+          <w:rStyle w:val="VerbatimChar"/>
+        </w:rPr>
+        <w:t xml:space="preserve">    app-prod-3 serving {"version": "1.1.0"}</w:t>
+      </w:r>
+      <w:r>
+        <w:br/>
+      </w:r>
+      <w:r>
+        <w:rPr>
+          <w:rStyle w:val="VerbatimChar"/>
+        </w:rPr>
+        <w:t xml:space="preserve">done</w:t>
+      </w:r>
+    </w:p>
+    <w:p>
+      <w:pPr>
+        <w:pStyle w:val="FirstParagraph"/>
+      </w:pPr>
+      <w:r>
+        <w:t xml:space="preserve">Two things worth noticing.</w:t>
       </w:r>
     </w:p>
     <w:p>
@@ -3881,6 +3951,30 @@
           <w:b/>
           <w:bCs/>
         </w:rPr>
+        <w:t xml:space="preserve">It skipped the servers that were already working.</w:t>
+      </w:r>
+      <w:r>
+        <w:t xml:space="preserve"> </w:t>
+      </w:r>
+      <w:r>
+        <w:t xml:space="preserve">It asks each one what it is serving before it</w:t>
+      </w:r>
+      <w:r>
+        <w:t xml:space="preserve"> </w:t>
+      </w:r>
+      <w:r>
+        <w:t xml:space="preserve">touches anything, so running it twice changes nothing.</w:t>
+      </w:r>
+    </w:p>
+    <w:p>
+      <w:pPr>
+        <w:pStyle w:val="BodyText"/>
+      </w:pPr>
+      <w:r>
+        <w:rPr>
+          <w:b/>
+          <w:bCs/>
+        </w:rPr>
         <w:t xml:space="preserve">It waits for the health check.</w:t>
       </w:r>
       <w:r>
@@ -3974,14 +4068,14 @@
         <w:t xml:space="preserve">is a symlink move and not a redeploy.</w:t>
       </w:r>
     </w:p>
-    <w:bookmarkEnd w:id="29"/>
-    <w:bookmarkStart w:id="30" w:name="X563e576249d538165f6cbf9ad1f2af3ec21d786"/>
+    <w:bookmarkEnd w:id="31"/>
+    <w:bookmarkStart w:id="32" w:name="X8e40f9fdb292dc775cee4ce791a016fffe969c6"/>
     <w:p>
       <w:pPr>
         <w:pStyle w:val="Heading2"/>
       </w:pPr>
       <w:r>
-        <w:t xml:space="preserve">17. The new server answers</w:t>
+        <w:t xml:space="preserve">19. The new server answers</w:t>
       </w:r>
     </w:p>
     <w:p>
@@ -4186,9 +4280,9 @@
         </w:pict>
       </w:r>
     </w:p>
-    <w:bookmarkEnd w:id="30"/>
-    <w:bookmarkEnd w:id="31"/>
-    <w:bookmarkStart w:id="32" w:name="the-tools-in-one-line-each"/>
+    <w:bookmarkEnd w:id="32"/>
+    <w:bookmarkEnd w:id="33"/>
+    <w:bookmarkStart w:id="34" w:name="the-tools-in-one-line-each"/>
     <w:p>
       <w:pPr>
         <w:pStyle w:val="Heading1"/>
@@ -4356,8 +4450,8 @@
         </w:pict>
       </w:r>
     </w:p>
-    <w:bookmarkEnd w:id="32"/>
-    <w:bookmarkStart w:id="43" w:name="the-four-machines-that-are-the-pipeline"/>
+    <w:bookmarkEnd w:id="34"/>
+    <w:bookmarkStart w:id="45" w:name="the-four-machines-that-are-the-pipeline"/>
     <w:p>
       <w:pPr>
         <w:pStyle w:val="Heading1"/>
@@ -4459,7 +4553,7 @@
         <w:t xml:space="preserve">it runs.</w:t>
       </w:r>
     </w:p>
-    <w:bookmarkStart w:id="33" w:name="why-they-exist-at-all"/>
+    <w:bookmarkStart w:id="35" w:name="why-they-exist-at-all"/>
     <w:p>
       <w:pPr>
         <w:pStyle w:val="Heading2"/>
@@ -4540,8 +4634,8 @@
         <w:t xml:space="preserve">rule, no port forward, and no public address.</w:t>
       </w:r>
     </w:p>
-    <w:bookmarkEnd w:id="33"/>
-    <w:bookmarkStart w:id="34" w:name="how-a-job-finds-the-right-machine"/>
+    <w:bookmarkEnd w:id="35"/>
+    <w:bookmarkStart w:id="36" w:name="how-a-job-finds-the-right-machine"/>
     <w:p>
       <w:pPr>
         <w:pStyle w:val="Heading2"/>
@@ -4708,8 +4802,8 @@
         <w:t xml:space="preserve">That single line is the isolation boundary.</w:t>
       </w:r>
     </w:p>
-    <w:bookmarkEnd w:id="34"/>
-    <w:bookmarkStart w:id="35" w:name="Xce032e7bdd74e7f75f9f279870a0b084aed8585"/>
+    <w:bookmarkEnd w:id="36"/>
+    <w:bookmarkStart w:id="37" w:name="Xce032e7bdd74e7f75f9f279870a0b084aed8585"/>
     <w:p>
       <w:pPr>
         <w:pStyle w:val="Heading2"/>
@@ -4930,8 +5024,8 @@
         <w:t xml:space="preserve">applied to a job, not just to a user.</w:t>
       </w:r>
     </w:p>
-    <w:bookmarkEnd w:id="35"/>
-    <w:bookmarkStart w:id="36" w:name="X2d7fefc3a9227cfd2fc2d0d556bca1c636b9d69"/>
+    <w:bookmarkEnd w:id="37"/>
+    <w:bookmarkStart w:id="38" w:name="X2d7fefc3a9227cfd2fc2d0d556bca1c636b9d69"/>
     <w:p>
       <w:pPr>
         <w:pStyle w:val="Heading2"/>
@@ -5109,8 +5203,8 @@
         </w:tc>
       </w:tr>
     </w:tbl>
-    <w:bookmarkEnd w:id="36"/>
-    <w:bookmarkStart w:id="37" w:name="X0a431901545a32445980e74bfe0c6c373f6b4ce"/>
+    <w:bookmarkEnd w:id="38"/>
+    <w:bookmarkStart w:id="39" w:name="X0a431901545a32445980e74bfe0c6c373f6b4ce"/>
     <w:p>
       <w:pPr>
         <w:pStyle w:val="Heading2"/>
@@ -5288,8 +5382,8 @@
         </w:tc>
       </w:tr>
     </w:tbl>
-    <w:bookmarkEnd w:id="37"/>
-    <w:bookmarkStart w:id="38" w:name="X99ddad062f8f6246de8fca161e24798e3b7ac19"/>
+    <w:bookmarkEnd w:id="39"/>
+    <w:bookmarkStart w:id="40" w:name="X99ddad062f8f6246de8fca161e24798e3b7ac19"/>
     <w:p>
       <w:pPr>
         <w:pStyle w:val="Heading2"/>
@@ -5654,8 +5748,8 @@
         <w:t xml:space="preserve">address is checked before the password is.</w:t>
       </w:r>
     </w:p>
-    <w:bookmarkEnd w:id="38"/>
-    <w:bookmarkStart w:id="39" w:name="how-they-map-onto-the-workflow"/>
+    <w:bookmarkEnd w:id="40"/>
+    <w:bookmarkStart w:id="41" w:name="how-they-map-onto-the-workflow"/>
     <w:p>
       <w:pPr>
         <w:pStyle w:val="Heading2"/>
@@ -6098,8 +6192,8 @@
         </w:tc>
       </w:tr>
     </w:tbl>
-    <w:bookmarkEnd w:id="39"/>
-    <w:bookmarkStart w:id="40" w:name="why-three-runners-rather-than-one"/>
+    <w:bookmarkEnd w:id="41"/>
+    <w:bookmarkStart w:id="42" w:name="why-three-runners-rather-than-one"/>
     <w:p>
       <w:pPr>
         <w:pStyle w:val="Heading2"/>
@@ -6141,8 +6235,8 @@
         <w:t xml:space="preserve">rather than by writing a policy asking people not to do it.</w:t>
       </w:r>
     </w:p>
-    <w:bookmarkEnd w:id="40"/>
-    <w:bookmarkStart w:id="41" w:name="what-the-runners-deliberately-cannot-do"/>
+    <w:bookmarkEnd w:id="42"/>
+    <w:bookmarkStart w:id="43" w:name="what-the-runners-deliberately-cannot-do"/>
     <w:p>
       <w:pPr>
         <w:pStyle w:val="Heading2"/>
@@ -6254,8 +6348,8 @@
         <w:t xml:space="preserve">redeploying the application is not rebuilding a server.</w:t>
       </w:r>
     </w:p>
-    <w:bookmarkEnd w:id="41"/>
-    <w:bookmarkStart w:id="42" w:name="what-breaks-if-you-collapse-them"/>
+    <w:bookmarkEnd w:id="43"/>
+    <w:bookmarkStart w:id="44" w:name="what-breaks-if-you-collapse-them"/>
     <w:p>
       <w:pPr>
         <w:pStyle w:val="Heading2"/>
@@ -6443,9 +6537,9 @@
         </w:pict>
       </w:r>
     </w:p>
-    <w:bookmarkEnd w:id="42"/>
-    <w:bookmarkEnd w:id="43"/>
-    <w:bookmarkStart w:id="65" w:name="Xb2ad940bab32a8c4cd36033371e8a3d7f858977"/>
+    <w:bookmarkEnd w:id="44"/>
+    <w:bookmarkEnd w:id="45"/>
+    <w:bookmarkStart w:id="67" w:name="Xb2ad940bab32a8c4cd36033371e8a3d7f858977"/>
     <w:p>
       <w:pPr>
         <w:pStyle w:val="Heading1"/>
@@ -6468,7 +6562,7 @@
         <w:t xml:space="preserve">wants to read the configuration rather than take my word for it.</w:t>
       </w:r>
     </w:p>
-    <w:bookmarkStart w:id="47" w:name="the-workflow-file"/>
+    <w:bookmarkStart w:id="49" w:name="the-workflow-file"/>
     <w:p>
       <w:pPr>
         <w:pStyle w:val="Heading2"/>
@@ -6497,7 +6591,7 @@
         <w:t xml:space="preserve">. Three jobs.</w:t>
       </w:r>
     </w:p>
-    <w:bookmarkStart w:id="44" w:name="when-it-runs"/>
+    <w:bookmarkStart w:id="46" w:name="when-it-runs"/>
     <w:p>
       <w:pPr>
         <w:pStyle w:val="Heading3"/>
@@ -7258,8 +7352,8 @@
         </w:tc>
       </w:tr>
     </w:tbl>
-    <w:bookmarkEnd w:id="44"/>
-    <w:bookmarkStart w:id="45" w:name="two-settings-at-the-top-that-matter"/>
+    <w:bookmarkEnd w:id="46"/>
+    <w:bookmarkStart w:id="47" w:name="two-settings-at-the-top-that-matter"/>
     <w:p>
       <w:pPr>
         <w:pStyle w:val="Heading3"/>
@@ -7466,8 +7560,8 @@
         <w:t xml:space="preserve">Two applies from the same branch cannot race each other.</w:t>
       </w:r>
     </w:p>
-    <w:bookmarkEnd w:id="45"/>
-    <w:bookmarkStart w:id="46" w:name="where-each-tool-is-called"/>
+    <w:bookmarkEnd w:id="47"/>
+    <w:bookmarkStart w:id="48" w:name="where-each-tool-is-called"/>
     <w:p>
       <w:pPr>
         <w:pStyle w:val="Heading3"/>
@@ -8077,9 +8171,9 @@
         </w:pict>
       </w:r>
     </w:p>
-    <w:bookmarkEnd w:id="46"/>
-    <w:bookmarkEnd w:id="47"/>
-    <w:bookmarkStart w:id="54" w:name="gitleaks"/>
+    <w:bookmarkEnd w:id="48"/>
+    <w:bookmarkEnd w:id="49"/>
+    <w:bookmarkStart w:id="56" w:name="gitleaks"/>
     <w:p>
       <w:pPr>
         <w:pStyle w:val="Heading2"/>
@@ -8088,7 +8182,7 @@
         <w:t xml:space="preserve">gitleaks</w:t>
       </w:r>
     </w:p>
-    <w:bookmarkStart w:id="48" w:name="what-it-is"/>
+    <w:bookmarkStart w:id="50" w:name="what-it-is"/>
     <w:p>
       <w:pPr>
         <w:pStyle w:val="Heading3"/>
@@ -8117,8 +8211,8 @@
         <w:t xml:space="preserve">strings.</w:t>
       </w:r>
     </w:p>
-    <w:bookmarkEnd w:id="48"/>
-    <w:bookmarkStart w:id="49" w:name="what-problem-it-solves"/>
+    <w:bookmarkEnd w:id="50"/>
+    <w:bookmarkStart w:id="51" w:name="what-problem-it-solves"/>
     <w:p>
       <w:pPr>
         <w:pStyle w:val="Heading3"/>
@@ -8160,8 +8254,8 @@
         <w:t xml:space="preserve">why nothing else runs if it fails.</w:t>
       </w:r>
     </w:p>
-    <w:bookmarkEnd w:id="49"/>
-    <w:bookmarkStart w:id="50" w:name="how-it-works"/>
+    <w:bookmarkEnd w:id="51"/>
+    <w:bookmarkStart w:id="52" w:name="how-it-works"/>
     <w:p>
       <w:pPr>
         <w:pStyle w:val="Heading3"/>
@@ -8295,8 +8389,8 @@
         <w:t xml:space="preserve">, which GitHub renders in the Security tab as annotated findings.</w:t>
       </w:r>
     </w:p>
-    <w:bookmarkEnd w:id="50"/>
-    <w:bookmarkStart w:id="51" w:name="features-and-functions"/>
+    <w:bookmarkEnd w:id="52"/>
+    <w:bookmarkStart w:id="53" w:name="features-and-functions"/>
     <w:p>
       <w:pPr>
         <w:pStyle w:val="Heading3"/>
@@ -8568,8 +8662,8 @@
         </w:tc>
       </w:tr>
     </w:tbl>
-    <w:bookmarkEnd w:id="51"/>
-    <w:bookmarkStart w:id="52" w:name="how-it-is-configured"/>
+    <w:bookmarkEnd w:id="53"/>
+    <w:bookmarkStart w:id="54" w:name="how-it-is-configured"/>
     <w:p>
       <w:pPr>
         <w:pStyle w:val="Heading3"/>
@@ -9619,8 +9713,8 @@
         </w:tc>
       </w:tr>
     </w:tbl>
-    <w:bookmarkEnd w:id="52"/>
-    <w:bookmarkStart w:id="53" w:name="how-the-pipeline-calls-it"/>
+    <w:bookmarkEnd w:id="54"/>
+    <w:bookmarkStart w:id="55" w:name="how-the-pipeline-calls-it"/>
     <w:p>
       <w:pPr>
         <w:pStyle w:val="Heading3"/>
@@ -10236,9 +10330,9 @@
         </w:pict>
       </w:r>
     </w:p>
-    <w:bookmarkEnd w:id="53"/>
-    <w:bookmarkEnd w:id="54"/>
-    <w:bookmarkStart w:id="60" w:name="checkov"/>
+    <w:bookmarkEnd w:id="55"/>
+    <w:bookmarkEnd w:id="56"/>
+    <w:bookmarkStart w:id="62" w:name="checkov"/>
     <w:p>
       <w:pPr>
         <w:pStyle w:val="Heading2"/>
@@ -10247,7 +10341,7 @@
         <w:t xml:space="preserve">Checkov</w:t>
       </w:r>
     </w:p>
-    <w:bookmarkStart w:id="55" w:name="what-it-is-1"/>
+    <w:bookmarkStart w:id="57" w:name="what-it-is-1"/>
     <w:p>
       <w:pPr>
         <w:pStyle w:val="Heading3"/>
@@ -10270,8 +10364,8 @@
         <w:t xml:space="preserve">manifests, Dockerfiles and more, and checks them against a library of policies about unsafe settings.</w:t>
       </w:r>
     </w:p>
-    <w:bookmarkEnd w:id="55"/>
-    <w:bookmarkStart w:id="56" w:name="what-problem-it-solves-1"/>
+    <w:bookmarkEnd w:id="57"/>
+    <w:bookmarkStart w:id="58" w:name="what-problem-it-solves-1"/>
     <w:p>
       <w:pPr>
         <w:pStyle w:val="Heading3"/>
@@ -10309,8 +10403,8 @@
         <w:t xml:space="preserve">passes. Checkov is the thing that reads intent rather than syntax.</w:t>
       </w:r>
     </w:p>
-    <w:bookmarkEnd w:id="56"/>
-    <w:bookmarkStart w:id="57" w:name="how-it-works-1"/>
+    <w:bookmarkEnd w:id="58"/>
+    <w:bookmarkStart w:id="59" w:name="how-it-works-1"/>
     <w:p>
       <w:pPr>
         <w:pStyle w:val="Heading3"/>
@@ -10446,8 +10540,8 @@
         <w:t xml:space="preserve">in JSON, SARIF, CLI, JUnit and more.</w:t>
       </w:r>
     </w:p>
-    <w:bookmarkEnd w:id="57"/>
-    <w:bookmarkStart w:id="58" w:name="features-and-functions-1"/>
+    <w:bookmarkEnd w:id="59"/>
+    <w:bookmarkStart w:id="60" w:name="features-and-functions-1"/>
     <w:p>
       <w:pPr>
         <w:pStyle w:val="Heading3"/>
@@ -10693,8 +10787,8 @@
         </w:tc>
       </w:tr>
     </w:tbl>
-    <w:bookmarkEnd w:id="58"/>
-    <w:bookmarkStart w:id="59" w:name="how-the-pipeline-calls-it-1"/>
+    <w:bookmarkEnd w:id="60"/>
+    <w:bookmarkStart w:id="61" w:name="how-the-pipeline-calls-it-1"/>
     <w:p>
       <w:pPr>
         <w:pStyle w:val="Heading3"/>
@@ -10977,9 +11071,9 @@
         </w:pict>
       </w:r>
     </w:p>
-    <w:bookmarkEnd w:id="59"/>
-    <w:bookmarkEnd w:id="60"/>
-    <w:bookmarkStart w:id="61" w:name="gitleaks-versus-checkov"/>
+    <w:bookmarkEnd w:id="61"/>
+    <w:bookmarkEnd w:id="62"/>
+    <w:bookmarkStart w:id="63" w:name="gitleaks-versus-checkov"/>
     <w:p>
       <w:pPr>
         <w:pStyle w:val="Heading2"/>
@@ -11629,8 +11723,8 @@
         </w:pict>
       </w:r>
     </w:p>
-    <w:bookmarkEnd w:id="61"/>
-    <w:bookmarkStart w:id="62" w:name="why-a-scanner-is-not-a-gate-ai_triagepy"/>
+    <w:bookmarkEnd w:id="63"/>
+    <w:bookmarkStart w:id="64" w:name="why-a-scanner-is-not-a-gate-ai_triagepy"/>
     <w:p>
       <w:pPr>
         <w:pStyle w:val="Heading2"/>
@@ -12709,8 +12803,8 @@
         </w:pict>
       </w:r>
     </w:p>
-    <w:bookmarkEnd w:id="62"/>
-    <w:bookmarkStart w:id="63" w:name="the-proxmox-gap-policy_checkpy"/>
+    <w:bookmarkEnd w:id="64"/>
+    <w:bookmarkStart w:id="65" w:name="the-proxmox-gap-policy_checkpy"/>
     <w:p>
       <w:pPr>
         <w:pStyle w:val="Heading2"/>
@@ -13320,8 +13414,8 @@
         </w:pict>
       </w:r>
     </w:p>
-    <w:bookmarkEnd w:id="63"/>
-    <w:bookmarkStart w:id="64" w:name="the-same-checks-run-in-three-places"/>
+    <w:bookmarkEnd w:id="65"/>
+    <w:bookmarkStart w:id="66" w:name="the-same-checks-run-in-three-places"/>
     <w:p>
       <w:pPr>
         <w:pStyle w:val="Heading2"/>
@@ -13980,9 +14074,9 @@
         </w:pict>
       </w:r>
     </w:p>
-    <w:bookmarkEnd w:id="64"/>
-    <w:bookmarkEnd w:id="65"/>
-    <w:bookmarkStart w:id="73" w:name="X232c47462d1e03c594c3f417b0697d6a076e723"/>
+    <w:bookmarkEnd w:id="66"/>
+    <w:bookmarkEnd w:id="67"/>
+    <w:bookmarkStart w:id="75" w:name="X232c47462d1e03c594c3f417b0697d6a076e723"/>
     <w:p>
       <w:pPr>
         <w:pStyle w:val="Heading1"/>
@@ -14032,7 +14126,7 @@
         <w:t xml:space="preserve">.</w:t>
       </w:r>
     </w:p>
-    <w:bookmarkStart w:id="66" w:name="Xf3ee9533f0cc6a7bf1f63c6463aa31ddb4ac3f4"/>
+    <w:bookmarkStart w:id="68" w:name="Xf3ee9533f0cc6a7bf1f63c6463aa31ddb4ac3f4"/>
     <w:p>
       <w:pPr>
         <w:pStyle w:val="Heading2"/>
@@ -14557,8 +14651,8 @@
         </w:tc>
       </w:tr>
     </w:tbl>
-    <w:bookmarkEnd w:id="66"/>
-    <w:bookmarkStart w:id="67" w:name="two-terraform-trees-and-why"/>
+    <w:bookmarkEnd w:id="68"/>
+    <w:bookmarkStart w:id="69" w:name="two-terraform-trees-and-why"/>
     <w:p>
       <w:pPr>
         <w:pStyle w:val="Heading2"/>
@@ -14855,8 +14949,8 @@
         <w:t xml:space="preserve">can build live. The pipeline is identical; only the last command differs."</w:t>
       </w:r>
     </w:p>
-    <w:bookmarkEnd w:id="67"/>
-    <w:bookmarkStart w:id="68" w:name="Xe3a079749fe8138321ef57e88672d9cc3f947e8"/>
+    <w:bookmarkEnd w:id="69"/>
+    <w:bookmarkStart w:id="70" w:name="Xe3a079749fe8138321ef57e88672d9cc3f947e8"/>
     <w:p>
       <w:pPr>
         <w:pStyle w:val="Heading2"/>
@@ -15613,8 +15707,8 @@
         <w:t xml:space="preserve">and the reason is written in the file rather than left for the next person to rediscover.</w:t>
       </w:r>
     </w:p>
-    <w:bookmarkEnd w:id="68"/>
-    <w:bookmarkStart w:id="69" w:name="the-application"/>
+    <w:bookmarkEnd w:id="70"/>
+    <w:bookmarkStart w:id="71" w:name="the-application"/>
     <w:p>
       <w:pPr>
         <w:pStyle w:val="Heading2"/>
@@ -16461,8 +16555,8 @@
         <w:t xml:space="preserve">never changes, so rolling back is moving one symlink and restarting.</w:t>
       </w:r>
     </w:p>
-    <w:bookmarkEnd w:id="69"/>
-    <w:bookmarkStart w:id="70" w:name="X655b118ae1f2d379fc6f508cf7781d34db491b1"/>
+    <w:bookmarkEnd w:id="71"/>
+    <w:bookmarkStart w:id="72" w:name="X655b118ae1f2d379fc6f508cf7781d34db491b1"/>
     <w:p>
       <w:pPr>
         <w:pStyle w:val="Heading2"/>
@@ -17299,8 +17393,8 @@
         <w:t xml:space="preserve">is safe, and why it only ever acts where something is actually missing."</w:t>
       </w:r>
     </w:p>
-    <w:bookmarkEnd w:id="70"/>
-    <w:bookmarkStart w:id="71" w:name="the-whole-chain-one-change-end-to-end"/>
+    <w:bookmarkEnd w:id="72"/>
+    <w:bookmarkStart w:id="73" w:name="the-whole-chain-one-change-end-to-end"/>
     <w:p>
       <w:pPr>
         <w:pStyle w:val="Heading2"/>
@@ -18218,8 +18312,8 @@
         <w:t xml:space="preserve">installs software. One only ever reports.</w:t>
       </w:r>
     </w:p>
-    <w:bookmarkEnd w:id="71"/>
-    <w:bookmarkStart w:id="72" w:name="one-honest-gap"/>
+    <w:bookmarkEnd w:id="73"/>
+    <w:bookmarkStart w:id="74" w:name="one-honest-gap"/>
     <w:p>
       <w:pPr>
         <w:pStyle w:val="Heading2"/>
@@ -18353,9 +18447,9 @@
         </w:pict>
       </w:r>
     </w:p>
-    <w:bookmarkEnd w:id="72"/>
-    <w:bookmarkEnd w:id="73"/>
-    <w:bookmarkStart w:id="74" w:name="why-each-environment-is-separate"/>
+    <w:bookmarkEnd w:id="74"/>
+    <w:bookmarkEnd w:id="75"/>
+    <w:bookmarkStart w:id="76" w:name="why-each-environment-is-separate"/>
     <w:p>
       <w:pPr>
         <w:pStyle w:val="Heading1"/>
@@ -18402,7 +18496,7 @@
         <w:t xml:space="preserve">cannot read production's passwords.</w:t>
       </w:r>
     </w:p>
-    <w:bookmarkEnd w:id="74"/>
+    <w:bookmarkEnd w:id="76"/>
     <w:sectPr>
       <w:footnotePr>
         <w:numRestart w:val="eachSect"/>

</xml_diff>

<commit_message>
Explain every step of the handout: what happens, why it is done that way, what to notice
Steps 1-6 and 10-19 were one-liners. Each now says what is happening,
why the design is the way it is, and what the reader should look for.
Steps 17 and 18 describe today's build-from-nothing run honestly. Two
cross-references that pointed at the wrong step number are fixed.

Co-Authored-By: Claude Fable 5.1 <noreply@anthropic.com>
</commit_message>
<xml_diff>
--- a/docs/word/2-FOR-THE-PANEL.docx
+++ b/docs/word/2-FOR-THE-PANEL.docx
@@ -645,6 +645,84 @@
         <w:t xml:space="preserve"> clone git@github.com:georgejpark/secure-iac-pipeline.git</w:t>
       </w:r>
     </w:p>
+    <w:p>
+      <w:pPr>
+        <w:pStyle w:val="FirstParagraph"/>
+      </w:pPr>
+      <w:r>
+        <w:rPr>
+          <w:b/>
+          <w:bCs/>
+        </w:rPr>
+        <w:t xml:space="preserve">What is happening:</w:t>
+      </w:r>
+      <w:r>
+        <w:t xml:space="preserve"> </w:t>
+      </w:r>
+      <w:r>
+        <w:t xml:space="preserve">a full copy of the repository lands on my laptop - every file, and every</w:t>
+      </w:r>
+      <w:r>
+        <w:t xml:space="preserve"> </w:t>
+      </w:r>
+      <w:r>
+        <w:t xml:space="preserve">version of every file that has ever been committed.</w:t>
+      </w:r>
+    </w:p>
+    <w:p>
+      <w:pPr>
+        <w:pStyle w:val="BodyText"/>
+      </w:pPr>
+      <w:r>
+        <w:rPr>
+          <w:b/>
+          <w:bCs/>
+        </w:rPr>
+        <w:t xml:space="preserve">Why it matters for this story:</w:t>
+      </w:r>
+      <w:r>
+        <w:t xml:space="preserve"> </w:t>
+      </w:r>
+      <w:r>
+        <w:t xml:space="preserve">that second part is the point of the whole demo. A clone is not</w:t>
+      </w:r>
+      <w:r>
+        <w:t xml:space="preserve"> </w:t>
+      </w:r>
+      <w:r>
+        <w:t xml:space="preserve">a snapshot of today. It is the entire history. Anything that was ever committed comes with it,</w:t>
+      </w:r>
+      <w:r>
+        <w:t xml:space="preserve"> </w:t>
+      </w:r>
+      <w:r>
+        <w:t xml:space="preserve">including things that were later deleted.</w:t>
+      </w:r>
+    </w:p>
+    <w:p>
+      <w:pPr>
+        <w:pStyle w:val="BodyText"/>
+      </w:pPr>
+      <w:r>
+        <w:rPr>
+          <w:b/>
+          <w:bCs/>
+        </w:rPr>
+        <w:t xml:space="preserve">What to notice:</w:t>
+      </w:r>
+      <w:r>
+        <w:t xml:space="preserve"> </w:t>
+      </w:r>
+      <w:r>
+        <w:t xml:space="preserve">there are no credentials in this clone. No cloud keys, no database passwords.</w:t>
+      </w:r>
+      <w:r>
+        <w:t xml:space="preserve"> </w:t>
+      </w:r>
+      <w:r>
+        <w:t xml:space="preserve">The encrypted secrets files are here, but nothing on my laptop can open them.</w:t>
+      </w:r>
+    </w:p>
     <w:bookmarkEnd w:id="14"/>
     <w:bookmarkStart w:id="15" w:name="Xf646f301eccc41335a947aa6ab20ba37e39664a"/>
     <w:p>
@@ -689,6 +767,105 @@
         <w:pStyle w:val="FirstParagraph"/>
       </w:pPr>
       <w:r>
+        <w:rPr>
+          <w:b/>
+          <w:bCs/>
+        </w:rPr>
+        <w:t xml:space="preserve">What is happening:</w:t>
+      </w:r>
+      <w:r>
+        <w:t xml:space="preserve"> </w:t>
+      </w:r>
+      <w:r>
+        <w:t xml:space="preserve">my change gets its own name.</w:t>
+      </w:r>
+      <w:r>
+        <w:t xml:space="preserve"> </w:t>
+      </w:r>
+      <w:r>
+        <w:rPr>
+          <w:rStyle w:val="VerbatimChar"/>
+        </w:rPr>
+        <w:t xml:space="preserve">TM-118</w:t>
+      </w:r>
+      <w:r>
+        <w:t xml:space="preserve"> </w:t>
+      </w:r>
+      <w:r>
+        <w:t xml:space="preserve">is the ticket. Everything I do next</w:t>
+      </w:r>
+      <w:r>
+        <w:t xml:space="preserve"> </w:t>
+      </w:r>
+      <w:r>
+        <w:t xml:space="preserve">happens on this branch, and</w:t>
+      </w:r>
+      <w:r>
+        <w:t xml:space="preserve"> </w:t>
+      </w:r>
+      <w:r>
+        <w:rPr>
+          <w:rStyle w:val="VerbatimChar"/>
+        </w:rPr>
+        <w:t xml:space="preserve">main</w:t>
+      </w:r>
+      <w:r>
+        <w:t xml:space="preserve"> </w:t>
+      </w:r>
+      <w:r>
+        <w:t xml:space="preserve">does not move.</w:t>
+      </w:r>
+    </w:p>
+    <w:p>
+      <w:pPr>
+        <w:pStyle w:val="BodyText"/>
+      </w:pPr>
+      <w:r>
+        <w:rPr>
+          <w:b/>
+          <w:bCs/>
+        </w:rPr>
+        <w:t xml:space="preserve">Why:</w:t>
+      </w:r>
+      <w:r>
+        <w:t xml:space="preserve"> </w:t>
+      </w:r>
+      <w:r>
+        <w:rPr>
+          <w:rStyle w:val="VerbatimChar"/>
+        </w:rPr>
+        <w:t xml:space="preserve">main</w:t>
+      </w:r>
+      <w:r>
+        <w:t xml:space="preserve"> </w:t>
+      </w:r>
+      <w:r>
+        <w:t xml:space="preserve">is what production is built from. If nobody can commit to it directly, then</w:t>
+      </w:r>
+      <w:r>
+        <w:t xml:space="preserve"> </w:t>
+      </w:r>
+      <w:r>
+        <w:t xml:space="preserve">everything that reaches production has been through the pull request, and the pull request is where</w:t>
+      </w:r>
+      <w:r>
+        <w:t xml:space="preserve"> </w:t>
+      </w:r>
+      <w:r>
+        <w:t xml:space="preserve">every check and every approval lives. Branch protection enforces this - even I, as the</w:t>
+      </w:r>
+      <w:r>
+        <w:t xml:space="preserve"> </w:t>
+      </w:r>
+      <w:r>
+        <w:t xml:space="preserve">administrator, get a warning when I bypass it, and GitHub records that I did.</w:t>
+      </w:r>
+    </w:p>
+    <w:p>
+      <w:pPr>
+        <w:pStyle w:val="BodyText"/>
+      </w:pPr>
+      <w:r>
         <w:t xml:space="preserve">Never work directly on</w:t>
       </w:r>
       <w:r>
@@ -747,6 +924,90 @@
         <w:pStyle w:val="FirstParagraph"/>
       </w:pPr>
       <w:r>
+        <w:rPr>
+          <w:b/>
+          <w:bCs/>
+        </w:rPr>
+        <w:t xml:space="preserve">What is happening:</w:t>
+      </w:r>
+      <w:r>
+        <w:t xml:space="preserve"> </w:t>
+      </w:r>
+      <w:r>
+        <w:t xml:space="preserve">the file describes what production should look like. Not how to build it -</w:t>
+      </w:r>
+      <w:r>
+        <w:t xml:space="preserve"> </w:t>
+      </w:r>
+      <w:r>
+        <w:t xml:space="preserve">what it should be. Two servers becomes three. Terraform's job is to make reality match the file.</w:t>
+      </w:r>
+    </w:p>
+    <w:p>
+      <w:pPr>
+        <w:pStyle w:val="BodyText"/>
+      </w:pPr>
+      <w:r>
+        <w:rPr>
+          <w:b/>
+          <w:bCs/>
+        </w:rPr>
+        <w:t xml:space="preserve">Why it is one number:</w:t>
+      </w:r>
+      <w:r>
+        <w:t xml:space="preserve"> </w:t>
+      </w:r>
+      <w:r>
+        <w:t xml:space="preserve">all three environments use the same module - the same definition of what</w:t>
+      </w:r>
+      <w:r>
+        <w:t xml:space="preserve"> </w:t>
+      </w:r>
+      <w:r>
+        <w:t xml:space="preserve">a server is. Each environment passes in only the things allowed to differ: how many, how big, which</w:t>
+      </w:r>
+      <w:r>
+        <w:t xml:space="preserve"> </w:t>
+      </w:r>
+      <w:r>
+        <w:t xml:space="preserve">network, whether it restarts after a reboot, whether it can be deleted. A security setting cannot be</w:t>
+      </w:r>
+      <w:r>
+        <w:t xml:space="preserve"> </w:t>
+      </w:r>
+      <w:r>
+        <w:t xml:space="preserve">on in production and quietly off in development, because there is only one place it is written.</w:t>
+      </w:r>
+    </w:p>
+    <w:p>
+      <w:pPr>
+        <w:pStyle w:val="BodyText"/>
+      </w:pPr>
+      <w:r>
+        <w:rPr>
+          <w:b/>
+          <w:bCs/>
+        </w:rPr>
+        <w:t xml:space="preserve">What to notice:</w:t>
+      </w:r>
+      <w:r>
+        <w:t xml:space="preserve"> </w:t>
+      </w:r>
+      <w:r>
+        <w:t xml:space="preserve">the diff the reviewer sees is one line. That is deliberate. A change that is easy</w:t>
+      </w:r>
+      <w:r>
+        <w:t xml:space="preserve"> </w:t>
+      </w:r>
+      <w:r>
+        <w:t xml:space="preserve">to read is a change that gets reviewed properly.</w:t>
+      </w:r>
+    </w:p>
+    <w:p>
+      <w:pPr>
+        <w:pStyle w:val="BodyText"/>
+      </w:pPr>
+      <w:r>
         <w:t xml:space="preserve">Development and staging have their own files. They aren't affected.</w:t>
       </w:r>
     </w:p>
@@ -800,7 +1061,50 @@
         <w:pStyle w:val="FirstParagraph"/>
       </w:pPr>
       <w:r>
-        <w:t xml:space="preserve">Before this saves, a hook runs. It looks for passwords and API keys.</w:t>
+        <w:rPr>
+          <w:b/>
+          <w:bCs/>
+        </w:rPr>
+        <w:t xml:space="preserve">What is happening:</w:t>
+      </w:r>
+      <w:r>
+        <w:t xml:space="preserve"> </w:t>
+      </w:r>
+      <w:r>
+        <w:t xml:space="preserve">before Git records the change, a pre-commit hook runs on my laptop. It runs</w:t>
+      </w:r>
+      <w:r>
+        <w:t xml:space="preserve"> </w:t>
+      </w:r>
+      <w:r>
+        <w:t xml:space="preserve">gitleaks - the same secret scanner the pipeline uses, with the same configuration - plus</w:t>
+      </w:r>
+      <w:r>
+        <w:t xml:space="preserve"> </w:t>
+      </w:r>
+      <w:r>
+        <w:rPr>
+          <w:rStyle w:val="VerbatimChar"/>
+        </w:rPr>
+        <w:t xml:space="preserve">terraform fmt</w:t>
+      </w:r>
+      <w:r>
+        <w:t xml:space="preserve"> </w:t>
+      </w:r>
+      <w:r>
+        <w:t xml:space="preserve">and</w:t>
+      </w:r>
+      <w:r>
+        <w:t xml:space="preserve"> </w:t>
+      </w:r>
+      <w:r>
+        <w:rPr>
+          <w:rStyle w:val="VerbatimChar"/>
+        </w:rPr>
+        <w:t xml:space="preserve">terraform validate</w:t>
+      </w:r>
+      <w:r>
+        <w:t xml:space="preserve">.</w:t>
       </w:r>
     </w:p>
     <w:p>
@@ -808,7 +1112,67 @@
         <w:pStyle w:val="BodyText"/>
       </w:pPr>
       <w:r>
+        <w:rPr>
+          <w:b/>
+          <w:bCs/>
+        </w:rPr>
+        <w:t xml:space="preserve">Why here, and not only in the pipeline:</w:t>
+      </w:r>
+      <w:r>
+        <w:t xml:space="preserve"> </w:t>
+      </w:r>
+      <w:r>
+        <w:t xml:space="preserve">this is the cheapest gate there is. A password caught</w:t>
+      </w:r>
+      <w:r>
+        <w:t xml:space="preserve"> </w:t>
+      </w:r>
+      <w:r>
+        <w:t xml:space="preserve">here has never been committed. There is nothing to rotate, no history to rewrite, no incident. The</w:t>
+      </w:r>
+      <w:r>
+        <w:t xml:space="preserve"> </w:t>
+      </w:r>
+      <w:r>
+        <w:t xml:space="preserve">same password caught one step later, in the pipeline, is already in a commit that has been pushed to</w:t>
+      </w:r>
+      <w:r>
+        <w:t xml:space="preserve"> </w:t>
+      </w:r>
+      <w:r>
+        <w:t xml:space="preserve">GitHub, and that is a different day.</w:t>
+      </w:r>
+    </w:p>
+    <w:p>
+      <w:pPr>
+        <w:pStyle w:val="BodyText"/>
+      </w:pPr>
+      <w:r>
         <w:t xml:space="preserve">If it finds one, the commit doesn't happen. Nothing has left my laptop.</w:t>
+      </w:r>
+    </w:p>
+    <w:p>
+      <w:pPr>
+        <w:pStyle w:val="BodyText"/>
+      </w:pPr>
+      <w:r>
+        <w:rPr>
+          <w:b/>
+          <w:bCs/>
+        </w:rPr>
+        <w:t xml:space="preserve">What to notice:</w:t>
+      </w:r>
+      <w:r>
+        <w:t xml:space="preserve"> </w:t>
+      </w:r>
+      <w:r>
+        <w:t xml:space="preserve">the hook and the pipeline run the same tool. "It passed on my machine" means the</w:t>
+      </w:r>
+      <w:r>
+        <w:t xml:space="preserve"> </w:t>
+      </w:r>
+      <w:r>
+        <w:t xml:space="preserve">same thing as "it passed in CI".</w:t>
       </w:r>
     </w:p>
     <w:bookmarkEnd w:id="17"/>
@@ -855,7 +1219,65 @@
         <w:pStyle w:val="FirstParagraph"/>
       </w:pPr>
       <w:r>
-        <w:t xml:space="preserve">The branch now exists on GitHub. Nothing has run yet.</w:t>
+        <w:rPr>
+          <w:b/>
+          <w:bCs/>
+        </w:rPr>
+        <w:t xml:space="preserve">What is happening:</w:t>
+      </w:r>
+      <w:r>
+        <w:t xml:space="preserve"> </w:t>
+      </w:r>
+      <w:r>
+        <w:t xml:space="preserve">the branch is copied to GitHub. The change has left my laptop and is now</w:t>
+      </w:r>
+      <w:r>
+        <w:t xml:space="preserve"> </w:t>
+      </w:r>
+      <w:r>
+        <w:t xml:space="preserve">visible to the team.</w:t>
+      </w:r>
+    </w:p>
+    <w:p>
+      <w:pPr>
+        <w:pStyle w:val="BodyText"/>
+      </w:pPr>
+      <w:r>
+        <w:rPr>
+          <w:b/>
+          <w:bCs/>
+        </w:rPr>
+        <w:t xml:space="preserve">What has not happened:</w:t>
+      </w:r>
+      <w:r>
+        <w:t xml:space="preserve"> </w:t>
+      </w:r>
+      <w:r>
+        <w:t xml:space="preserve">nothing has run. The pipeline is triggered by pull requests and by</w:t>
+      </w:r>
+      <w:r>
+        <w:t xml:space="preserve"> </w:t>
+      </w:r>
+      <w:r>
+        <w:t xml:space="preserve">merges to</w:t>
+      </w:r>
+      <w:r>
+        <w:t xml:space="preserve"> </w:t>
+      </w:r>
+      <w:r>
+        <w:rPr>
+          <w:rStyle w:val="VerbatimChar"/>
+        </w:rPr>
+        <w:t xml:space="preserve">main</w:t>
+      </w:r>
+      <w:r>
+        <w:t xml:space="preserve">, not by pushes to a branch. A push is publishing a draft; nothing has been asked</w:t>
+      </w:r>
+      <w:r>
+        <w:t xml:space="preserve"> </w:t>
+      </w:r>
+      <w:r>
+        <w:t xml:space="preserve">to judge it yet.</w:t>
       </w:r>
     </w:p>
     <w:bookmarkEnd w:id="18"/>
@@ -900,6 +1322,78 @@
     <w:p>
       <w:pPr>
         <w:pStyle w:val="FirstParagraph"/>
+      </w:pPr>
+      <w:r>
+        <w:rPr>
+          <w:b/>
+          <w:bCs/>
+        </w:rPr>
+        <w:t xml:space="preserve">What is happening:</w:t>
+      </w:r>
+      <w:r>
+        <w:t xml:space="preserve"> </w:t>
+      </w:r>
+      <w:r>
+        <w:t xml:space="preserve">I am asking for this branch to be merged into</w:t>
+      </w:r>
+      <w:r>
+        <w:t xml:space="preserve"> </w:t>
+      </w:r>
+      <w:r>
+        <w:rPr>
+          <w:rStyle w:val="VerbatimChar"/>
+        </w:rPr>
+        <w:t xml:space="preserve">main</w:t>
+      </w:r>
+      <w:r>
+        <w:t xml:space="preserve">. That request is the</w:t>
+      </w:r>
+      <w:r>
+        <w:t xml:space="preserve"> </w:t>
+      </w:r>
+      <w:r>
+        <w:t xml:space="preserve">pull request, and it is the unit everything else attaches to: the checks, the comments, the review,</w:t>
+      </w:r>
+      <w:r>
+        <w:t xml:space="preserve"> </w:t>
+      </w:r>
+      <w:r>
+        <w:t xml:space="preserve">the approval, and the record of who merged it.</w:t>
+      </w:r>
+    </w:p>
+    <w:p>
+      <w:pPr>
+        <w:pStyle w:val="BodyText"/>
+      </w:pPr>
+      <w:r>
+        <w:rPr>
+          <w:b/>
+          <w:bCs/>
+        </w:rPr>
+        <w:t xml:space="preserve">Why this is the trigger:</w:t>
+      </w:r>
+      <w:r>
+        <w:t xml:space="preserve"> </w:t>
+      </w:r>
+      <w:r>
+        <w:t xml:space="preserve">opening a pull request is a statement that the change is ready to be</w:t>
+      </w:r>
+      <w:r>
+        <w:t xml:space="preserve"> </w:t>
+      </w:r>
+      <w:r>
+        <w:t xml:space="preserve">judged. From this moment the pipeline runs on every push to the branch, and the merge button stays</w:t>
+      </w:r>
+      <w:r>
+        <w:t xml:space="preserve"> </w:t>
+      </w:r>
+      <w:r>
+        <w:t xml:space="preserve">disabled until every required check is green and a reviewer has approved.</w:t>
+      </w:r>
+    </w:p>
+    <w:p>
+      <w:pPr>
+        <w:pStyle w:val="BodyText"/>
       </w:pPr>
       <w:r>
         <w:t xml:space="preserve">This is what starts the pipeline.</w:t>
@@ -1970,7 +2464,7 @@
         <w:t xml:space="preserve"> </w:t>
       </w:r>
       <w:r>
-        <w:t xml:space="preserve">step 8. That is deliberate: a scanner that fails the build on every finding gets switched off.</w:t>
+        <w:t xml:space="preserve">step 9. That is deliberate: a scanner that fails the build on every finding gets switched off.</w:t>
       </w:r>
     </w:p>
     <w:p>
@@ -2173,7 +2667,7 @@
         <w:t xml:space="preserve">none is on the blocking list</w:t>
       </w:r>
       <w:r>
-        <w:t xml:space="preserve">. That is why the checks are green, and why step 8</w:t>
+        <w:t xml:space="preserve">. That is why the checks are green, and why step 9</w:t>
       </w:r>
       <w:r>
         <w:t xml:space="preserve"> </w:t>
@@ -2947,7 +3441,7 @@
         <w:t xml:space="preserve"> </w:t>
       </w:r>
       <w:r>
-        <w:t xml:space="preserve">Checkov's JSON output from step 7.</w:t>
+        <w:t xml:space="preserve">Checkov's JSON output from step 8.</w:t>
       </w:r>
     </w:p>
     <w:p>
@@ -3606,6 +4100,109 @@
         <w:t xml:space="preserve">BLOCKED - Review required</w:t>
       </w:r>
     </w:p>
+    <w:p>
+      <w:pPr>
+        <w:pStyle w:val="FirstParagraph"/>
+      </w:pPr>
+      <w:r>
+        <w:rPr>
+          <w:b/>
+          <w:bCs/>
+        </w:rPr>
+        <w:t xml:space="preserve">What is happening:</w:t>
+      </w:r>
+      <w:r>
+        <w:t xml:space="preserve"> </w:t>
+      </w:r>
+      <w:r>
+        <w:t xml:space="preserve">every check is green - secrets, and the infrastructure scan for all three</w:t>
+      </w:r>
+      <w:r>
+        <w:t xml:space="preserve"> </w:t>
+      </w:r>
+      <w:r>
+        <w:t xml:space="preserve">environments - and the merge button is still disabled.</w:t>
+      </w:r>
+    </w:p>
+    <w:p>
+      <w:pPr>
+        <w:pStyle w:val="BodyText"/>
+      </w:pPr>
+      <w:r>
+        <w:rPr>
+          <w:b/>
+          <w:bCs/>
+        </w:rPr>
+        <w:t xml:space="preserve">Why:</w:t>
+      </w:r>
+      <w:r>
+        <w:t xml:space="preserve"> </w:t>
+      </w:r>
+      <w:r>
+        <w:t xml:space="preserve">the checks are not the only gate. Branch protection on</w:t>
+      </w:r>
+      <w:r>
+        <w:t xml:space="preserve"> </w:t>
+      </w:r>
+      <w:r>
+        <w:rPr>
+          <w:rStyle w:val="VerbatimChar"/>
+        </w:rPr>
+        <w:t xml:space="preserve">main</w:t>
+      </w:r>
+      <w:r>
+        <w:t xml:space="preserve"> </w:t>
+      </w:r>
+      <w:r>
+        <w:t xml:space="preserve">requires four green checks</w:t>
+      </w:r>
+      <w:r>
+        <w:t xml:space="preserve"> </w:t>
+      </w:r>
+      <w:r>
+        <w:rPr>
+          <w:i/>
+          <w:iCs/>
+        </w:rPr>
+        <w:t xml:space="preserve">and</w:t>
+      </w:r>
+      <w:r>
+        <w:t xml:space="preserve"> </w:t>
+      </w:r>
+      <w:r>
+        <w:t xml:space="preserve">one approving review from someone who is not the author. A scanner can tell you the code is</w:t>
+      </w:r>
+      <w:r>
+        <w:t xml:space="preserve"> </w:t>
+      </w:r>
+      <w:r>
+        <w:t xml:space="preserve">not obviously dangerous. It cannot tell you the change is the right one.</w:t>
+      </w:r>
+    </w:p>
+    <w:p>
+      <w:pPr>
+        <w:pStyle w:val="BodyText"/>
+      </w:pPr>
+      <w:r>
+        <w:rPr>
+          <w:b/>
+          <w:bCs/>
+        </w:rPr>
+        <w:t xml:space="preserve">What to notice:</w:t>
+      </w:r>
+      <w:r>
+        <w:t xml:space="preserve"> </w:t>
+      </w:r>
+      <w:r>
+        <w:t xml:space="preserve">the four required checks are named in the repository settings, not in the</w:t>
+      </w:r>
+      <w:r>
+        <w:t xml:space="preserve"> </w:t>
+      </w:r>
+      <w:r>
+        <w:t xml:space="preserve">workflow file. A pull request cannot edit its own gate.</w:t>
+      </w:r>
+    </w:p>
     <w:bookmarkEnd w:id="23"/>
     <w:bookmarkStart w:id="24" w:name="X35c389a0b18186b8c45f50d4f18a32e539eef46"/>
     <w:p>
@@ -3643,6 +4240,66 @@
         <w:t xml:space="preserve">Someone else has to look at it.</w:t>
       </w:r>
     </w:p>
+    <w:p>
+      <w:pPr>
+        <w:pStyle w:val="BodyText"/>
+      </w:pPr>
+      <w:r>
+        <w:rPr>
+          <w:b/>
+          <w:bCs/>
+        </w:rPr>
+        <w:t xml:space="preserve">What the reviewer has in front of them:</w:t>
+      </w:r>
+      <w:r>
+        <w:t xml:space="preserve"> </w:t>
+      </w:r>
+      <w:r>
+        <w:t xml:space="preserve">a one-line diff, three pipeline comments explaining</w:t>
+      </w:r>
+      <w:r>
+        <w:t xml:space="preserve"> </w:t>
+      </w:r>
+      <w:r>
+        <w:t xml:space="preserve">what the scanner found and why none of it blocks, and four green checks. The review is a</w:t>
+      </w:r>
+      <w:r>
+        <w:t xml:space="preserve"> </w:t>
+      </w:r>
+      <w:r>
+        <w:t xml:space="preserve">five-minute job because the pipeline did the reading.</w:t>
+      </w:r>
+    </w:p>
+    <w:p>
+      <w:pPr>
+        <w:pStyle w:val="BodyText"/>
+      </w:pPr>
+      <w:r>
+        <w:rPr>
+          <w:b/>
+          <w:bCs/>
+        </w:rPr>
+        <w:t xml:space="preserve">In this demo:</w:t>
+      </w:r>
+      <w:r>
+        <w:t xml:space="preserve"> </w:t>
+      </w:r>
+      <w:r>
+        <w:t xml:space="preserve">I am the only account on the repository, so I merge with an administrator</w:t>
+      </w:r>
+      <w:r>
+        <w:t xml:space="preserve"> </w:t>
+      </w:r>
+      <w:r>
+        <w:t xml:space="preserve">override, and GitHub records that a rule was bypassed and by whom. In a real team that override is</w:t>
+      </w:r>
+      <w:r>
+        <w:t xml:space="preserve"> </w:t>
+      </w:r>
+      <w:r>
+        <w:t xml:space="preserve">the thing an auditor asks about, and the answer is "here is every time it happened".</w:t>
+      </w:r>
+    </w:p>
     <w:bookmarkEnd w:id="24"/>
     <w:bookmarkStart w:id="25" w:name="Xfa0b19af1e0e73087b1b787aba0b365b8ec2876"/>
     <w:p>
@@ -3661,6 +4318,93 @@
         <w:t xml:space="preserve">Merging is what allows a deployment. Nothing deploys before this.</w:t>
       </w:r>
     </w:p>
+    <w:p>
+      <w:pPr>
+        <w:pStyle w:val="BodyText"/>
+      </w:pPr>
+      <w:r>
+        <w:rPr>
+          <w:b/>
+          <w:bCs/>
+        </w:rPr>
+        <w:t xml:space="preserve">What is happening:</w:t>
+      </w:r>
+      <w:r>
+        <w:t xml:space="preserve"> </w:t>
+      </w:r>
+      <w:r>
+        <w:t xml:space="preserve">the branch is squashed into one commit and lands on</w:t>
+      </w:r>
+      <w:r>
+        <w:t xml:space="preserve"> </w:t>
+      </w:r>
+      <w:r>
+        <w:rPr>
+          <w:rStyle w:val="VerbatimChar"/>
+        </w:rPr>
+        <w:t xml:space="preserve">main</w:t>
+      </w:r>
+      <w:r>
+        <w:t xml:space="preserve">.</w:t>
+      </w:r>
+      <w:r>
+        <w:t xml:space="preserve"> </w:t>
+      </w:r>
+      <w:r>
+        <w:rPr>
+          <w:rStyle w:val="VerbatimChar"/>
+        </w:rPr>
+        <w:t xml:space="preserve">main</w:t>
+      </w:r>
+      <w:r>
+        <w:t xml:space="preserve"> </w:t>
+      </w:r>
+      <w:r>
+        <w:t xml:space="preserve">is now</w:t>
+      </w:r>
+      <w:r>
+        <w:t xml:space="preserve"> </w:t>
+      </w:r>
+      <w:r>
+        <w:t xml:space="preserve">different from what is running in production, and the pipeline's job is to close that gap.</w:t>
+      </w:r>
+    </w:p>
+    <w:p>
+      <w:pPr>
+        <w:pStyle w:val="BodyText"/>
+      </w:pPr>
+      <w:r>
+        <w:rPr>
+          <w:b/>
+          <w:bCs/>
+        </w:rPr>
+        <w:t xml:space="preserve">Why merging is the trigger and not something else:</w:t>
+      </w:r>
+      <w:r>
+        <w:t xml:space="preserve"> </w:t>
+      </w:r>
+      <w:r>
+        <w:t xml:space="preserve">because it is the one moment that has</w:t>
+      </w:r>
+      <w:r>
+        <w:t xml:space="preserve"> </w:t>
+      </w:r>
+      <w:r>
+        <w:t xml:space="preserve">every safeguard behind it. Checks passed, a person approved, and the change is recorded with a ticket</w:t>
+      </w:r>
+      <w:r>
+        <w:t xml:space="preserve"> </w:t>
+      </w:r>
+      <w:r>
+        <w:t xml:space="preserve">number and an author. Deploying from anywhere else - a laptop, a manual command - would skip all of</w:t>
+      </w:r>
+      <w:r>
+        <w:t xml:space="preserve"> </w:t>
+      </w:r>
+      <w:r>
+        <w:t xml:space="preserve">that. Nobody on this pipeline can deploy without a merge, because nothing else holds the keys.</w:t>
+      </w:r>
+    </w:p>
     <w:bookmarkEnd w:id="25"/>
     <w:bookmarkStart w:id="26" w:name="Xab5e7c038e0afeaa786954d1410ba65bf783007"/>
     <w:p>
@@ -3679,6 +4423,75 @@
         <w:t xml:space="preserve">No approval needed. It goes.</w:t>
       </w:r>
     </w:p>
+    <w:p>
+      <w:pPr>
+        <w:pStyle w:val="BodyText"/>
+      </w:pPr>
+      <w:r>
+        <w:rPr>
+          <w:b/>
+          <w:bCs/>
+        </w:rPr>
+        <w:t xml:space="preserve">What is happening:</w:t>
+      </w:r>
+      <w:r>
+        <w:t xml:space="preserve"> </w:t>
+      </w:r>
+      <w:r>
+        <w:t xml:space="preserve">the deploy job for development runs on the development runner the moment</w:t>
+      </w:r>
+      <w:r>
+        <w:t xml:space="preserve"> </w:t>
+      </w:r>
+      <w:r>
+        <w:t xml:space="preserve">the checks on</w:t>
+      </w:r>
+      <w:r>
+        <w:t xml:space="preserve"> </w:t>
+      </w:r>
+      <w:r>
+        <w:rPr>
+          <w:rStyle w:val="VerbatimChar"/>
+        </w:rPr>
+        <w:t xml:space="preserve">main</w:t>
+      </w:r>
+      <w:r>
+        <w:t xml:space="preserve"> </w:t>
+      </w:r>
+      <w:r>
+        <w:t xml:space="preserve">pass. It decrypts the development credentials, plans, checks the plan, applies.</w:t>
+      </w:r>
+    </w:p>
+    <w:p>
+      <w:pPr>
+        <w:pStyle w:val="BodyText"/>
+      </w:pPr>
+      <w:r>
+        <w:rPr>
+          <w:b/>
+          <w:bCs/>
+        </w:rPr>
+        <w:t xml:space="preserve">Why no approval:</w:t>
+      </w:r>
+      <w:r>
+        <w:t xml:space="preserve"> </w:t>
+      </w:r>
+      <w:r>
+        <w:t xml:space="preserve">the cost of being wrong in development is an afternoon. Putting a person in</w:t>
+      </w:r>
+      <w:r>
+        <w:t xml:space="preserve"> </w:t>
+      </w:r>
+      <w:r>
+        <w:t xml:space="preserve">front of every development deploy teaches the team that the pipeline is slow, and a team that thinks</w:t>
+      </w:r>
+      <w:r>
+        <w:t xml:space="preserve"> </w:t>
+      </w:r>
+      <w:r>
+        <w:t xml:space="preserve">the pipeline is slow finds a way around it. Development is where the pipeline should be invisible.</w:t>
+      </w:r>
+    </w:p>
     <w:bookmarkEnd w:id="26"/>
     <w:bookmarkStart w:id="27" w:name="Xbc13ac0d25d8f25c64205b3fbd1aab676c5ebe2"/>
     <w:p>
@@ -3710,6 +4523,105 @@
         <w:t xml:space="preserve">. Someone clicks approve.</w:t>
       </w:r>
     </w:p>
+    <w:p>
+      <w:pPr>
+        <w:pStyle w:val="BodyText"/>
+      </w:pPr>
+      <w:r>
+        <w:rPr>
+          <w:b/>
+          <w:bCs/>
+        </w:rPr>
+        <w:t xml:space="preserve">What is happening:</w:t>
+      </w:r>
+      <w:r>
+        <w:t xml:space="preserve"> </w:t>
+      </w:r>
+      <w:r>
+        <w:t xml:space="preserve">the staging deploy job has been scheduled and has stopped before running a</w:t>
+      </w:r>
+      <w:r>
+        <w:t xml:space="preserve"> </w:t>
+      </w:r>
+      <w:r>
+        <w:t xml:space="preserve">single step. A GitHub Environment named</w:t>
+      </w:r>
+      <w:r>
+        <w:t xml:space="preserve"> </w:t>
+      </w:r>
+      <w:r>
+        <w:rPr>
+          <w:rStyle w:val="VerbatimChar"/>
+        </w:rPr>
+        <w:t xml:space="preserve">stage</w:t>
+      </w:r>
+      <w:r>
+        <w:t xml:space="preserve"> </w:t>
+      </w:r>
+      <w:r>
+        <w:t xml:space="preserve">has a required reviewer, and the job cannot start</w:t>
+      </w:r>
+      <w:r>
+        <w:t xml:space="preserve"> </w:t>
+      </w:r>
+      <w:r>
+        <w:t xml:space="preserve">until that person approves.</w:t>
+      </w:r>
+    </w:p>
+    <w:p>
+      <w:pPr>
+        <w:pStyle w:val="BodyText"/>
+      </w:pPr>
+      <w:r>
+        <w:rPr>
+          <w:b/>
+          <w:bCs/>
+        </w:rPr>
+        <w:t xml:space="preserve">Why staging exists:</w:t>
+      </w:r>
+      <w:r>
+        <w:t xml:space="preserve"> </w:t>
+      </w:r>
+      <w:r>
+        <w:t xml:space="preserve">it has the same security settings as production and is smaller. A control</w:t>
+      </w:r>
+      <w:r>
+        <w:t xml:space="preserve"> </w:t>
+      </w:r>
+      <w:r>
+        <w:t xml:space="preserve">that is missing in staging is a control nobody has tested. The approval is the moment a person says</w:t>
+      </w:r>
+      <w:r>
+        <w:t xml:space="preserve"> </w:t>
+      </w:r>
+      <w:r>
+        <w:t xml:space="preserve">"this is ready to be tried against production's rules".</w:t>
+      </w:r>
+    </w:p>
+    <w:p>
+      <w:pPr>
+        <w:pStyle w:val="BodyText"/>
+      </w:pPr>
+      <w:r>
+        <w:rPr>
+          <w:b/>
+          <w:bCs/>
+        </w:rPr>
+        <w:t xml:space="preserve">What to notice:</w:t>
+      </w:r>
+      <w:r>
+        <w:t xml:space="preserve"> </w:t>
+      </w:r>
+      <w:r>
+        <w:t xml:space="preserve">the deploy jobs run one at a time, in order. Production does not even ask for</w:t>
+      </w:r>
+      <w:r>
+        <w:t xml:space="preserve"> </w:t>
+      </w:r>
+      <w:r>
+        <w:t xml:space="preserve">approval until staging has finished.</w:t>
+      </w:r>
+    </w:p>
     <w:bookmarkEnd w:id="27"/>
     <w:bookmarkStart w:id="28" w:name="Xd61c7592e84a531008a5521af2a1b42da24897c"/>
     <w:p>
@@ -3728,6 +4640,72 @@
         <w:t xml:space="preserve">Same again. Someone clicks approve.</w:t>
       </w:r>
     </w:p>
+    <w:p>
+      <w:pPr>
+        <w:pStyle w:val="BodyText"/>
+      </w:pPr>
+      <w:r>
+        <w:rPr>
+          <w:b/>
+          <w:bCs/>
+        </w:rPr>
+        <w:t xml:space="preserve">Why a second, separate approval:</w:t>
+      </w:r>
+      <w:r>
+        <w:t xml:space="preserve"> </w:t>
+      </w:r>
+      <w:r>
+        <w:t xml:space="preserve">staging passing is evidence. It is not permission. The person</w:t>
+      </w:r>
+      <w:r>
+        <w:t xml:space="preserve"> </w:t>
+      </w:r>
+      <w:r>
+        <w:t xml:space="preserve">who approves production is answering a different question - not "does it work" but "do we want this</w:t>
+      </w:r>
+      <w:r>
+        <w:t xml:space="preserve"> </w:t>
+      </w:r>
+      <w:r>
+        <w:t xml:space="preserve">in production now, during month-end close, with these people on call". That is a business decision,</w:t>
+      </w:r>
+      <w:r>
+        <w:t xml:space="preserve"> </w:t>
+      </w:r>
+      <w:r>
+        <w:t xml:space="preserve">and the pipeline puts it in front of a human rather than making it a side effect of a merge.</w:t>
+      </w:r>
+    </w:p>
+    <w:p>
+      <w:pPr>
+        <w:pStyle w:val="BodyText"/>
+      </w:pPr>
+      <w:r>
+        <w:rPr>
+          <w:b/>
+          <w:bCs/>
+        </w:rPr>
+        <w:t xml:space="preserve">Where the gate lives:</w:t>
+      </w:r>
+      <w:r>
+        <w:t xml:space="preserve"> </w:t>
+      </w:r>
+      <w:r>
+        <w:t xml:space="preserve">in the repository's Environment settings, not in the workflow file. So a</w:t>
+      </w:r>
+      <w:r>
+        <w:t xml:space="preserve"> </w:t>
+      </w:r>
+      <w:r>
+        <w:t xml:space="preserve">pull request cannot remove it. Changing who can approve production is itself a settings change with</w:t>
+      </w:r>
+      <w:r>
+        <w:t xml:space="preserve"> </w:t>
+      </w:r>
+      <w:r>
+        <w:t xml:space="preserve">an audit trail.</w:t>
+      </w:r>
+    </w:p>
     <w:bookmarkEnd w:id="28"/>
     <w:bookmarkStart w:id="29" w:name="X6fea68f5ccffa95f7dea3a1e4140334bbd6a2e7"/>
     <w:p>
@@ -3817,13 +4795,13 @@
         <w:pStyle w:val="FirstParagraph"/>
       </w:pPr>
       <w:r>
-        <w:t xml:space="preserve">The file said two production servers. It now says three. Terraform works out that one is missing and</w:t>
-      </w:r>
-      <w:r>
-        <w:t xml:space="preserve"> </w:t>
-      </w:r>
-      <w:r>
-        <w:t xml:space="preserve">creates it.</w:t>
+        <w:t xml:space="preserve">The file said two production servers. It now says three. Terraform compares the file with what it</w:t>
+      </w:r>
+      <w:r>
+        <w:t xml:space="preserve"> </w:t>
+      </w:r>
+      <w:r>
+        <w:t xml:space="preserve">built last time and creates only the difference.</w:t>
       </w:r>
     </w:p>
     <w:p>
@@ -3840,6 +4818,102 @@
     <w:p>
       <w:pPr>
         <w:pStyle w:val="FirstParagraph"/>
+      </w:pPr>
+      <w:r>
+        <w:rPr>
+          <w:b/>
+          <w:bCs/>
+        </w:rPr>
+        <w:t xml:space="preserve">How it knows what exists:</w:t>
+      </w:r>
+      <w:r>
+        <w:t xml:space="preserve"> </w:t>
+      </w:r>
+      <w:r>
+        <w:t xml:space="preserve">it keeps a record - the state - in a PostgreSQL database on its own</w:t>
+      </w:r>
+      <w:r>
+        <w:t xml:space="preserve"> </w:t>
+      </w:r>
+      <w:r>
+        <w:t xml:space="preserve">management network, one database per environment. Without that record it would build duplicates on</w:t>
+      </w:r>
+      <w:r>
+        <w:t xml:space="preserve"> </w:t>
+      </w:r>
+      <w:r>
+        <w:t xml:space="preserve">every run. The database also locks the record while an apply is running, so two deploys cannot race</w:t>
+      </w:r>
+      <w:r>
+        <w:t xml:space="preserve"> </w:t>
+      </w:r>
+      <w:r>
+        <w:t xml:space="preserve">each other and corrupt it.</w:t>
+      </w:r>
+    </w:p>
+    <w:p>
+      <w:pPr>
+        <w:pStyle w:val="BodyText"/>
+      </w:pPr>
+      <w:r>
+        <w:rPr>
+          <w:b/>
+          <w:bCs/>
+        </w:rPr>
+        <w:t xml:space="preserve">What it builds:</w:t>
+      </w:r>
+      <w:r>
+        <w:t xml:space="preserve"> </w:t>
+      </w:r>
+      <w:r>
+        <w:t xml:space="preserve">an unprivileged Linux container, on production's own network, at the next</w:t>
+      </w:r>
+      <w:r>
+        <w:t xml:space="preserve"> </w:t>
+      </w:r>
+      <w:r>
+        <w:t xml:space="preserve">address in the layout, with the admin SSH keys installed and DNS configured, set to restart after a</w:t>
+      </w:r>
+      <w:r>
+        <w:t xml:space="preserve"> </w:t>
+      </w:r>
+      <w:r>
+        <w:t xml:space="preserve">reboot and protected against accidental deletion. All of that comes from the module; the production</w:t>
+      </w:r>
+      <w:r>
+        <w:t xml:space="preserve"> </w:t>
+      </w:r>
+      <w:r>
+        <w:t xml:space="preserve">file only said "three".</w:t>
+      </w:r>
+    </w:p>
+    <w:p>
+      <w:pPr>
+        <w:pStyle w:val="BodyText"/>
+      </w:pPr>
+      <w:r>
+        <w:rPr>
+          <w:b/>
+          <w:bCs/>
+        </w:rPr>
+        <w:t xml:space="preserve">In today's demo</w:t>
+      </w:r>
+      <w:r>
+        <w:t xml:space="preserve"> </w:t>
+      </w:r>
+      <w:r>
+        <w:t xml:space="preserve">every environment was torn down before we started, so this run builds all five</w:t>
+      </w:r>
+      <w:r>
+        <w:t xml:space="preserve"> </w:t>
+      </w:r>
+      <w:r>
+        <w:t xml:space="preserve">servers rather than one. On an ordinary day it would build only the one that is missing.</w:t>
+      </w:r>
+    </w:p>
+    <w:p>
+      <w:pPr>
+        <w:pStyle w:val="BodyText"/>
       </w:pPr>
       <w:r>
         <w:t xml:space="preserve">That machine is empty. Terraform talks to the Proxmox API to build machines. It never logs into</w:t>
@@ -3895,7 +4969,7 @@
         <w:rPr>
           <w:rStyle w:val="VerbatimChar"/>
         </w:rPr>
-        <w:t xml:space="preserve">  app-prod-1 (321)  already serving 1.1.0  - skipped</w:t>
+        <w:t xml:space="preserve">  app-prod-1 (321)  installing 1.1.0 ...</w:t>
       </w:r>
       <w:r>
         <w:br/>
@@ -3904,7 +4978,7 @@
         <w:rPr>
           <w:rStyle w:val="VerbatimChar"/>
         </w:rPr>
-        <w:t xml:space="preserve">  app-prod-2 (322)  already serving 1.1.0  - skipped</w:t>
+        <w:t xml:space="preserve">    app-prod-1 serving {"version": "1.1.0"}</w:t>
       </w:r>
       <w:r>
         <w:br/>
@@ -3913,6 +4987,24 @@
         <w:rPr>
           <w:rStyle w:val="VerbatimChar"/>
         </w:rPr>
+        <w:t xml:space="preserve">  app-prod-2 (322)  installing 1.1.0 ...</w:t>
+      </w:r>
+      <w:r>
+        <w:br/>
+      </w:r>
+      <w:r>
+        <w:rPr>
+          <w:rStyle w:val="VerbatimChar"/>
+        </w:rPr>
+        <w:t xml:space="preserve">    app-prod-2 serving {"version": "1.1.0"}</w:t>
+      </w:r>
+      <w:r>
+        <w:br/>
+      </w:r>
+      <w:r>
+        <w:rPr>
+          <w:rStyle w:val="VerbatimChar"/>
+        </w:rPr>
         <w:t xml:space="preserve">  app-prod-3 (323)  installing 1.1.0 ...</w:t>
       </w:r>
       <w:r>
@@ -3937,33 +5029,69 @@
     <w:p>
       <w:pPr>
         <w:pStyle w:val="FirstParagraph"/>
-      </w:pPr>
-      <w:r>
-        <w:t xml:space="preserve">Two things worth noticing.</w:t>
-      </w:r>
-    </w:p>
-    <w:p>
-      <w:pPr>
-        <w:pStyle w:val="BodyText"/>
       </w:pPr>
       <w:r>
         <w:rPr>
           <w:b/>
           <w:bCs/>
         </w:rPr>
-        <w:t xml:space="preserve">It skipped the servers that were already working.</w:t>
-      </w:r>
-      <w:r>
-        <w:t xml:space="preserve"> </w:t>
-      </w:r>
-      <w:r>
-        <w:t xml:space="preserve">It asks each one what it is serving before it</w:t>
-      </w:r>
-      <w:r>
-        <w:t xml:space="preserve"> </w:t>
-      </w:r>
-      <w:r>
-        <w:t xml:space="preserve">touches anything, so running it twice changes nothing.</w:t>
+        <w:t xml:space="preserve">Why this is a separate step and not part of the pipeline:</w:t>
+      </w:r>
+      <w:r>
+        <w:t xml:space="preserve"> </w:t>
+      </w:r>
+      <w:r>
+        <w:t xml:space="preserve">Terraform builds machines through</w:t>
+      </w:r>
+      <w:r>
+        <w:t xml:space="preserve"> </w:t>
+      </w:r>
+      <w:r>
+        <w:t xml:space="preserve">the Proxmox API and never logs into them. Installing software is a different job with a different</w:t>
+      </w:r>
+      <w:r>
+        <w:t xml:space="preserve"> </w:t>
+      </w:r>
+      <w:r>
+        <w:t xml:space="preserve">blast radius. Keeping them apart means rebuilding a server does not mean redeploying the</w:t>
+      </w:r>
+      <w:r>
+        <w:t xml:space="preserve"> </w:t>
+      </w:r>
+      <w:r>
+        <w:t xml:space="preserve">application, and redeploying the application does not mean touching infrastructure. This step runs</w:t>
+      </w:r>
+      <w:r>
+        <w:t xml:space="preserve"> </w:t>
+      </w:r>
+      <w:r>
+        <w:t xml:space="preserve">on the host, where it can reach every container.</w:t>
+      </w:r>
+    </w:p>
+    <w:p>
+      <w:pPr>
+        <w:pStyle w:val="BodyText"/>
+      </w:pPr>
+      <w:r>
+        <w:t xml:space="preserve">Run it a second time and every line says</w:t>
+      </w:r>
+      <w:r>
+        <w:t xml:space="preserve"> </w:t>
+      </w:r>
+      <w:r>
+        <w:rPr>
+          <w:rStyle w:val="VerbatimChar"/>
+        </w:rPr>
+        <w:t xml:space="preserve">already serving 1.1.0 - skipped</w:t>
+      </w:r>
+      <w:r>
+        <w:t xml:space="preserve">. Two things worth</w:t>
+      </w:r>
+      <w:r>
+        <w:t xml:space="preserve"> </w:t>
+      </w:r>
+      <w:r>
+        <w:t xml:space="preserve">noticing.</w:t>
       </w:r>
     </w:p>
     <w:p>
@@ -3975,6 +5103,36 @@
           <w:b/>
           <w:bCs/>
         </w:rPr>
+        <w:t xml:space="preserve">It skips the servers that are already working.</w:t>
+      </w:r>
+      <w:r>
+        <w:t xml:space="preserve"> </w:t>
+      </w:r>
+      <w:r>
+        <w:t xml:space="preserve">It asks each one what it is serving before it</w:t>
+      </w:r>
+      <w:r>
+        <w:t xml:space="preserve"> </w:t>
+      </w:r>
+      <w:r>
+        <w:t xml:space="preserve">touches anything, so running it twice changes nothing. That is what makes it safe to run after any</w:t>
+      </w:r>
+      <w:r>
+        <w:t xml:space="preserve"> </w:t>
+      </w:r>
+      <w:r>
+        <w:t xml:space="preserve">failure, without working out where it got to.</w:t>
+      </w:r>
+    </w:p>
+    <w:p>
+      <w:pPr>
+        <w:pStyle w:val="BodyText"/>
+      </w:pPr>
+      <w:r>
+        <w:rPr>
+          <w:b/>
+          <w:bCs/>
+        </w:rPr>
         <w:t xml:space="preserve">It waits for the health check.</w:t>
       </w:r>
       <w:r>
@@ -4271,6 +5429,120 @@
       </w:pPr>
       <w:r>
         <w:t xml:space="preserve">It knows it is production because it reads that from its own hostname. Nothing had to tell it.</w:t>
+      </w:r>
+    </w:p>
+    <w:p>
+      <w:pPr>
+        <w:pStyle w:val="BodyText"/>
+      </w:pPr>
+      <w:r>
+        <w:rPr>
+          <w:b/>
+          <w:bCs/>
+        </w:rPr>
+        <w:t xml:space="preserve">What this proves:</w:t>
+      </w:r>
+      <w:r>
+        <w:t xml:space="preserve"> </w:t>
+      </w:r>
+      <w:r>
+        <w:t xml:space="preserve">not that a web page loads. That five separate machines exist, each reporting</w:t>
+      </w:r>
+      <w:r>
+        <w:t xml:space="preserve"> </w:t>
+      </w:r>
+      <w:r>
+        <w:t xml:space="preserve">its own name and its own environment, three of them in production because a file says three. The</w:t>
+      </w:r>
+      <w:r>
+        <w:t xml:space="preserve"> </w:t>
+      </w:r>
+      <w:r>
+        <w:t xml:space="preserve">greeting is the one from the start of the session, coming back out of a machine that did not exist</w:t>
+      </w:r>
+      <w:r>
+        <w:t xml:space="preserve"> </w:t>
+      </w:r>
+      <w:r>
+        <w:t xml:space="preserve">when it was said.</w:t>
+      </w:r>
+    </w:p>
+    <w:p>
+      <w:pPr>
+        <w:pStyle w:val="BodyText"/>
+      </w:pPr>
+      <w:r>
+        <w:rPr>
+          <w:b/>
+          <w:bCs/>
+        </w:rPr>
+        <w:t xml:space="preserve">What to ask, if you want to test it:</w:t>
+      </w:r>
+      <w:r>
+        <w:t xml:space="preserve"> </w:t>
+      </w:r>
+      <w:r>
+        <w:t xml:space="preserve">ask for a different one.</w:t>
+      </w:r>
+      <w:r>
+        <w:t xml:space="preserve"> </w:t>
+      </w:r>
+      <w:r>
+        <w:rPr>
+          <w:rStyle w:val="VerbatimChar"/>
+        </w:rPr>
+        <w:t xml:space="preserve">10.10.10.20</w:t>
+      </w:r>
+      <w:r>
+        <w:t xml:space="preserve"> </w:t>
+      </w:r>
+      <w:r>
+        <w:t xml:space="preserve">answers</w:t>
+      </w:r>
+      <w:r>
+        <w:t xml:space="preserve"> </w:t>
+      </w:r>
+      <w:r>
+        <w:rPr>
+          <w:rStyle w:val="VerbatimChar"/>
+        </w:rPr>
+        <w:t xml:space="preserve">dev</w:t>
+      </w:r>
+      <w:r>
+        <w:t xml:space="preserve">,</w:t>
+      </w:r>
+      <w:r>
+        <w:t xml:space="preserve"> </w:t>
+      </w:r>
+      <w:r>
+        <w:rPr>
+          <w:rStyle w:val="VerbatimChar"/>
+        </w:rPr>
+        <w:t xml:space="preserve">10.20.10.20</w:t>
+      </w:r>
+      <w:r>
+        <w:t xml:space="preserve"> </w:t>
+      </w:r>
+      <w:r>
+        <w:t xml:space="preserve">answers</w:t>
+      </w:r>
+      <w:r>
+        <w:t xml:space="preserve"> </w:t>
+      </w:r>
+      <w:r>
+        <w:rPr>
+          <w:rStyle w:val="VerbatimChar"/>
+        </w:rPr>
+        <w:t xml:space="preserve">stage</w:t>
+      </w:r>
+      <w:r>
+        <w:t xml:space="preserve">. Ask for a fourth production server and the answer is a one-line pull</w:t>
+      </w:r>
+      <w:r>
+        <w:t xml:space="preserve"> </w:t>
+      </w:r>
+      <w:r>
+        <w:t xml:space="preserve">request, and this whole path again.</w:t>
       </w:r>
     </w:p>
     <w:p>

</xml_diff>